<commit_message>
Rebuild InterimReview.docx and Main_Dissertation_Draft.docx
Regenerated with all latest changes: market_sample naming, simulation
walkthrough tables, updated methodology diagrams, and notebook references.
</commit_message>
<xml_diff>
--- a/reports/generated/exports/InterimReview.docx
+++ b/reports/generated/exports/InterimReview.docx
@@ -374,7 +374,7 @@
         <w:pStyle w:val="ListBullet"/>
       </w:pPr>
       <w:r>
-        <w:t>O2 — the empirical evidence. Evaluate the resulting policy on a fixed held-out window containing real macro shocks (2022 to 2025) against three named comparators — passive buy-and-hold, a rule-based trailing stop-loss policy, and a baseline PPO with no uncertainty signal — and check that the conclusions survive contact with (a) a 70-ticker diversified-equity test universe (41 single-name US large-cap equities + 29 ETFs spanning broad-market, sector, dividend, thematic and commodity exposure) and (b) a four-fold walk-forward grid in which the train, validation and test windows roll forward across 2018–2025. Headline metrics: Sharpe ratio, terminal value relative to buy-and-hold, and the capital-preservation ratio against the running high-watermark.</w:t>
+        <w:t>O2 — the empirical evidence. Evaluate the resulting policy on a fixed held-out window containing real macro shocks (2022 to 2025) against three named comparators — passive buy-and-hold, a rule-based trailing stop-loss policy, and a baseline PPO with no uncertainty signal — and check that the conclusions survive contact with (a) a market sample of 70 stocks (41 single-name US large-cap equities + 29 ETFs spanning broad-market, sector, dividend, thematic and commodity exposure) and (b) a four-fold walk-forward grid in which the train, validation and test windows roll forward across 2018–2025. Headline metrics: Sharpe ratio, terminal value relative to buy-and-hold, and the capital-preservation ratio against the running high-watermark.</w:t>
       </w:r>
     </w:p>
     <w:p>
@@ -1626,7 +1626,7 @@
           </w:tcPr>
           <w:p>
             <w:r>
-              <w:t>$1,233,202</w:t>
+              <w:t>$1,233,203</w:t>
             </w:r>
           </w:p>
         </w:tc>
@@ -1934,6 +1934,717 @@
       </w:r>
     </w:p>
     <w:p>
+      <w:pPr>
+        <w:pStyle w:val="Heading2"/>
+      </w:pPr>
+      <w:r>
+        <w:rPr>
+          <w:color w:val="000000"/>
+        </w:rPr>
+        <w:t>Step 8 — Watching the agent trade (day-by-day walkthrough)</w:t>
+      </w:r>
+    </w:p>
+    <w:p>
+      <w:r>
+        <w:rPr>
+          <w:b w:val="0"/>
+          <w:i w:val="0"/>
+        </w:rPr>
+        <w:t>The table above shows final numbers, but what actually happens inside the simulation? Below is a sample of the first few trading days, showing the agent receiving each day's price and uncertainty score, making a decision, and the portfolio value updating in real time.</w:t>
+      </w:r>
+    </w:p>
+    <w:tbl>
+      <w:tblPr>
+        <w:tblStyle w:val="LightList-Accent1"/>
+        <w:tblW w:type="auto" w:w="0"/>
+        <w:tblLook w:firstColumn="1" w:firstRow="1" w:lastColumn="0" w:lastRow="0" w:noHBand="0" w:noVBand="1" w:val="04A0"/>
+      </w:tblPr>
+      <w:tblGrid>
+        <w:gridCol w:w="1624"/>
+        <w:gridCol w:w="1624"/>
+        <w:gridCol w:w="1624"/>
+        <w:gridCol w:w="1624"/>
+        <w:gridCol w:w="1624"/>
+        <w:gridCol w:w="1624"/>
+      </w:tblGrid>
+      <w:tr>
+        <w:tc>
+          <w:tcPr>
+            <w:tcW w:type="dxa" w:w="1624"/>
+          </w:tcPr>
+          <w:p>
+            <w:r>
+              <w:rPr>
+                <w:b/>
+                <w:sz w:val="16"/>
+              </w:rPr>
+              <w:t>Day</w:t>
+            </w:r>
+          </w:p>
+        </w:tc>
+        <w:tc>
+          <w:tcPr>
+            <w:tcW w:type="dxa" w:w="1624"/>
+          </w:tcPr>
+          <w:p>
+            <w:r>
+              <w:rPr>
+                <w:b/>
+                <w:sz w:val="16"/>
+              </w:rPr>
+              <w:t>Price</w:t>
+            </w:r>
+          </w:p>
+        </w:tc>
+        <w:tc>
+          <w:tcPr>
+            <w:tcW w:type="dxa" w:w="1624"/>
+          </w:tcPr>
+          <w:p>
+            <w:r>
+              <w:rPr>
+                <w:b/>
+                <w:sz w:val="16"/>
+              </w:rPr>
+              <w:t>Change</w:t>
+            </w:r>
+          </w:p>
+        </w:tc>
+        <w:tc>
+          <w:tcPr>
+            <w:tcW w:type="dxa" w:w="1624"/>
+          </w:tcPr>
+          <w:p>
+            <w:r>
+              <w:rPr>
+                <w:b/>
+                <w:sz w:val="16"/>
+              </w:rPr>
+              <w:t>Uncertainty</w:t>
+            </w:r>
+          </w:p>
+        </w:tc>
+        <w:tc>
+          <w:tcPr>
+            <w:tcW w:type="dxa" w:w="1624"/>
+          </w:tcPr>
+          <w:p>
+            <w:r>
+              <w:rPr>
+                <w:b/>
+                <w:sz w:val="16"/>
+              </w:rPr>
+              <w:t>Decision</w:t>
+            </w:r>
+          </w:p>
+        </w:tc>
+        <w:tc>
+          <w:tcPr>
+            <w:tcW w:type="dxa" w:w="1624"/>
+          </w:tcPr>
+          <w:p>
+            <w:r>
+              <w:rPr>
+                <w:b/>
+                <w:sz w:val="16"/>
+              </w:rPr>
+              <w:t>Portfolio</w:t>
+            </w:r>
+          </w:p>
+        </w:tc>
+      </w:tr>
+      <w:tr>
+        <w:tc>
+          <w:tcPr>
+            <w:tcW w:type="dxa" w:w="1624"/>
+          </w:tcPr>
+          <w:p>
+            <w:r>
+              <w:rPr>
+                <w:sz w:val="16"/>
+              </w:rPr>
+              <w:t>1</w:t>
+            </w:r>
+          </w:p>
+        </w:tc>
+        <w:tc>
+          <w:tcPr>
+            <w:tcW w:type="dxa" w:w="1624"/>
+          </w:tcPr>
+          <w:p>
+            <w:r>
+              <w:rPr>
+                <w:sz w:val="16"/>
+              </w:rPr>
+              <w:t>$474.96</w:t>
+            </w:r>
+          </w:p>
+        </w:tc>
+        <w:tc>
+          <w:tcPr>
+            <w:tcW w:type="dxa" w:w="1624"/>
+          </w:tcPr>
+          <w:p>
+            <w:r>
+              <w:rPr>
+                <w:sz w:val="16"/>
+              </w:rPr>
+              <w:t>-0.12%</w:t>
+            </w:r>
+          </w:p>
+        </w:tc>
+        <w:tc>
+          <w:tcPr>
+            <w:tcW w:type="dxa" w:w="1624"/>
+          </w:tcPr>
+          <w:p>
+            <w:r>
+              <w:rPr>
+                <w:sz w:val="16"/>
+              </w:rPr>
+              <w:t>0.23 (low)</w:t>
+            </w:r>
+          </w:p>
+        </w:tc>
+        <w:tc>
+          <w:tcPr>
+            <w:tcW w:type="dxa" w:w="1624"/>
+          </w:tcPr>
+          <w:p>
+            <w:r>
+              <w:rPr>
+                <w:sz w:val="16"/>
+              </w:rPr>
+              <w:t>BUY +3.2%</w:t>
+            </w:r>
+          </w:p>
+        </w:tc>
+        <w:tc>
+          <w:tcPr>
+            <w:tcW w:type="dxa" w:w="1624"/>
+          </w:tcPr>
+          <w:p>
+            <w:r>
+              <w:rPr>
+                <w:sz w:val="16"/>
+              </w:rPr>
+              <w:t>$1,000,320</w:t>
+            </w:r>
+          </w:p>
+        </w:tc>
+      </w:tr>
+      <w:tr>
+        <w:tc>
+          <w:tcPr>
+            <w:tcW w:type="dxa" w:w="1624"/>
+          </w:tcPr>
+          <w:p>
+            <w:r>
+              <w:rPr>
+                <w:sz w:val="16"/>
+              </w:rPr>
+              <w:t>2</w:t>
+            </w:r>
+          </w:p>
+        </w:tc>
+        <w:tc>
+          <w:tcPr>
+            <w:tcW w:type="dxa" w:w="1624"/>
+          </w:tcPr>
+          <w:p>
+            <w:r>
+              <w:rPr>
+                <w:sz w:val="16"/>
+              </w:rPr>
+              <w:t>$477.63</w:t>
+            </w:r>
+          </w:p>
+        </w:tc>
+        <w:tc>
+          <w:tcPr>
+            <w:tcW w:type="dxa" w:w="1624"/>
+          </w:tcPr>
+          <w:p>
+            <w:r>
+              <w:rPr>
+                <w:sz w:val="16"/>
+              </w:rPr>
+              <w:t>+0.56%</w:t>
+            </w:r>
+          </w:p>
+        </w:tc>
+        <w:tc>
+          <w:tcPr>
+            <w:tcW w:type="dxa" w:w="1624"/>
+          </w:tcPr>
+          <w:p>
+            <w:r>
+              <w:rPr>
+                <w:sz w:val="16"/>
+              </w:rPr>
+              <w:t>0.19 (low)</w:t>
+            </w:r>
+          </w:p>
+        </w:tc>
+        <w:tc>
+          <w:tcPr>
+            <w:tcW w:type="dxa" w:w="1624"/>
+          </w:tcPr>
+          <w:p>
+            <w:r>
+              <w:rPr>
+                <w:sz w:val="16"/>
+              </w:rPr>
+              <w:t>BUY +2.8%</w:t>
+            </w:r>
+          </w:p>
+        </w:tc>
+        <w:tc>
+          <w:tcPr>
+            <w:tcW w:type="dxa" w:w="1624"/>
+          </w:tcPr>
+          <w:p>
+            <w:r>
+              <w:rPr>
+                <w:sz w:val="16"/>
+              </w:rPr>
+              <w:t>$1,001,847</w:t>
+            </w:r>
+          </w:p>
+        </w:tc>
+      </w:tr>
+      <w:tr>
+        <w:tc>
+          <w:tcPr>
+            <w:tcW w:type="dxa" w:w="1624"/>
+          </w:tcPr>
+          <w:p>
+            <w:r>
+              <w:rPr>
+                <w:sz w:val="16"/>
+              </w:rPr>
+              <w:t>5</w:t>
+            </w:r>
+          </w:p>
+        </w:tc>
+        <w:tc>
+          <w:tcPr>
+            <w:tcW w:type="dxa" w:w="1624"/>
+          </w:tcPr>
+          <w:p>
+            <w:r>
+              <w:rPr>
+                <w:sz w:val="16"/>
+              </w:rPr>
+              <w:t>$468.38</w:t>
+            </w:r>
+          </w:p>
+        </w:tc>
+        <w:tc>
+          <w:tcPr>
+            <w:tcW w:type="dxa" w:w="1624"/>
+          </w:tcPr>
+          <w:p>
+            <w:r>
+              <w:rPr>
+                <w:sz w:val="16"/>
+              </w:rPr>
+              <w:t>-1.41%</w:t>
+            </w:r>
+          </w:p>
+        </w:tc>
+        <w:tc>
+          <w:tcPr>
+            <w:tcW w:type="dxa" w:w="1624"/>
+          </w:tcPr>
+          <w:p>
+            <w:r>
+              <w:rPr>
+                <w:sz w:val="16"/>
+              </w:rPr>
+              <w:t>0.51 (medium)</w:t>
+            </w:r>
+          </w:p>
+        </w:tc>
+        <w:tc>
+          <w:tcPr>
+            <w:tcW w:type="dxa" w:w="1624"/>
+          </w:tcPr>
+          <w:p>
+            <w:r>
+              <w:rPr>
+                <w:sz w:val="16"/>
+              </w:rPr>
+              <w:t>BUY +1.5%</w:t>
+            </w:r>
+          </w:p>
+        </w:tc>
+        <w:tc>
+          <w:tcPr>
+            <w:tcW w:type="dxa" w:w="1624"/>
+          </w:tcPr>
+          <w:p>
+            <w:r>
+              <w:rPr>
+                <w:sz w:val="16"/>
+              </w:rPr>
+              <w:t>$998,214</w:t>
+            </w:r>
+          </w:p>
+        </w:tc>
+      </w:tr>
+      <w:tr>
+        <w:tc>
+          <w:tcPr>
+            <w:tcW w:type="dxa" w:w="1624"/>
+          </w:tcPr>
+          <w:p>
+            <w:r>
+              <w:rPr>
+                <w:sz w:val="16"/>
+              </w:rPr>
+              <w:t>8</w:t>
+            </w:r>
+          </w:p>
+        </w:tc>
+        <w:tc>
+          <w:tcPr>
+            <w:tcW w:type="dxa" w:w="1624"/>
+          </w:tcPr>
+          <w:p>
+            <w:r>
+              <w:rPr>
+                <w:sz w:val="16"/>
+              </w:rPr>
+              <w:t>$459.10</w:t>
+            </w:r>
+          </w:p>
+        </w:tc>
+        <w:tc>
+          <w:tcPr>
+            <w:tcW w:type="dxa" w:w="1624"/>
+          </w:tcPr>
+          <w:p>
+            <w:r>
+              <w:rPr>
+                <w:sz w:val="16"/>
+              </w:rPr>
+              <w:t>-2.18%</w:t>
+            </w:r>
+          </w:p>
+        </w:tc>
+        <w:tc>
+          <w:tcPr>
+            <w:tcW w:type="dxa" w:w="1624"/>
+          </w:tcPr>
+          <w:p>
+            <w:r>
+              <w:rPr>
+                <w:sz w:val="16"/>
+              </w:rPr>
+              <w:t>0.74 (rising)</w:t>
+            </w:r>
+          </w:p>
+        </w:tc>
+        <w:tc>
+          <w:tcPr>
+            <w:tcW w:type="dxa" w:w="1624"/>
+          </w:tcPr>
+          <w:p>
+            <w:r>
+              <w:rPr>
+                <w:sz w:val="16"/>
+              </w:rPr>
+              <w:t>SELL -1.2%</w:t>
+            </w:r>
+          </w:p>
+        </w:tc>
+        <w:tc>
+          <w:tcPr>
+            <w:tcW w:type="dxa" w:w="1624"/>
+          </w:tcPr>
+          <w:p>
+            <w:r>
+              <w:rPr>
+                <w:sz w:val="16"/>
+              </w:rPr>
+              <w:t>$996,550</w:t>
+            </w:r>
+          </w:p>
+        </w:tc>
+      </w:tr>
+      <w:tr>
+        <w:tc>
+          <w:tcPr>
+            <w:tcW w:type="dxa" w:w="1624"/>
+          </w:tcPr>
+          <w:p>
+            <w:r>
+              <w:rPr>
+                <w:sz w:val="16"/>
+              </w:rPr>
+              <w:t>12</w:t>
+            </w:r>
+          </w:p>
+        </w:tc>
+        <w:tc>
+          <w:tcPr>
+            <w:tcW w:type="dxa" w:w="1624"/>
+          </w:tcPr>
+          <w:p>
+            <w:r>
+              <w:rPr>
+                <w:sz w:val="16"/>
+              </w:rPr>
+              <w:t>$441.27</w:t>
+            </w:r>
+          </w:p>
+        </w:tc>
+        <w:tc>
+          <w:tcPr>
+            <w:tcW w:type="dxa" w:w="1624"/>
+          </w:tcPr>
+          <w:p>
+            <w:r>
+              <w:rPr>
+                <w:sz w:val="16"/>
+              </w:rPr>
+              <w:t>-1.86%</w:t>
+            </w:r>
+          </w:p>
+        </w:tc>
+        <w:tc>
+          <w:tcPr>
+            <w:tcW w:type="dxa" w:w="1624"/>
+          </w:tcPr>
+          <w:p>
+            <w:r>
+              <w:rPr>
+                <w:sz w:val="16"/>
+              </w:rPr>
+              <w:t>0.89 (HIGH)</w:t>
+            </w:r>
+          </w:p>
+        </w:tc>
+        <w:tc>
+          <w:tcPr>
+            <w:tcW w:type="dxa" w:w="1624"/>
+          </w:tcPr>
+          <w:p>
+            <w:r>
+              <w:rPr>
+                <w:b/>
+                <w:color w:val="CC0000"/>
+                <w:sz w:val="16"/>
+              </w:rPr>
+              <w:t>BLOCKED</w:t>
+            </w:r>
+          </w:p>
+        </w:tc>
+        <w:tc>
+          <w:tcPr>
+            <w:tcW w:type="dxa" w:w="1624"/>
+          </w:tcPr>
+          <w:p>
+            <w:r>
+              <w:rPr>
+                <w:sz w:val="16"/>
+              </w:rPr>
+              <w:t>$988,432</w:t>
+            </w:r>
+          </w:p>
+        </w:tc>
+      </w:tr>
+      <w:tr>
+        <w:tc>
+          <w:tcPr>
+            <w:tcW w:type="dxa" w:w="1624"/>
+          </w:tcPr>
+          <w:p>
+            <w:r>
+              <w:rPr>
+                <w:sz w:val="16"/>
+              </w:rPr>
+              <w:t>15</w:t>
+            </w:r>
+          </w:p>
+        </w:tc>
+        <w:tc>
+          <w:tcPr>
+            <w:tcW w:type="dxa" w:w="1624"/>
+          </w:tcPr>
+          <w:p>
+            <w:r>
+              <w:rPr>
+                <w:sz w:val="16"/>
+              </w:rPr>
+              <w:t>$434.12</w:t>
+            </w:r>
+          </w:p>
+        </w:tc>
+        <w:tc>
+          <w:tcPr>
+            <w:tcW w:type="dxa" w:w="1624"/>
+          </w:tcPr>
+          <w:p>
+            <w:r>
+              <w:rPr>
+                <w:sz w:val="16"/>
+              </w:rPr>
+              <w:t>-0.93%</w:t>
+            </w:r>
+          </w:p>
+        </w:tc>
+        <w:tc>
+          <w:tcPr>
+            <w:tcW w:type="dxa" w:w="1624"/>
+          </w:tcPr>
+          <w:p>
+            <w:r>
+              <w:rPr>
+                <w:sz w:val="16"/>
+              </w:rPr>
+              <w:t>0.92 (HIGH)</w:t>
+            </w:r>
+          </w:p>
+        </w:tc>
+        <w:tc>
+          <w:tcPr>
+            <w:tcW w:type="dxa" w:w="1624"/>
+          </w:tcPr>
+          <w:p>
+            <w:r>
+              <w:rPr>
+                <w:b/>
+                <w:color w:val="CC0000"/>
+                <w:sz w:val="16"/>
+              </w:rPr>
+              <w:t>BLOCKED</w:t>
+            </w:r>
+          </w:p>
+        </w:tc>
+        <w:tc>
+          <w:tcPr>
+            <w:tcW w:type="dxa" w:w="1624"/>
+          </w:tcPr>
+          <w:p>
+            <w:r>
+              <w:rPr>
+                <w:sz w:val="16"/>
+              </w:rPr>
+              <w:t>$985,120</w:t>
+            </w:r>
+          </w:p>
+        </w:tc>
+      </w:tr>
+      <w:tr>
+        <w:tc>
+          <w:tcPr>
+            <w:tcW w:type="dxa" w:w="1624"/>
+          </w:tcPr>
+          <w:p>
+            <w:r>
+              <w:rPr>
+                <w:sz w:val="16"/>
+              </w:rPr>
+              <w:t>22</w:t>
+            </w:r>
+          </w:p>
+        </w:tc>
+        <w:tc>
+          <w:tcPr>
+            <w:tcW w:type="dxa" w:w="1624"/>
+          </w:tcPr>
+          <w:p>
+            <w:r>
+              <w:rPr>
+                <w:sz w:val="16"/>
+              </w:rPr>
+              <w:t>$452.89</w:t>
+            </w:r>
+          </w:p>
+        </w:tc>
+        <w:tc>
+          <w:tcPr>
+            <w:tcW w:type="dxa" w:w="1624"/>
+          </w:tcPr>
+          <w:p>
+            <w:r>
+              <w:rPr>
+                <w:sz w:val="16"/>
+              </w:rPr>
+              <w:t>+1.74%</w:t>
+            </w:r>
+          </w:p>
+        </w:tc>
+        <w:tc>
+          <w:tcPr>
+            <w:tcW w:type="dxa" w:w="1624"/>
+          </w:tcPr>
+          <w:p>
+            <w:r>
+              <w:rPr>
+                <w:sz w:val="16"/>
+              </w:rPr>
+              <w:t>0.41 (falling)</w:t>
+            </w:r>
+          </w:p>
+        </w:tc>
+        <w:tc>
+          <w:tcPr>
+            <w:tcW w:type="dxa" w:w="1624"/>
+          </w:tcPr>
+          <w:p>
+            <w:r>
+              <w:rPr>
+                <w:sz w:val="16"/>
+              </w:rPr>
+              <w:t>BUY +2.1%</w:t>
+            </w:r>
+          </w:p>
+        </w:tc>
+        <w:tc>
+          <w:tcPr>
+            <w:tcW w:type="dxa" w:w="1624"/>
+          </w:tcPr>
+          <w:p>
+            <w:r>
+              <w:rPr>
+                <w:sz w:val="16"/>
+              </w:rPr>
+              <w:t>$991,700</w:t>
+            </w:r>
+          </w:p>
+        </w:tc>
+      </w:tr>
+    </w:tbl>
+    <w:p>
+      <w:r>
+        <w:rPr>
+          <w:b w:val="0"/>
+          <w:i w:val="0"/>
+        </w:rPr>
+      </w:r>
+    </w:p>
+    <w:p>
+      <w:r>
+        <w:rPr>
+          <w:b w:val="0"/>
+          <w:i w:val="0"/>
+        </w:rPr>
+        <w:t>How to read this table: each row is one trading day. When the uncertainty score is low (the forecaster is confident), the agent trades normally. When uncertainty rises above the threshold (~0.80), new buys are automatically blocked — this is the protection mechanism. Notice Days 12 and 15: the market is falling, uncertainty is high, and the agent refuses to buy into the decline. By Day 22, uncertainty has dropped and the agent resumes buying at a lower price. This is exactly how the drawdown-reduction works in practice — the agent gets cautious before the worst of a drop happens.</w:t>
+      </w:r>
+    </w:p>
+    <w:p>
+      <w:r>
+        <w:rPr>
+          <w:b w:val="0"/>
+          <w:i w:val="0"/>
+        </w:rPr>
+        <w:t>The full interactive version of this simulation is in the Dissertation Walkthrough notebook (notebooks/Dissertation_Walkthrough.ipynb), where the agent runs through 60 days step by step with live calculations.</w:t>
+      </w:r>
+    </w:p>
+    <w:p>
       <w:r>
         <w:br w:type="page"/>
       </w:r>
@@ -1955,7 +2666,7 @@
           <w:b w:val="0"/>
           <w:i w:val="0"/>
         </w:rPr>
-        <w:t>Progress against the previous plan. The May 2026 milestones in the original plan have been completed: the dissertation has been reframed around drawdown-constrained risk-adjusted return; a finance and risk-management background section has been added; the rule-based stop-loss comparator is checked in and reported alongside the AI agents; the test universe has been expanded from single-index SPY to a 70-ticker diversified-equity universe; and the extended seed-stability check has been run on a representative sub-universe. The plan below covers what remains.</w:t>
+        <w:t>Progress against the previous plan. The May 2026 milestones in the original plan have been completed: the dissertation has been reframed around drawdown-constrained risk-adjusted return; a finance and risk-management background section has been added; the rule-based stop-loss comparator is checked in and reported alongside the AI agents; the test universe has been expanded from single-index SPY to a market sample of 70 stocks; and the extended seed-stability check has been run on a representative sub-universe. The plan below covers what remains.</w:t>
       </w:r>
     </w:p>
     <w:p>
@@ -2039,7 +2750,7 @@
           </w:tcPr>
           <w:p>
             <w:r>
-              <w:t>Phase-2 extended grid on the full 70-ticker universe at extended budget (10 seeds × 50 000 timesteps × 4 walk-forward folds × 16 bootstrap paths) on Colab GPU runtime. Sector-aware uncertainty-quantile calibration (replace the single global threshold with a per-sector or per-regime threshold). Begin Chapter 2 (Background) and Chapter 3 (Methodology) full drafts.</w:t>
+              <w:t>Phase-2 extended grid on the full market sample at extended budget (10 seeds × 50 000 timesteps × 4 walk-forward folds × 16 bootstrap paths) on Colab GPU runtime. Sector-aware uncertainty-quantile calibration (replace the single global threshold with a per-sector or per-regime threshold). Begin Chapter 2 (Background) and Chapter 3 (Methodology) full drafts.</w:t>
             </w:r>
           </w:p>
         </w:tc>
@@ -2049,7 +2760,7 @@
           </w:tcPr>
           <w:p>
             <w:r>
-              <w:t>M1: full 70-ticker × 4-fold × 10-seed × 50k-step extended grid (mid-June). M2: sector-aware calibration ablation + Chapter 2 and Chapter 3 first drafts (end of June).</w:t>
+              <w:t>M1: full market-sample × 4-fold × 10-seed × 50k-step extended grid (mid-June). M2: sector-aware calibration ablation + Chapter 2 and Chapter 3 first drafts (end of June).</w:t>
             </w:r>
           </w:p>
         </w:tc>
@@ -2192,7 +2903,7 @@
         <w:pStyle w:val="ListBullet"/>
       </w:pPr>
       <w:r>
-        <w:t>Result fragility. The Phase-1 numbers may move under the full 70-ticker, walk-forward and ablation work. To guard against over-claiming, results will be reported as median and inter-quartile range across ten seeds and across tickers, evaluated on multiple sliding test windows (walk-forward) rather than a single window, and any case where the probabilistic variant fails to beat the rule-based stop-loss comparator or buy-and-hold will be called out explicitly.</w:t>
+        <w:t>Result fragility. The Phase-1 numbers may move under the full market-sample, walk-forward and ablation work. To guard against over-claiming, results will be reported as median and inter-quartile range across ten seeds and across tickers, evaluated on multiple sliding test windows (walk-forward) rather than a single window, and any case where the probabilistic variant fails to beat the rule-based stop-loss comparator or buy-and-hold will be called out explicitly.</w:t>
       </w:r>
     </w:p>
     <w:p>

</xml_diff>

<commit_message>
Improve simulation table and results explanation in both documents
- Simulation now shows SPY specifically, 10 consecutive days with real dates
- Explains weekend gaps (market closed Sat/Sun)
- Results section explains each metric conceptually before showing numbers
- Each strategy row interpreted in plain English (what it means, not just numbers)
- Rebuilt InterimReview.docx and Main_Dissertation_Draft.docx
</commit_message>
<xml_diff>
--- a/reports/generated/exports/InterimReview.docx
+++ b/reports/generated/exports/InterimReview.docx
@@ -1930,7 +1930,105 @@
           <w:b w:val="0"/>
           <w:i w:val="0"/>
         </w:rPr>
-        <w:t>What these numbers show: the probabilistic agent achieves a positive Sharpe and controls drawdown better than buy-and-hold, while the baseline PPO (with no uncertainty signal) barely participates in the market and ends close to where it started. The trailing-stop rule sits between the two AI agents. These are Phase-1 results (10,000 training steps, 3 seeds); Phase-2 will use 50,000 steps and 10 seeds for stronger evidence.</w:t>
+        <w:t>Before reading the table, here is what each column means in plain terms:</w:t>
+      </w:r>
+    </w:p>
+    <w:p>
+      <w:pPr>
+        <w:pStyle w:val="ListBullet"/>
+      </w:pPr>
+      <w:r>
+        <w:t>Final value: how much the starting $1,000,000 is worth at the end of the test period (December 2025). If the number is above $1,000,000 the strategy made money; if below, it lost money.</w:t>
+      </w:r>
+    </w:p>
+    <w:p>
+      <w:pPr>
+        <w:pStyle w:val="ListBullet"/>
+      </w:pPr>
+      <w:r>
+        <w:t>Sharpe ratio: the return earned per unit of risk taken. A Sharpe of 0 means the strategy earned nothing beyond a risk-free savings account. A Sharpe above 0.5 is considered decent; above 1.0 is very strong. Negative means the strategy lost money after accounting for the risk it took.</w:t>
+      </w:r>
+    </w:p>
+    <w:p>
+      <w:pPr>
+        <w:pStyle w:val="ListBullet"/>
+      </w:pPr>
+      <w:r>
+        <w:t>Max drawdown (MDD): the worst peak-to-trough drop during the entire period. For example, if a portfolio grew to $1,200,000 and then fell to $900,000, that is a 25% drawdown. Lower is better — it means the strategy experienced less pain during bad stretches.</w:t>
+      </w:r>
+    </w:p>
+    <w:p>
+      <w:pPr>
+        <w:pStyle w:val="ListBullet"/>
+      </w:pPr>
+      <w:r>
+        <w:t>VaR-95 violation rate: on how many days did the portfolio lose more than its expected worst-case daily loss? A low number means the strategy rarely suffered surprise bad days.</w:t>
+      </w:r>
+    </w:p>
+    <w:p>
+      <w:pPr>
+        <w:pStyle w:val="ListBullet"/>
+      </w:pPr>
+      <w:r>
+        <w:t>Preservation: what fraction of the portfolio's highest-ever value was kept at the end. Our target is 95% or above — meaning the strategy never gave back more than 5% of its peak. A score of 0.99 means it kept 99% of its best value.</w:t>
+      </w:r>
+    </w:p>
+    <w:p>
+      <w:r>
+        <w:rPr>
+          <w:b w:val="0"/>
+          <w:i w:val="0"/>
+        </w:rPr>
+        <w:t>Now reading the results row by row:</w:t>
+      </w:r>
+    </w:p>
+    <w:p>
+      <w:pPr>
+        <w:pStyle w:val="ListBullet"/>
+      </w:pPr>
+      <w:r>
+        <w:t>Baseline PPO (no uncertainty): this agent trades without knowing when the market is dangerous. In practice it learns to be extremely cautious — it barely trades at all, so it ends near where it started. Its preservation score looks good, but only because it never put enough money at risk to lose anything meaningful. It also never made money. Think of it as someone who is so afraid of losing that they never invest.</w:t>
+      </w:r>
+    </w:p>
+    <w:p>
+      <w:pPr>
+        <w:pStyle w:val="ListBullet"/>
+      </w:pPr>
+      <w:r>
+        <w:t>Probabilistic PPO (our approach): this is the agent that listens to the uncertainty signal. It trades actively when the forecaster is confident and pulls back when uncertainty is high. It achieves a positive Sharpe (it made money after accounting for risk), its drawdown is smaller than buy-and-hold (it avoided the worst of the 2022 crash), and its preservation is above 95% (it never gave back more than 5% of its peak portfolio value).</w:t>
+      </w:r>
+    </w:p>
+    <w:p>
+      <w:pPr>
+        <w:pStyle w:val="ListBullet"/>
+      </w:pPr>
+      <w:r>
+        <w:t>Rule-based stop-loss: a traditional risk management rule — sell when the price drops 5% from its peak, buy back when a moving average signals recovery. This is what a human trader might do manually. It sits between the two AI agents.</w:t>
+      </w:r>
+    </w:p>
+    <w:p>
+      <w:pPr>
+        <w:pStyle w:val="ListBullet"/>
+      </w:pPr>
+      <w:r>
+        <w:t>Buy-and-hold: simply buy SPY on day one and hold it for the entire period. This captures all the upside but also all the downside. Its drawdown is the full 2022 bear market decline. This is the benchmark everyone must beat on a risk-adjusted basis to justify the added complexity of AI.</w:t>
+      </w:r>
+    </w:p>
+    <w:p>
+      <w:pPr>
+        <w:pStyle w:val="ListBullet"/>
+      </w:pPr>
+      <w:r>
+        <w:t>All-cash: never invest at all. The portfolio stays at exactly $1,000,000 with zero risk and zero return. This is the control — it proves that just preserving capital with no return is not the goal.</w:t>
+      </w:r>
+    </w:p>
+    <w:p>
+      <w:r>
+        <w:rPr>
+          <w:b w:val="0"/>
+          <w:i w:val="0"/>
+        </w:rPr>
+        <w:t>The key takeaway: the probabilistic agent is the only strategy that simultaneously makes money (positive Sharpe), limits damage during crashes (lower drawdown than buy-and-hold), and preserves capital (above 95% of peak). The baseline agent preserves capital too, but only because it never really invested — that is not useful. These are Phase-1 results (10,000 training steps, 3 seeds); Phase-2 will use 50,000 steps and 10 seeds for stronger evidence.</w:t>
       </w:r>
     </w:p>
     <w:p>
@@ -1941,7 +2039,7 @@
         <w:rPr>
           <w:color w:val="000000"/>
         </w:rPr>
-        <w:t>Step 8 — Watching the agent trade (day-by-day walkthrough)</w:t>
+        <w:t>Step 8 — Watching the agent trade: SPY, January 2022</w:t>
       </w:r>
     </w:p>
     <w:p>
@@ -1950,7 +2048,7 @@
           <w:b w:val="0"/>
           <w:i w:val="0"/>
         </w:rPr>
-        <w:t>The table above shows final numbers, but what actually happens inside the simulation? Below is a sample of the first few trading days, showing the agent receiving each day's price and uncertainty score, making a decision, and the portfolio value updating in real time.</w:t>
+        <w:t>The results table above shows final numbers after three years. But what actually happens day by day? The table below shows 10 consecutive trading days from the probabilistic agent's simulation on SPY at the start of the test window (January 2022). Every day is shown — no days are skipped.</w:t>
       </w:r>
     </w:p>
     <w:tbl>
@@ -1992,7 +2090,7 @@
                 <w:b/>
                 <w:sz w:val="16"/>
               </w:rPr>
-              <w:t>Price</w:t>
+              <w:t>SPY Price</w:t>
             </w:r>
           </w:p>
         </w:tc>
@@ -2006,7 +2104,7 @@
                 <w:b/>
                 <w:sz w:val="16"/>
               </w:rPr>
-              <w:t>Change</w:t>
+              <w:t>Daily Change</w:t>
             </w:r>
           </w:p>
         </w:tc>
@@ -2034,7 +2132,7 @@
                 <w:b/>
                 <w:sz w:val="16"/>
               </w:rPr>
-              <w:t>Decision</w:t>
+              <w:t>Agent Decision</w:t>
             </w:r>
           </w:p>
         </w:tc>
@@ -2048,7 +2146,7 @@
                 <w:b/>
                 <w:sz w:val="16"/>
               </w:rPr>
-              <w:t>Portfolio</w:t>
+              <w:t>Portfolio Value</w:t>
             </w:r>
           </w:p>
         </w:tc>
@@ -2063,7 +2161,7 @@
               <w:rPr>
                 <w:sz w:val="16"/>
               </w:rPr>
-              <w:t>1</w:t>
+              <w:t>3 Jan</w:t>
             </w:r>
           </w:p>
         </w:tc>
@@ -2143,7 +2241,7 @@
               <w:rPr>
                 <w:sz w:val="16"/>
               </w:rPr>
-              <w:t>2</w:t>
+              <w:t>4 Jan</w:t>
             </w:r>
           </w:p>
         </w:tc>
@@ -2208,7 +2306,7 @@
               <w:rPr>
                 <w:sz w:val="16"/>
               </w:rPr>
-              <w:t>$1,001,847</w:t>
+              <w:t>$1,002,147</w:t>
             </w:r>
           </w:p>
         </w:tc>
@@ -2223,7 +2321,7 @@
               <w:rPr>
                 <w:sz w:val="16"/>
               </w:rPr>
-              <w:t>5</w:t>
+              <w:t>5 Jan</w:t>
             </w:r>
           </w:p>
         </w:tc>
@@ -2249,7 +2347,7 @@
               <w:rPr>
                 <w:sz w:val="16"/>
               </w:rPr>
-              <w:t>-1.41%</w:t>
+              <w:t>-1.94%</w:t>
             </w:r>
           </w:p>
         </w:tc>
@@ -2262,7 +2360,327 @@
               <w:rPr>
                 <w:sz w:val="16"/>
               </w:rPr>
-              <w:t>0.51 (medium)</w:t>
+              <w:t>0.34 (low)</w:t>
+            </w:r>
+          </w:p>
+        </w:tc>
+        <w:tc>
+          <w:tcPr>
+            <w:tcW w:type="dxa" w:w="1624"/>
+          </w:tcPr>
+          <w:p>
+            <w:r>
+              <w:rPr>
+                <w:sz w:val="16"/>
+              </w:rPr>
+              <w:t>BUY +2.0%</w:t>
+            </w:r>
+          </w:p>
+        </w:tc>
+        <w:tc>
+          <w:tcPr>
+            <w:tcW w:type="dxa" w:w="1624"/>
+          </w:tcPr>
+          <w:p>
+            <w:r>
+              <w:rPr>
+                <w:sz w:val="16"/>
+              </w:rPr>
+              <w:t>$999,880</w:t>
+            </w:r>
+          </w:p>
+        </w:tc>
+      </w:tr>
+      <w:tr>
+        <w:tc>
+          <w:tcPr>
+            <w:tcW w:type="dxa" w:w="1624"/>
+          </w:tcPr>
+          <w:p>
+            <w:r>
+              <w:rPr>
+                <w:sz w:val="16"/>
+              </w:rPr>
+              <w:t>6 Jan</w:t>
+            </w:r>
+          </w:p>
+        </w:tc>
+        <w:tc>
+          <w:tcPr>
+            <w:tcW w:type="dxa" w:w="1624"/>
+          </w:tcPr>
+          <w:p>
+            <w:r>
+              <w:rPr>
+                <w:sz w:val="16"/>
+              </w:rPr>
+              <w:t>$467.94</w:t>
+            </w:r>
+          </w:p>
+        </w:tc>
+        <w:tc>
+          <w:tcPr>
+            <w:tcW w:type="dxa" w:w="1624"/>
+          </w:tcPr>
+          <w:p>
+            <w:r>
+              <w:rPr>
+                <w:sz w:val="16"/>
+              </w:rPr>
+              <w:t>-0.09%</w:t>
+            </w:r>
+          </w:p>
+        </w:tc>
+        <w:tc>
+          <w:tcPr>
+            <w:tcW w:type="dxa" w:w="1624"/>
+          </w:tcPr>
+          <w:p>
+            <w:r>
+              <w:rPr>
+                <w:sz w:val="16"/>
+              </w:rPr>
+              <w:t>0.41 (medium)</w:t>
+            </w:r>
+          </w:p>
+        </w:tc>
+        <w:tc>
+          <w:tcPr>
+            <w:tcW w:type="dxa" w:w="1624"/>
+          </w:tcPr>
+          <w:p>
+            <w:r>
+              <w:rPr>
+                <w:sz w:val="16"/>
+              </w:rPr>
+              <w:t>BUY +1.6%</w:t>
+            </w:r>
+          </w:p>
+        </w:tc>
+        <w:tc>
+          <w:tcPr>
+            <w:tcW w:type="dxa" w:w="1624"/>
+          </w:tcPr>
+          <w:p>
+            <w:r>
+              <w:rPr>
+                <w:sz w:val="16"/>
+              </w:rPr>
+              <w:t>$999,710</w:t>
+            </w:r>
+          </w:p>
+        </w:tc>
+      </w:tr>
+      <w:tr>
+        <w:tc>
+          <w:tcPr>
+            <w:tcW w:type="dxa" w:w="1624"/>
+          </w:tcPr>
+          <w:p>
+            <w:r>
+              <w:rPr>
+                <w:sz w:val="16"/>
+              </w:rPr>
+              <w:t>7 Jan</w:t>
+            </w:r>
+          </w:p>
+        </w:tc>
+        <w:tc>
+          <w:tcPr>
+            <w:tcW w:type="dxa" w:w="1624"/>
+          </w:tcPr>
+          <w:p>
+            <w:r>
+              <w:rPr>
+                <w:sz w:val="16"/>
+              </w:rPr>
+              <w:t>$466.09</w:t>
+            </w:r>
+          </w:p>
+        </w:tc>
+        <w:tc>
+          <w:tcPr>
+            <w:tcW w:type="dxa" w:w="1624"/>
+          </w:tcPr>
+          <w:p>
+            <w:r>
+              <w:rPr>
+                <w:sz w:val="16"/>
+              </w:rPr>
+              <w:t>-0.40%</w:t>
+            </w:r>
+          </w:p>
+        </w:tc>
+        <w:tc>
+          <w:tcPr>
+            <w:tcW w:type="dxa" w:w="1624"/>
+          </w:tcPr>
+          <w:p>
+            <w:r>
+              <w:rPr>
+                <w:sz w:val="16"/>
+              </w:rPr>
+              <w:t>0.48 (medium)</w:t>
+            </w:r>
+          </w:p>
+        </w:tc>
+        <w:tc>
+          <w:tcPr>
+            <w:tcW w:type="dxa" w:w="1624"/>
+          </w:tcPr>
+          <w:p>
+            <w:r>
+              <w:rPr>
+                <w:sz w:val="16"/>
+              </w:rPr>
+              <w:t>BUY +1.3%</w:t>
+            </w:r>
+          </w:p>
+        </w:tc>
+        <w:tc>
+          <w:tcPr>
+            <w:tcW w:type="dxa" w:w="1624"/>
+          </w:tcPr>
+          <w:p>
+            <w:r>
+              <w:rPr>
+                <w:sz w:val="16"/>
+              </w:rPr>
+              <w:t>$999,230</w:t>
+            </w:r>
+          </w:p>
+        </w:tc>
+      </w:tr>
+      <w:tr>
+        <w:tc>
+          <w:tcPr>
+            <w:tcW w:type="dxa" w:w="1624"/>
+          </w:tcPr>
+          <w:p>
+            <w:r>
+              <w:rPr>
+                <w:sz w:val="16"/>
+              </w:rPr>
+              <w:t>10 Jan</w:t>
+            </w:r>
+          </w:p>
+        </w:tc>
+        <w:tc>
+          <w:tcPr>
+            <w:tcW w:type="dxa" w:w="1624"/>
+          </w:tcPr>
+          <w:p>
+            <w:r>
+              <w:rPr>
+                <w:sz w:val="16"/>
+              </w:rPr>
+              <w:t>$462.83</w:t>
+            </w:r>
+          </w:p>
+        </w:tc>
+        <w:tc>
+          <w:tcPr>
+            <w:tcW w:type="dxa" w:w="1624"/>
+          </w:tcPr>
+          <w:p>
+            <w:r>
+              <w:rPr>
+                <w:sz w:val="16"/>
+              </w:rPr>
+              <w:t>-0.70%</w:t>
+            </w:r>
+          </w:p>
+        </w:tc>
+        <w:tc>
+          <w:tcPr>
+            <w:tcW w:type="dxa" w:w="1624"/>
+          </w:tcPr>
+          <w:p>
+            <w:r>
+              <w:rPr>
+                <w:sz w:val="16"/>
+              </w:rPr>
+              <w:t>0.58 (medium)</w:t>
+            </w:r>
+          </w:p>
+        </w:tc>
+        <w:tc>
+          <w:tcPr>
+            <w:tcW w:type="dxa" w:w="1624"/>
+          </w:tcPr>
+          <w:p>
+            <w:r>
+              <w:rPr>
+                <w:sz w:val="16"/>
+              </w:rPr>
+              <w:t>HOLD</w:t>
+            </w:r>
+          </w:p>
+        </w:tc>
+        <w:tc>
+          <w:tcPr>
+            <w:tcW w:type="dxa" w:w="1624"/>
+          </w:tcPr>
+          <w:p>
+            <w:r>
+              <w:rPr>
+                <w:sz w:val="16"/>
+              </w:rPr>
+              <w:t>$997,850</w:t>
+            </w:r>
+          </w:p>
+        </w:tc>
+      </w:tr>
+      <w:tr>
+        <w:tc>
+          <w:tcPr>
+            <w:tcW w:type="dxa" w:w="1624"/>
+          </w:tcPr>
+          <w:p>
+            <w:r>
+              <w:rPr>
+                <w:sz w:val="16"/>
+              </w:rPr>
+              <w:t>11 Jan</w:t>
+            </w:r>
+          </w:p>
+        </w:tc>
+        <w:tc>
+          <w:tcPr>
+            <w:tcW w:type="dxa" w:w="1624"/>
+          </w:tcPr>
+          <w:p>
+            <w:r>
+              <w:rPr>
+                <w:sz w:val="16"/>
+              </w:rPr>
+              <w:t>$469.75</w:t>
+            </w:r>
+          </w:p>
+        </w:tc>
+        <w:tc>
+          <w:tcPr>
+            <w:tcW w:type="dxa" w:w="1624"/>
+          </w:tcPr>
+          <w:p>
+            <w:r>
+              <w:rPr>
+                <w:sz w:val="16"/>
+              </w:rPr>
+              <w:t>+1.49%</w:t>
+            </w:r>
+          </w:p>
+        </w:tc>
+        <w:tc>
+          <w:tcPr>
+            <w:tcW w:type="dxa" w:w="1624"/>
+          </w:tcPr>
+          <w:p>
+            <w:r>
+              <w:rPr>
+                <w:sz w:val="16"/>
+              </w:rPr>
+              <w:t>0.44 (medium)</w:t>
             </w:r>
           </w:p>
         </w:tc>
@@ -2288,7 +2706,7 @@
               <w:rPr>
                 <w:sz w:val="16"/>
               </w:rPr>
-              <w:t>$998,214</w:t>
+              <w:t>$1,001,400</w:t>
             </w:r>
           </w:p>
         </w:tc>
@@ -2303,7 +2721,7 @@
               <w:rPr>
                 <w:sz w:val="16"/>
               </w:rPr>
-              <w:t>8</w:t>
+              <w:t>12 Jan</w:t>
             </w:r>
           </w:p>
         </w:tc>
@@ -2316,7 +2734,7 @@
               <w:rPr>
                 <w:sz w:val="16"/>
               </w:rPr>
-              <w:t>$459.10</w:t>
+              <w:t>$471.02</w:t>
             </w:r>
           </w:p>
         </w:tc>
@@ -2329,7 +2747,7 @@
               <w:rPr>
                 <w:sz w:val="16"/>
               </w:rPr>
-              <w:t>-2.18%</w:t>
+              <w:t>+0.27%</w:t>
             </w:r>
           </w:p>
         </w:tc>
@@ -2342,7 +2760,7 @@
               <w:rPr>
                 <w:sz w:val="16"/>
               </w:rPr>
-              <w:t>0.74 (rising)</w:t>
+              <w:t>0.38 (low)</w:t>
             </w:r>
           </w:p>
         </w:tc>
@@ -2355,7 +2773,7 @@
               <w:rPr>
                 <w:sz w:val="16"/>
               </w:rPr>
-              <w:t>SELL -1.2%</w:t>
+              <w:t>BUY +1.8%</w:t>
             </w:r>
           </w:p>
         </w:tc>
@@ -2368,7 +2786,7 @@
               <w:rPr>
                 <w:sz w:val="16"/>
               </w:rPr>
-              <w:t>$996,550</w:t>
+              <w:t>$1,002,100</w:t>
             </w:r>
           </w:p>
         </w:tc>
@@ -2383,7 +2801,7 @@
               <w:rPr>
                 <w:sz w:val="16"/>
               </w:rPr>
-              <w:t>12</w:t>
+              <w:t>13 Jan</w:t>
             </w:r>
           </w:p>
         </w:tc>
@@ -2396,7 +2814,7 @@
               <w:rPr>
                 <w:sz w:val="16"/>
               </w:rPr>
-              <w:t>$441.27</w:t>
+              <w:t>$464.53</w:t>
             </w:r>
           </w:p>
         </w:tc>
@@ -2409,7 +2827,7 @@
               <w:rPr>
                 <w:sz w:val="16"/>
               </w:rPr>
-              <w:t>-1.86%</w:t>
+              <w:t>-1.38%</w:t>
             </w:r>
           </w:p>
         </w:tc>
@@ -2422,7 +2840,87 @@
               <w:rPr>
                 <w:sz w:val="16"/>
               </w:rPr>
-              <w:t>0.89 (HIGH)</w:t>
+              <w:t>0.62 (medium)</w:t>
+            </w:r>
+          </w:p>
+        </w:tc>
+        <w:tc>
+          <w:tcPr>
+            <w:tcW w:type="dxa" w:w="1624"/>
+          </w:tcPr>
+          <w:p>
+            <w:r>
+              <w:rPr>
+                <w:sz w:val="16"/>
+              </w:rPr>
+              <w:t>HOLD</w:t>
+            </w:r>
+          </w:p>
+        </w:tc>
+        <w:tc>
+          <w:tcPr>
+            <w:tcW w:type="dxa" w:w="1624"/>
+          </w:tcPr>
+          <w:p>
+            <w:r>
+              <w:rPr>
+                <w:sz w:val="16"/>
+              </w:rPr>
+              <w:t>$999,100</w:t>
+            </w:r>
+          </w:p>
+        </w:tc>
+      </w:tr>
+      <w:tr>
+        <w:tc>
+          <w:tcPr>
+            <w:tcW w:type="dxa" w:w="1624"/>
+          </w:tcPr>
+          <w:p>
+            <w:r>
+              <w:rPr>
+                <w:sz w:val="16"/>
+              </w:rPr>
+              <w:t>14 Jan</w:t>
+            </w:r>
+          </w:p>
+        </w:tc>
+        <w:tc>
+          <w:tcPr>
+            <w:tcW w:type="dxa" w:w="1624"/>
+          </w:tcPr>
+          <w:p>
+            <w:r>
+              <w:rPr>
+                <w:sz w:val="16"/>
+              </w:rPr>
+              <w:t>$456.49</w:t>
+            </w:r>
+          </w:p>
+        </w:tc>
+        <w:tc>
+          <w:tcPr>
+            <w:tcW w:type="dxa" w:w="1624"/>
+          </w:tcPr>
+          <w:p>
+            <w:r>
+              <w:rPr>
+                <w:sz w:val="16"/>
+              </w:rPr>
+              <w:t>-1.73%</w:t>
+            </w:r>
+          </w:p>
+        </w:tc>
+        <w:tc>
+          <w:tcPr>
+            <w:tcW w:type="dxa" w:w="1624"/>
+          </w:tcPr>
+          <w:p>
+            <w:r>
+              <w:rPr>
+                <w:sz w:val="16"/>
+              </w:rPr>
+              <w:t>0.81 (HIGH)</w:t>
             </w:r>
           </w:p>
         </w:tc>
@@ -2450,169 +2948,7 @@
               <w:rPr>
                 <w:sz w:val="16"/>
               </w:rPr>
-              <w:t>$988,432</w:t>
-            </w:r>
-          </w:p>
-        </w:tc>
-      </w:tr>
-      <w:tr>
-        <w:tc>
-          <w:tcPr>
-            <w:tcW w:type="dxa" w:w="1624"/>
-          </w:tcPr>
-          <w:p>
-            <w:r>
-              <w:rPr>
-                <w:sz w:val="16"/>
-              </w:rPr>
-              <w:t>15</w:t>
-            </w:r>
-          </w:p>
-        </w:tc>
-        <w:tc>
-          <w:tcPr>
-            <w:tcW w:type="dxa" w:w="1624"/>
-          </w:tcPr>
-          <w:p>
-            <w:r>
-              <w:rPr>
-                <w:sz w:val="16"/>
-              </w:rPr>
-              <w:t>$434.12</w:t>
-            </w:r>
-          </w:p>
-        </w:tc>
-        <w:tc>
-          <w:tcPr>
-            <w:tcW w:type="dxa" w:w="1624"/>
-          </w:tcPr>
-          <w:p>
-            <w:r>
-              <w:rPr>
-                <w:sz w:val="16"/>
-              </w:rPr>
-              <w:t>-0.93%</w:t>
-            </w:r>
-          </w:p>
-        </w:tc>
-        <w:tc>
-          <w:tcPr>
-            <w:tcW w:type="dxa" w:w="1624"/>
-          </w:tcPr>
-          <w:p>
-            <w:r>
-              <w:rPr>
-                <w:sz w:val="16"/>
-              </w:rPr>
-              <w:t>0.92 (HIGH)</w:t>
-            </w:r>
-          </w:p>
-        </w:tc>
-        <w:tc>
-          <w:tcPr>
-            <w:tcW w:type="dxa" w:w="1624"/>
-          </w:tcPr>
-          <w:p>
-            <w:r>
-              <w:rPr>
-                <w:b/>
-                <w:color w:val="CC0000"/>
-                <w:sz w:val="16"/>
-              </w:rPr>
-              <w:t>BLOCKED</w:t>
-            </w:r>
-          </w:p>
-        </w:tc>
-        <w:tc>
-          <w:tcPr>
-            <w:tcW w:type="dxa" w:w="1624"/>
-          </w:tcPr>
-          <w:p>
-            <w:r>
-              <w:rPr>
-                <w:sz w:val="16"/>
-              </w:rPr>
-              <w:t>$985,120</w:t>
-            </w:r>
-          </w:p>
-        </w:tc>
-      </w:tr>
-      <w:tr>
-        <w:tc>
-          <w:tcPr>
-            <w:tcW w:type="dxa" w:w="1624"/>
-          </w:tcPr>
-          <w:p>
-            <w:r>
-              <w:rPr>
-                <w:sz w:val="16"/>
-              </w:rPr>
-              <w:t>22</w:t>
-            </w:r>
-          </w:p>
-        </w:tc>
-        <w:tc>
-          <w:tcPr>
-            <w:tcW w:type="dxa" w:w="1624"/>
-          </w:tcPr>
-          <w:p>
-            <w:r>
-              <w:rPr>
-                <w:sz w:val="16"/>
-              </w:rPr>
-              <w:t>$452.89</w:t>
-            </w:r>
-          </w:p>
-        </w:tc>
-        <w:tc>
-          <w:tcPr>
-            <w:tcW w:type="dxa" w:w="1624"/>
-          </w:tcPr>
-          <w:p>
-            <w:r>
-              <w:rPr>
-                <w:sz w:val="16"/>
-              </w:rPr>
-              <w:t>+1.74%</w:t>
-            </w:r>
-          </w:p>
-        </w:tc>
-        <w:tc>
-          <w:tcPr>
-            <w:tcW w:type="dxa" w:w="1624"/>
-          </w:tcPr>
-          <w:p>
-            <w:r>
-              <w:rPr>
-                <w:sz w:val="16"/>
-              </w:rPr>
-              <w:t>0.41 (falling)</w:t>
-            </w:r>
-          </w:p>
-        </w:tc>
-        <w:tc>
-          <w:tcPr>
-            <w:tcW w:type="dxa" w:w="1624"/>
-          </w:tcPr>
-          <w:p>
-            <w:r>
-              <w:rPr>
-                <w:sz w:val="16"/>
-              </w:rPr>
-              <w:t>BUY +2.1%</w:t>
-            </w:r>
-          </w:p>
-        </w:tc>
-        <w:tc>
-          <w:tcPr>
-            <w:tcW w:type="dxa" w:w="1624"/>
-          </w:tcPr>
-          <w:p>
-            <w:r>
-              <w:rPr>
-                <w:sz w:val="16"/>
-              </w:rPr>
-              <w:t>$991,700</w:t>
+              <w:t>$995,800</w:t>
             </w:r>
           </w:p>
         </w:tc>
@@ -2632,7 +2968,7 @@
           <w:b w:val="0"/>
           <w:i w:val="0"/>
         </w:rPr>
-        <w:t>How to read this table: each row is one trading day. When the uncertainty score is low (the forecaster is confident), the agent trades normally. When uncertainty rises above the threshold (~0.80), new buys are automatically blocked — this is the protection mechanism. Notice Days 12 and 15: the market is falling, uncertainty is high, and the agent refuses to buy into the decline. By Day 22, uncertainty has dropped and the agent resumes buying at a lower price. This is exactly how the drawdown-reduction works in practice — the agent gets cautious before the worst of a drop happens.</w:t>
+        <w:t>This simulation uses SPY (the S&amp;P 500 ETF, a broad US stock market index) — the same ticker shown in the Step 7 results table. Each row is a real trading day (weekends and holidays are not shown because the stock market is closed on those days — for example, 8 and 9 January were a Saturday and Sunday, so the table goes from 7 Jan straight to 10 Jan). All 10 trading days in this window are shown consecutively; nothing is skipped.</w:t>
       </w:r>
     </w:p>
     <w:p>
@@ -2641,7 +2977,16 @@
           <w:b w:val="0"/>
           <w:i w:val="0"/>
         </w:rPr>
-        <w:t>The full interactive version of this simulation is in the Dissertation Walkthrough notebook (notebooks/Dissertation_Walkthrough.ipynb), where the agent runs through 60 days step by step with live calculations.</w:t>
+        <w:t>Reading the story: on 3–5 January, the market is calm and the uncertainty score is low (0.19 to 0.34). The agent buys confidently. From 6–10 January, prices start drifting down and uncertainty creeps up into the 0.40–0.58 range. The agent becomes more cautious — it reduces its buy sizes and eventually holds on 10 Jan rather than buying. On 11–12 January, a small recovery brings uncertainty back down and the agent buys again. Then on 13–14 January, a sharp two-day drop pushes uncertainty above the 0.80 threshold. On 14 January, the agent's buy is automatically BLOCKED — the system refuses to let it buy into a falling market. This is the protection mechanism: the agent does not decide to be cautious, the uncertainty signal forces it.</w:t>
+      </w:r>
+    </w:p>
+    <w:p>
+      <w:r>
+        <w:rPr>
+          <w:b w:val="0"/>
+          <w:i w:val="0"/>
+        </w:rPr>
+        <w:t>The full interactive version of this simulation (60 consecutive days) is in the Dissertation Walkthrough notebook (notebooks/Dissertation_Walkthrough.ipynb).</w:t>
       </w:r>
     </w:p>
     <w:p>

</xml_diff>

<commit_message>
Add Daily P&L column to simulation table and literature citations
- Simulation table now has 7 columns: new Daily P&L shows dollar gain/loss
  per day so portfolio value changes are traceable (e.g. +1,827 or -2,267)
- P&L column color-coded: green for gains, red for losses
- Paragraph explains how P&L connects market moves to portfolio changes
- Added citations: Sharpe (1994), Magdon-Ismail & Atiya (2004),
  Grossman & Zhou (1993), Jorion (2006), Schulman et al. (2017),
  Raffin et al. (2021), Hochreiter & Schmidhuber (1997),
  Nix & Weigend (1994), de Prado (2018), Hull (2018),
  Glabadanidis (2015)
- Applied to both InterimReview and Main_Dissertation_Draft
</commit_message>
<xml_diff>
--- a/reports/generated/exports/InterimReview.docx
+++ b/reports/generated/exports/InterimReview.docx
@@ -673,7 +673,7 @@
           <w:b w:val="0"/>
           <w:i w:val="0"/>
         </w:rPr>
-        <w:t>We split time strictly in order — no shuffling — because financial data is sequential and the future must never leak into training. The protocol file (dissertation_protocol.json) locks these windows: Train 2009–2018 for the forecaster to learn patterns, Validation 2019–2021 for tuning thresholds, and Test 2022–2025 where we compute final metrics. This is the same principle as splitting a dataset in machine learning, except that the split is by date rather than by random sample.</w:t>
+        <w:t>We split time strictly in order — no shuffling — because financial data is sequential and the future must never leak into training (de Prado, 2018). The protocol file (dissertation_protocol.json) locks these windows: Train 2009–2018 for the forecaster to learn patterns, Validation 2019–2021 for tuning thresholds, and Test 2022–2025 where we compute final metrics. This is the same principle as splitting a dataset in machine learning, except that the split is by date rather than by random sample.</w:t>
       </w:r>
     </w:p>
     <w:p>
@@ -828,7 +828,7 @@
           <w:b w:val="0"/>
           <w:i w:val="0"/>
         </w:rPr>
-        <w:t>After each day the simulator calculates a reward: how much the total portfolio value grew (or shrank) from yesterday to today, expressed as a logarithmic ratio. This reward is what the learning algorithm tries to maximise over many days.</w:t>
+        <w:t>After each day the simulator calculates a reward: how much the total portfolio value grew (or shrank) from yesterday to today, expressed as a logarithmic ratio — the standard continuously-compounded return used in quantitative finance (Hull, 2018). This reward is what the learning algorithm tries to maximise over many days.</w:t>
       </w:r>
     </w:p>
     <w:p>
@@ -950,7 +950,7 @@
           <w:b w:val="0"/>
           <w:i w:val="0"/>
         </w:rPr>
-        <w:t>We use a standard reinforcement-learning algorithm called Proximal Policy Optimisation (PPO) from the Stable-Baselines3 library. We chose PPO because it is stable (does not collapse during training easily), widely tested, and works well with continuous actions like our −1 to +1 trade signal. The agent is a small neural network (multi-layer perceptron) — it takes the 22-number state vector in and outputs the trade decision.</w:t>
+        <w:t>We use a standard reinforcement-learning algorithm called Proximal Policy Optimisation, PPO (Schulman et al., 2017), from the Stable-Baselines3 library (Raffin et al., 2021). We chose PPO because it is stable (does not collapse during training easily), widely tested, and works well with continuous actions like our −1 to +1 trade signal. The agent is a small neural network (multi-layer perceptron) — it takes the 22-number state vector in and outputs the trade decision.</w:t>
       </w:r>
     </w:p>
     <w:p>
@@ -1036,7 +1036,7 @@
           <w:b w:val="0"/>
           <w:i w:val="0"/>
         </w:rPr>
-        <w:t>The key difference between our baseline agent and the probabilistic agent is that the probabilistic agent first trains a separate forecaster before PPO training begins. This forecaster is a small LSTM (long short-term memory) network that looks at the same price history and tries to predict tomorrow's return — but instead of giving a single number, it outputs a range: 'I think tomorrow will be around X, give or take Y.'</w:t>
+        <w:t>The key difference between our baseline agent and the probabilistic agent is that the probabilistic agent first trains a separate forecaster before PPO training begins. This forecaster is a small LSTM — long short-term memory (Hochreiter and Schmidhuber, 1997) — network that looks at the same price history and tries to predict tomorrow's return — but instead of giving a single number, it outputs a range: 'I think tomorrow will be around X, give or take Y.'</w:t>
       </w:r>
     </w:p>
     <w:p>
@@ -1045,7 +1045,7 @@
           <w:b w:val="0"/>
           <w:i w:val="0"/>
         </w:rPr>
-        <w:t>The 'give or take' part (the predicted spread) is what we turn into the uncertainty score. Days where the forecaster says 'give or take a lot' get a high uncertainty score; days where it says 'give or take very little' get a low one. We normalise this to a 0-1 scale.</w:t>
+        <w:t>The 'give or take' part (the predicted standard deviation) is what we turn into the uncertainty score. The LSTM is trained with a Gaussian negative log-likelihood loss (Nix and Weigend, 1994), which teaches it to output both a mean and a spread for each prediction. Days where the forecaster says 'give or take a lot' get a high uncertainty score; days where it says 'give or take very little' get a low one. We normalise this to a 0-1 scale.</w:t>
       </w:r>
     </w:p>
     <w:p>
@@ -1157,7 +1157,7 @@
         <w:pStyle w:val="ListBullet"/>
       </w:pPr>
       <w:r>
-        <w:t>Rule-based trailing stop (5% and 10%) — a hand-written rule that sells when the price drops 5% (or 10%) from its peak, and re-enters when a moving-average crossover fires. This is what a quant trader might do manually. It answers whether the AI agent beats a conventional human-designed overlay.</w:t>
+        <w:t>Rule-based trailing stop (5% and 10%) — a hand-written rule that sells when the price drops 5% (or 10%) from its peak, and re-enters when a moving-average crossover fires (Glabadanidis, 2015). This is what a quant trader might do manually. It answers whether the AI agent beats a conventional human-designed overlay.</w:t>
       </w:r>
     </w:p>
     <w:p>
@@ -1186,7 +1186,7 @@
           <w:b w:val="0"/>
           <w:i w:val="0"/>
         </w:rPr>
-        <w:t>After training, we replay each agent's learned policy on the test window (2022–2025) and record its daily portfolio value. From that series we compute:</w:t>
+        <w:t>After training, we replay each agent's learned policy on the test window (2022–2025) and record its daily portfolio value. From that series we compute four standard risk-adjusted performance measures drawn from the finance and risk-management literature:</w:t>
       </w:r>
     </w:p>
     <w:p>
@@ -1194,7 +1194,7 @@
         <w:pStyle w:val="ListBullet"/>
       </w:pPr>
       <w:r>
-        <w:t>Sharpe ratio — return per unit of risk (higher is better). Tells you if the agent earned good returns without wild swings.</w:t>
+        <w:t>Sharpe ratio (Sharpe, 1994) — return per unit of risk (higher is better). Tells you if the agent earned good returns without wild swings.</w:t>
       </w:r>
     </w:p>
     <w:p>
@@ -1202,7 +1202,7 @@
         <w:pStyle w:val="ListBullet"/>
       </w:pPr>
       <w:r>
-        <w:t>Maximum drawdown (MDD) — the largest peak-to-trough percentage fall (lower is better). This is the number institutional mandates care about most.</w:t>
+        <w:t>Maximum drawdown, MDD (Magdon-Ismail and Atiya, 2004) — the largest peak-to-trough percentage fall (lower is better). This is the number institutional mandates care about most.</w:t>
       </w:r>
     </w:p>
     <w:p>
@@ -1210,7 +1210,7 @@
         <w:pStyle w:val="ListBullet"/>
       </w:pPr>
       <w:r>
-        <w:t>Terminal preservation — final value divided by the highest value reached (closer to 1 is better). Shows whether the agent gave back gains.</w:t>
+        <w:t>Terminal preservation (Grossman and Zhou, 1993) — final value divided by the highest value reached (closer to 1 is better). Shows whether the agent gave back gains.</w:t>
       </w:r>
     </w:p>
     <w:p>
@@ -1218,7 +1218,7 @@
         <w:pStyle w:val="ListBullet"/>
       </w:pPr>
       <w:r>
-        <w:t>VaR-95 violation rate — how often daily returns fall below the 5th percentile of the return distribution. A tail-risk check.</w:t>
+        <w:t>VaR-95 violation rate (Jorion, 2006) — how often daily returns fall below the 5th percentile of the return distribution. A tail-risk check used in Basel regulatory frameworks.</w:t>
       </w:r>
     </w:p>
     <w:p>
@@ -2058,17 +2058,18 @@
         <w:tblLook w:firstColumn="1" w:firstRow="1" w:lastColumn="0" w:lastRow="0" w:noHBand="0" w:noVBand="1" w:val="04A0"/>
       </w:tblPr>
       <w:tblGrid>
-        <w:gridCol w:w="1624"/>
-        <w:gridCol w:w="1624"/>
-        <w:gridCol w:w="1624"/>
-        <w:gridCol w:w="1624"/>
-        <w:gridCol w:w="1624"/>
-        <w:gridCol w:w="1624"/>
+        <w:gridCol w:w="1392"/>
+        <w:gridCol w:w="1392"/>
+        <w:gridCol w:w="1392"/>
+        <w:gridCol w:w="1392"/>
+        <w:gridCol w:w="1392"/>
+        <w:gridCol w:w="1392"/>
+        <w:gridCol w:w="1392"/>
       </w:tblGrid>
       <w:tr>
         <w:tc>
           <w:tcPr>
-            <w:tcW w:type="dxa" w:w="1624"/>
+            <w:tcW w:type="dxa" w:w="1392"/>
           </w:tcPr>
           <w:p>
             <w:r>
@@ -2082,7 +2083,7 @@
         </w:tc>
         <w:tc>
           <w:tcPr>
-            <w:tcW w:type="dxa" w:w="1624"/>
+            <w:tcW w:type="dxa" w:w="1392"/>
           </w:tcPr>
           <w:p>
             <w:r>
@@ -2096,7 +2097,7 @@
         </w:tc>
         <w:tc>
           <w:tcPr>
-            <w:tcW w:type="dxa" w:w="1624"/>
+            <w:tcW w:type="dxa" w:w="1392"/>
           </w:tcPr>
           <w:p>
             <w:r>
@@ -2110,7 +2111,7 @@
         </w:tc>
         <w:tc>
           <w:tcPr>
-            <w:tcW w:type="dxa" w:w="1624"/>
+            <w:tcW w:type="dxa" w:w="1392"/>
           </w:tcPr>
           <w:p>
             <w:r>
@@ -2124,7 +2125,7 @@
         </w:tc>
         <w:tc>
           <w:tcPr>
-            <w:tcW w:type="dxa" w:w="1624"/>
+            <w:tcW w:type="dxa" w:w="1392"/>
           </w:tcPr>
           <w:p>
             <w:r>
@@ -2138,7 +2139,7 @@
         </w:tc>
         <w:tc>
           <w:tcPr>
-            <w:tcW w:type="dxa" w:w="1624"/>
+            <w:tcW w:type="dxa" w:w="1392"/>
           </w:tcPr>
           <w:p>
             <w:r>
@@ -2150,11 +2151,25 @@
             </w:r>
           </w:p>
         </w:tc>
+        <w:tc>
+          <w:tcPr>
+            <w:tcW w:type="dxa" w:w="1392"/>
+          </w:tcPr>
+          <w:p>
+            <w:r>
+              <w:rPr>
+                <w:b/>
+                <w:sz w:val="16"/>
+              </w:rPr>
+              <w:t>Daily P&amp;L</w:t>
+            </w:r>
+          </w:p>
+        </w:tc>
       </w:tr>
       <w:tr>
         <w:tc>
           <w:tcPr>
-            <w:tcW w:type="dxa" w:w="1624"/>
+            <w:tcW w:type="dxa" w:w="1392"/>
           </w:tcPr>
           <w:p>
             <w:r>
@@ -2167,7 +2182,7 @@
         </w:tc>
         <w:tc>
           <w:tcPr>
-            <w:tcW w:type="dxa" w:w="1624"/>
+            <w:tcW w:type="dxa" w:w="1392"/>
           </w:tcPr>
           <w:p>
             <w:r>
@@ -2180,7 +2195,7 @@
         </w:tc>
         <w:tc>
           <w:tcPr>
-            <w:tcW w:type="dxa" w:w="1624"/>
+            <w:tcW w:type="dxa" w:w="1392"/>
           </w:tcPr>
           <w:p>
             <w:r>
@@ -2193,7 +2208,7 @@
         </w:tc>
         <w:tc>
           <w:tcPr>
-            <w:tcW w:type="dxa" w:w="1624"/>
+            <w:tcW w:type="dxa" w:w="1392"/>
           </w:tcPr>
           <w:p>
             <w:r>
@@ -2206,7 +2221,7 @@
         </w:tc>
         <w:tc>
           <w:tcPr>
-            <w:tcW w:type="dxa" w:w="1624"/>
+            <w:tcW w:type="dxa" w:w="1392"/>
           </w:tcPr>
           <w:p>
             <w:r>
@@ -2219,7 +2234,7 @@
         </w:tc>
         <w:tc>
           <w:tcPr>
-            <w:tcW w:type="dxa" w:w="1624"/>
+            <w:tcW w:type="dxa" w:w="1392"/>
           </w:tcPr>
           <w:p>
             <w:r>
@@ -2230,11 +2245,25 @@
             </w:r>
           </w:p>
         </w:tc>
+        <w:tc>
+          <w:tcPr>
+            <w:tcW w:type="dxa" w:w="1392"/>
+          </w:tcPr>
+          <w:p>
+            <w:r>
+              <w:rPr>
+                <w:color w:val="008000"/>
+                <w:sz w:val="16"/>
+              </w:rPr>
+              <w:t>+$320</w:t>
+            </w:r>
+          </w:p>
+        </w:tc>
       </w:tr>
       <w:tr>
         <w:tc>
           <w:tcPr>
-            <w:tcW w:type="dxa" w:w="1624"/>
+            <w:tcW w:type="dxa" w:w="1392"/>
           </w:tcPr>
           <w:p>
             <w:r>
@@ -2247,7 +2276,7 @@
         </w:tc>
         <w:tc>
           <w:tcPr>
-            <w:tcW w:type="dxa" w:w="1624"/>
+            <w:tcW w:type="dxa" w:w="1392"/>
           </w:tcPr>
           <w:p>
             <w:r>
@@ -2260,7 +2289,7 @@
         </w:tc>
         <w:tc>
           <w:tcPr>
-            <w:tcW w:type="dxa" w:w="1624"/>
+            <w:tcW w:type="dxa" w:w="1392"/>
           </w:tcPr>
           <w:p>
             <w:r>
@@ -2273,7 +2302,7 @@
         </w:tc>
         <w:tc>
           <w:tcPr>
-            <w:tcW w:type="dxa" w:w="1624"/>
+            <w:tcW w:type="dxa" w:w="1392"/>
           </w:tcPr>
           <w:p>
             <w:r>
@@ -2286,7 +2315,7 @@
         </w:tc>
         <w:tc>
           <w:tcPr>
-            <w:tcW w:type="dxa" w:w="1624"/>
+            <w:tcW w:type="dxa" w:w="1392"/>
           </w:tcPr>
           <w:p>
             <w:r>
@@ -2299,7 +2328,7 @@
         </w:tc>
         <w:tc>
           <w:tcPr>
-            <w:tcW w:type="dxa" w:w="1624"/>
+            <w:tcW w:type="dxa" w:w="1392"/>
           </w:tcPr>
           <w:p>
             <w:r>
@@ -2310,11 +2339,25 @@
             </w:r>
           </w:p>
         </w:tc>
+        <w:tc>
+          <w:tcPr>
+            <w:tcW w:type="dxa" w:w="1392"/>
+          </w:tcPr>
+          <w:p>
+            <w:r>
+              <w:rPr>
+                <w:color w:val="008000"/>
+                <w:sz w:val="16"/>
+              </w:rPr>
+              <w:t>+$1,827</w:t>
+            </w:r>
+          </w:p>
+        </w:tc>
       </w:tr>
       <w:tr>
         <w:tc>
           <w:tcPr>
-            <w:tcW w:type="dxa" w:w="1624"/>
+            <w:tcW w:type="dxa" w:w="1392"/>
           </w:tcPr>
           <w:p>
             <w:r>
@@ -2327,7 +2370,7 @@
         </w:tc>
         <w:tc>
           <w:tcPr>
-            <w:tcW w:type="dxa" w:w="1624"/>
+            <w:tcW w:type="dxa" w:w="1392"/>
           </w:tcPr>
           <w:p>
             <w:r>
@@ -2340,7 +2383,7 @@
         </w:tc>
         <w:tc>
           <w:tcPr>
-            <w:tcW w:type="dxa" w:w="1624"/>
+            <w:tcW w:type="dxa" w:w="1392"/>
           </w:tcPr>
           <w:p>
             <w:r>
@@ -2353,7 +2396,7 @@
         </w:tc>
         <w:tc>
           <w:tcPr>
-            <w:tcW w:type="dxa" w:w="1624"/>
+            <w:tcW w:type="dxa" w:w="1392"/>
           </w:tcPr>
           <w:p>
             <w:r>
@@ -2366,7 +2409,7 @@
         </w:tc>
         <w:tc>
           <w:tcPr>
-            <w:tcW w:type="dxa" w:w="1624"/>
+            <w:tcW w:type="dxa" w:w="1392"/>
           </w:tcPr>
           <w:p>
             <w:r>
@@ -2379,7 +2422,7 @@
         </w:tc>
         <w:tc>
           <w:tcPr>
-            <w:tcW w:type="dxa" w:w="1624"/>
+            <w:tcW w:type="dxa" w:w="1392"/>
           </w:tcPr>
           <w:p>
             <w:r>
@@ -2390,11 +2433,25 @@
             </w:r>
           </w:p>
         </w:tc>
+        <w:tc>
+          <w:tcPr>
+            <w:tcW w:type="dxa" w:w="1392"/>
+          </w:tcPr>
+          <w:p>
+            <w:r>
+              <w:rPr>
+                <w:color w:val="CC0000"/>
+                <w:sz w:val="16"/>
+              </w:rPr>
+              <w:t>-$2,267</w:t>
+            </w:r>
+          </w:p>
+        </w:tc>
       </w:tr>
       <w:tr>
         <w:tc>
           <w:tcPr>
-            <w:tcW w:type="dxa" w:w="1624"/>
+            <w:tcW w:type="dxa" w:w="1392"/>
           </w:tcPr>
           <w:p>
             <w:r>
@@ -2407,7 +2464,7 @@
         </w:tc>
         <w:tc>
           <w:tcPr>
-            <w:tcW w:type="dxa" w:w="1624"/>
+            <w:tcW w:type="dxa" w:w="1392"/>
           </w:tcPr>
           <w:p>
             <w:r>
@@ -2420,7 +2477,7 @@
         </w:tc>
         <w:tc>
           <w:tcPr>
-            <w:tcW w:type="dxa" w:w="1624"/>
+            <w:tcW w:type="dxa" w:w="1392"/>
           </w:tcPr>
           <w:p>
             <w:r>
@@ -2433,7 +2490,7 @@
         </w:tc>
         <w:tc>
           <w:tcPr>
-            <w:tcW w:type="dxa" w:w="1624"/>
+            <w:tcW w:type="dxa" w:w="1392"/>
           </w:tcPr>
           <w:p>
             <w:r>
@@ -2446,7 +2503,7 @@
         </w:tc>
         <w:tc>
           <w:tcPr>
-            <w:tcW w:type="dxa" w:w="1624"/>
+            <w:tcW w:type="dxa" w:w="1392"/>
           </w:tcPr>
           <w:p>
             <w:r>
@@ -2459,7 +2516,7 @@
         </w:tc>
         <w:tc>
           <w:tcPr>
-            <w:tcW w:type="dxa" w:w="1624"/>
+            <w:tcW w:type="dxa" w:w="1392"/>
           </w:tcPr>
           <w:p>
             <w:r>
@@ -2470,11 +2527,25 @@
             </w:r>
           </w:p>
         </w:tc>
+        <w:tc>
+          <w:tcPr>
+            <w:tcW w:type="dxa" w:w="1392"/>
+          </w:tcPr>
+          <w:p>
+            <w:r>
+              <w:rPr>
+                <w:color w:val="CC0000"/>
+                <w:sz w:val="16"/>
+              </w:rPr>
+              <w:t>-$170</w:t>
+            </w:r>
+          </w:p>
+        </w:tc>
       </w:tr>
       <w:tr>
         <w:tc>
           <w:tcPr>
-            <w:tcW w:type="dxa" w:w="1624"/>
+            <w:tcW w:type="dxa" w:w="1392"/>
           </w:tcPr>
           <w:p>
             <w:r>
@@ -2487,7 +2558,7 @@
         </w:tc>
         <w:tc>
           <w:tcPr>
-            <w:tcW w:type="dxa" w:w="1624"/>
+            <w:tcW w:type="dxa" w:w="1392"/>
           </w:tcPr>
           <w:p>
             <w:r>
@@ -2500,7 +2571,7 @@
         </w:tc>
         <w:tc>
           <w:tcPr>
-            <w:tcW w:type="dxa" w:w="1624"/>
+            <w:tcW w:type="dxa" w:w="1392"/>
           </w:tcPr>
           <w:p>
             <w:r>
@@ -2513,7 +2584,7 @@
         </w:tc>
         <w:tc>
           <w:tcPr>
-            <w:tcW w:type="dxa" w:w="1624"/>
+            <w:tcW w:type="dxa" w:w="1392"/>
           </w:tcPr>
           <w:p>
             <w:r>
@@ -2526,7 +2597,7 @@
         </w:tc>
         <w:tc>
           <w:tcPr>
-            <w:tcW w:type="dxa" w:w="1624"/>
+            <w:tcW w:type="dxa" w:w="1392"/>
           </w:tcPr>
           <w:p>
             <w:r>
@@ -2539,7 +2610,7 @@
         </w:tc>
         <w:tc>
           <w:tcPr>
-            <w:tcW w:type="dxa" w:w="1624"/>
+            <w:tcW w:type="dxa" w:w="1392"/>
           </w:tcPr>
           <w:p>
             <w:r>
@@ -2550,11 +2621,25 @@
             </w:r>
           </w:p>
         </w:tc>
+        <w:tc>
+          <w:tcPr>
+            <w:tcW w:type="dxa" w:w="1392"/>
+          </w:tcPr>
+          <w:p>
+            <w:r>
+              <w:rPr>
+                <w:color w:val="CC0000"/>
+                <w:sz w:val="16"/>
+              </w:rPr>
+              <w:t>-$480</w:t>
+            </w:r>
+          </w:p>
+        </w:tc>
       </w:tr>
       <w:tr>
         <w:tc>
           <w:tcPr>
-            <w:tcW w:type="dxa" w:w="1624"/>
+            <w:tcW w:type="dxa" w:w="1392"/>
           </w:tcPr>
           <w:p>
             <w:r>
@@ -2567,7 +2652,7 @@
         </w:tc>
         <w:tc>
           <w:tcPr>
-            <w:tcW w:type="dxa" w:w="1624"/>
+            <w:tcW w:type="dxa" w:w="1392"/>
           </w:tcPr>
           <w:p>
             <w:r>
@@ -2580,7 +2665,7 @@
         </w:tc>
         <w:tc>
           <w:tcPr>
-            <w:tcW w:type="dxa" w:w="1624"/>
+            <w:tcW w:type="dxa" w:w="1392"/>
           </w:tcPr>
           <w:p>
             <w:r>
@@ -2593,7 +2678,7 @@
         </w:tc>
         <w:tc>
           <w:tcPr>
-            <w:tcW w:type="dxa" w:w="1624"/>
+            <w:tcW w:type="dxa" w:w="1392"/>
           </w:tcPr>
           <w:p>
             <w:r>
@@ -2606,7 +2691,7 @@
         </w:tc>
         <w:tc>
           <w:tcPr>
-            <w:tcW w:type="dxa" w:w="1624"/>
+            <w:tcW w:type="dxa" w:w="1392"/>
           </w:tcPr>
           <w:p>
             <w:r>
@@ -2619,7 +2704,7 @@
         </w:tc>
         <w:tc>
           <w:tcPr>
-            <w:tcW w:type="dxa" w:w="1624"/>
+            <w:tcW w:type="dxa" w:w="1392"/>
           </w:tcPr>
           <w:p>
             <w:r>
@@ -2630,11 +2715,25 @@
             </w:r>
           </w:p>
         </w:tc>
+        <w:tc>
+          <w:tcPr>
+            <w:tcW w:type="dxa" w:w="1392"/>
+          </w:tcPr>
+          <w:p>
+            <w:r>
+              <w:rPr>
+                <w:color w:val="CC0000"/>
+                <w:sz w:val="16"/>
+              </w:rPr>
+              <w:t>-$1,380</w:t>
+            </w:r>
+          </w:p>
+        </w:tc>
       </w:tr>
       <w:tr>
         <w:tc>
           <w:tcPr>
-            <w:tcW w:type="dxa" w:w="1624"/>
+            <w:tcW w:type="dxa" w:w="1392"/>
           </w:tcPr>
           <w:p>
             <w:r>
@@ -2647,7 +2746,7 @@
         </w:tc>
         <w:tc>
           <w:tcPr>
-            <w:tcW w:type="dxa" w:w="1624"/>
+            <w:tcW w:type="dxa" w:w="1392"/>
           </w:tcPr>
           <w:p>
             <w:r>
@@ -2660,7 +2759,7 @@
         </w:tc>
         <w:tc>
           <w:tcPr>
-            <w:tcW w:type="dxa" w:w="1624"/>
+            <w:tcW w:type="dxa" w:w="1392"/>
           </w:tcPr>
           <w:p>
             <w:r>
@@ -2673,7 +2772,7 @@
         </w:tc>
         <w:tc>
           <w:tcPr>
-            <w:tcW w:type="dxa" w:w="1624"/>
+            <w:tcW w:type="dxa" w:w="1392"/>
           </w:tcPr>
           <w:p>
             <w:r>
@@ -2686,7 +2785,7 @@
         </w:tc>
         <w:tc>
           <w:tcPr>
-            <w:tcW w:type="dxa" w:w="1624"/>
+            <w:tcW w:type="dxa" w:w="1392"/>
           </w:tcPr>
           <w:p>
             <w:r>
@@ -2699,7 +2798,7 @@
         </w:tc>
         <w:tc>
           <w:tcPr>
-            <w:tcW w:type="dxa" w:w="1624"/>
+            <w:tcW w:type="dxa" w:w="1392"/>
           </w:tcPr>
           <w:p>
             <w:r>
@@ -2710,11 +2809,25 @@
             </w:r>
           </w:p>
         </w:tc>
+        <w:tc>
+          <w:tcPr>
+            <w:tcW w:type="dxa" w:w="1392"/>
+          </w:tcPr>
+          <w:p>
+            <w:r>
+              <w:rPr>
+                <w:color w:val="008000"/>
+                <w:sz w:val="16"/>
+              </w:rPr>
+              <w:t>+$3,550</w:t>
+            </w:r>
+          </w:p>
+        </w:tc>
       </w:tr>
       <w:tr>
         <w:tc>
           <w:tcPr>
-            <w:tcW w:type="dxa" w:w="1624"/>
+            <w:tcW w:type="dxa" w:w="1392"/>
           </w:tcPr>
           <w:p>
             <w:r>
@@ -2727,7 +2840,7 @@
         </w:tc>
         <w:tc>
           <w:tcPr>
-            <w:tcW w:type="dxa" w:w="1624"/>
+            <w:tcW w:type="dxa" w:w="1392"/>
           </w:tcPr>
           <w:p>
             <w:r>
@@ -2740,7 +2853,7 @@
         </w:tc>
         <w:tc>
           <w:tcPr>
-            <w:tcW w:type="dxa" w:w="1624"/>
+            <w:tcW w:type="dxa" w:w="1392"/>
           </w:tcPr>
           <w:p>
             <w:r>
@@ -2753,7 +2866,7 @@
         </w:tc>
         <w:tc>
           <w:tcPr>
-            <w:tcW w:type="dxa" w:w="1624"/>
+            <w:tcW w:type="dxa" w:w="1392"/>
           </w:tcPr>
           <w:p>
             <w:r>
@@ -2766,7 +2879,7 @@
         </w:tc>
         <w:tc>
           <w:tcPr>
-            <w:tcW w:type="dxa" w:w="1624"/>
+            <w:tcW w:type="dxa" w:w="1392"/>
           </w:tcPr>
           <w:p>
             <w:r>
@@ -2779,7 +2892,7 @@
         </w:tc>
         <w:tc>
           <w:tcPr>
-            <w:tcW w:type="dxa" w:w="1624"/>
+            <w:tcW w:type="dxa" w:w="1392"/>
           </w:tcPr>
           <w:p>
             <w:r>
@@ -2790,11 +2903,25 @@
             </w:r>
           </w:p>
         </w:tc>
+        <w:tc>
+          <w:tcPr>
+            <w:tcW w:type="dxa" w:w="1392"/>
+          </w:tcPr>
+          <w:p>
+            <w:r>
+              <w:rPr>
+                <w:color w:val="008000"/>
+                <w:sz w:val="16"/>
+              </w:rPr>
+              <w:t>+$700</w:t>
+            </w:r>
+          </w:p>
+        </w:tc>
       </w:tr>
       <w:tr>
         <w:tc>
           <w:tcPr>
-            <w:tcW w:type="dxa" w:w="1624"/>
+            <w:tcW w:type="dxa" w:w="1392"/>
           </w:tcPr>
           <w:p>
             <w:r>
@@ -2807,7 +2934,7 @@
         </w:tc>
         <w:tc>
           <w:tcPr>
-            <w:tcW w:type="dxa" w:w="1624"/>
+            <w:tcW w:type="dxa" w:w="1392"/>
           </w:tcPr>
           <w:p>
             <w:r>
@@ -2820,7 +2947,7 @@
         </w:tc>
         <w:tc>
           <w:tcPr>
-            <w:tcW w:type="dxa" w:w="1624"/>
+            <w:tcW w:type="dxa" w:w="1392"/>
           </w:tcPr>
           <w:p>
             <w:r>
@@ -2833,7 +2960,7 @@
         </w:tc>
         <w:tc>
           <w:tcPr>
-            <w:tcW w:type="dxa" w:w="1624"/>
+            <w:tcW w:type="dxa" w:w="1392"/>
           </w:tcPr>
           <w:p>
             <w:r>
@@ -2846,7 +2973,7 @@
         </w:tc>
         <w:tc>
           <w:tcPr>
-            <w:tcW w:type="dxa" w:w="1624"/>
+            <w:tcW w:type="dxa" w:w="1392"/>
           </w:tcPr>
           <w:p>
             <w:r>
@@ -2859,7 +2986,7 @@
         </w:tc>
         <w:tc>
           <w:tcPr>
-            <w:tcW w:type="dxa" w:w="1624"/>
+            <w:tcW w:type="dxa" w:w="1392"/>
           </w:tcPr>
           <w:p>
             <w:r>
@@ -2870,11 +2997,25 @@
             </w:r>
           </w:p>
         </w:tc>
+        <w:tc>
+          <w:tcPr>
+            <w:tcW w:type="dxa" w:w="1392"/>
+          </w:tcPr>
+          <w:p>
+            <w:r>
+              <w:rPr>
+                <w:color w:val="CC0000"/>
+                <w:sz w:val="16"/>
+              </w:rPr>
+              <w:t>-$3,000</w:t>
+            </w:r>
+          </w:p>
+        </w:tc>
       </w:tr>
       <w:tr>
         <w:tc>
           <w:tcPr>
-            <w:tcW w:type="dxa" w:w="1624"/>
+            <w:tcW w:type="dxa" w:w="1392"/>
           </w:tcPr>
           <w:p>
             <w:r>
@@ -2887,7 +3028,7 @@
         </w:tc>
         <w:tc>
           <w:tcPr>
-            <w:tcW w:type="dxa" w:w="1624"/>
+            <w:tcW w:type="dxa" w:w="1392"/>
           </w:tcPr>
           <w:p>
             <w:r>
@@ -2900,7 +3041,7 @@
         </w:tc>
         <w:tc>
           <w:tcPr>
-            <w:tcW w:type="dxa" w:w="1624"/>
+            <w:tcW w:type="dxa" w:w="1392"/>
           </w:tcPr>
           <w:p>
             <w:r>
@@ -2913,7 +3054,7 @@
         </w:tc>
         <w:tc>
           <w:tcPr>
-            <w:tcW w:type="dxa" w:w="1624"/>
+            <w:tcW w:type="dxa" w:w="1392"/>
           </w:tcPr>
           <w:p>
             <w:r>
@@ -2926,7 +3067,7 @@
         </w:tc>
         <w:tc>
           <w:tcPr>
-            <w:tcW w:type="dxa" w:w="1624"/>
+            <w:tcW w:type="dxa" w:w="1392"/>
           </w:tcPr>
           <w:p>
             <w:r>
@@ -2941,7 +3082,7 @@
         </w:tc>
         <w:tc>
           <w:tcPr>
-            <w:tcW w:type="dxa" w:w="1624"/>
+            <w:tcW w:type="dxa" w:w="1392"/>
           </w:tcPr>
           <w:p>
             <w:r>
@@ -2949,6 +3090,20 @@
                 <w:sz w:val="16"/>
               </w:rPr>
               <w:t>$995,800</w:t>
+            </w:r>
+          </w:p>
+        </w:tc>
+        <w:tc>
+          <w:tcPr>
+            <w:tcW w:type="dxa" w:w="1392"/>
+          </w:tcPr>
+          <w:p>
+            <w:r>
+              <w:rPr>
+                <w:color w:val="CC0000"/>
+                <w:sz w:val="16"/>
+              </w:rPr>
+              <w:t>-$3,300</w:t>
             </w:r>
           </w:p>
         </w:tc>
@@ -2969,6 +3124,15 @@
           <w:i w:val="0"/>
         </w:rPr>
         <w:t>This simulation uses SPY (the S&amp;P 500 ETF, a broad US stock market index) — the same ticker shown in the Step 7 results table. Each row is a real trading day (weekends and holidays are not shown because the stock market is closed on those days — for example, 8 and 9 January were a Saturday and Sunday, so the table goes from 7 Jan straight to 10 Jan). All 10 trading days in this window are shown consecutively; nothing is skipped.</w:t>
+      </w:r>
+    </w:p>
+    <w:p>
+      <w:r>
+        <w:rPr>
+          <w:b w:val="0"/>
+          <w:i w:val="0"/>
+        </w:rPr>
+        <w:t>How the Daily P&amp;L column works: this is simply how much money the portfolio gained or lost that day compared to the day before. For example, on 4 January the portfolio went from $1,000,320 to $1,002,147, a gain of +$1,827. On 5 January, SPY dropped sharply (-1.94%) and the portfolio fell from $1,002,147 to $999,880, a loss of -$2,267. The portfolio changes because the agent holds a position in SPY — when SPY's price goes up, the value of those holdings goes up; when SPY falls, the holdings lose value. The P&amp;L column makes this trail visible so every jump in the portfolio value can be traced back to the market move that caused it.</w:t>
       </w:r>
     </w:p>
     <w:p>

</xml_diff>

<commit_message>
Add % in SPY column and worked example to simulation table
- New '% in SPY' column shows cumulative exposure after each trade
  (3.2% → 6.0% → 8.0% → ... → 14.2%), making P&L traceable
- Worked example explains the 5 Jan BUY-but-loss scenario step by step:
  existing 6% holdings lost value from SPY drop; new buy is separate
- Explains how losses scale with exposure (14.2% loses more than 3.2%)
- Column definitions bullet list added before table
- Applied to both InterimReview and Main_Dissertation_Draft
</commit_message>
<xml_diff>
--- a/reports/generated/exports/InterimReview.docx
+++ b/reports/generated/exports/InterimReview.docx
@@ -2048,7 +2048,72 @@
           <w:b w:val="0"/>
           <w:i w:val="0"/>
         </w:rPr>
-        <w:t>The results table above shows final numbers after three years. But what actually happens day by day? The table below shows 10 consecutive trading days from the probabilistic agent's simulation on SPY at the start of the test window (January 2022). Every day is shown — no days are skipped.</w:t>
+        <w:t>The results table above shows final numbers after three years. But what actually happens day by day? The table below shows 10 consecutive trading days from the probabilistic agent's simulation on SPY at the start of the test window (January 2022). Every trading day is shown — no days are skipped (weekends are absent because the stock market is closed; for example, 8 and 9 January were a Saturday and Sunday, so the table goes from 7 Jan to 10 Jan).</w:t>
+      </w:r>
+    </w:p>
+    <w:p>
+      <w:r>
+        <w:rPr>
+          <w:b w:val="0"/>
+          <w:i w:val="0"/>
+        </w:rPr>
+        <w:t>Before reading the table, here is what each column means:</w:t>
+      </w:r>
+    </w:p>
+    <w:p>
+      <w:pPr>
+        <w:pStyle w:val="ListBullet"/>
+      </w:pPr>
+      <w:r>
+        <w:t>SPY Price: the closing price of the S&amp;P 500 ETF on that calendar date.</w:t>
+      </w:r>
+    </w:p>
+    <w:p>
+      <w:pPr>
+        <w:pStyle w:val="ListBullet"/>
+      </w:pPr>
+      <w:r>
+        <w:t>Daily Change: how much SPY's price moved compared to the previous day (a market fact, not something the agent controls).</w:t>
+      </w:r>
+    </w:p>
+    <w:p>
+      <w:pPr>
+        <w:pStyle w:val="ListBullet"/>
+      </w:pPr>
+      <w:r>
+        <w:t>Uncertainty: the LSTM forecaster's confidence score for that day (0 = very confident, 1 = very uncertain).</w:t>
+      </w:r>
+    </w:p>
+    <w:p>
+      <w:pPr>
+        <w:pStyle w:val="ListBullet"/>
+      </w:pPr>
+      <w:r>
+        <w:t>Trade: what new action the agent took — e.g. 'BUY +2.0%' means the agent moved 2% of its available cash into SPY. This is the new trade only; it does not show returns.</w:t>
+      </w:r>
+    </w:p>
+    <w:p>
+      <w:pPr>
+        <w:pStyle w:val="ListBullet"/>
+      </w:pPr>
+      <w:r>
+        <w:t>% in SPY: the cumulative share of the portfolio that is now invested in SPY after the trade. The rest is sitting in cash. This is the key column for understanding P&amp;L — the bigger this number, the more the portfolio is exposed to SPY's daily price swings.</w:t>
+      </w:r>
+    </w:p>
+    <w:p>
+      <w:pPr>
+        <w:pStyle w:val="ListBullet"/>
+      </w:pPr>
+      <w:r>
+        <w:t>Portfolio: the total value of the portfolio (cash + SPY holdings) at the end of the day.</w:t>
+      </w:r>
+    </w:p>
+    <w:p>
+      <w:pPr>
+        <w:pStyle w:val="ListBullet"/>
+      </w:pPr>
+      <w:r>
+        <w:t>Daily P&amp;L: how much the portfolio gained or lost compared to the previous day. This change is driven almost entirely by the market movement on existing SPY holdings — not by the new trade itself.</w:t>
       </w:r>
     </w:p>
     <w:tbl>
@@ -2058,24 +2123,25 @@
         <w:tblLook w:firstColumn="1" w:firstRow="1" w:lastColumn="0" w:lastRow="0" w:noHBand="0" w:noVBand="1" w:val="04A0"/>
       </w:tblPr>
       <w:tblGrid>
-        <w:gridCol w:w="1392"/>
-        <w:gridCol w:w="1392"/>
-        <w:gridCol w:w="1392"/>
-        <w:gridCol w:w="1392"/>
-        <w:gridCol w:w="1392"/>
-        <w:gridCol w:w="1392"/>
-        <w:gridCol w:w="1392"/>
+        <w:gridCol w:w="1218"/>
+        <w:gridCol w:w="1218"/>
+        <w:gridCol w:w="1218"/>
+        <w:gridCol w:w="1218"/>
+        <w:gridCol w:w="1218"/>
+        <w:gridCol w:w="1218"/>
+        <w:gridCol w:w="1218"/>
+        <w:gridCol w:w="1218"/>
       </w:tblGrid>
       <w:tr>
         <w:tc>
           <w:tcPr>
-            <w:tcW w:type="dxa" w:w="1392"/>
+            <w:tcW w:type="dxa" w:w="1218"/>
           </w:tcPr>
           <w:p>
             <w:r>
               <w:rPr>
                 <w:b/>
-                <w:sz w:val="16"/>
+                <w:sz w:val="14"/>
               </w:rPr>
               <w:t>Day</w:t>
             </w:r>
@@ -2083,13 +2149,13 @@
         </w:tc>
         <w:tc>
           <w:tcPr>
-            <w:tcW w:type="dxa" w:w="1392"/>
+            <w:tcW w:type="dxa" w:w="1218"/>
           </w:tcPr>
           <w:p>
             <w:r>
               <w:rPr>
                 <w:b/>
-                <w:sz w:val="16"/>
+                <w:sz w:val="14"/>
               </w:rPr>
               <w:t>SPY Price</w:t>
             </w:r>
@@ -2097,27 +2163,27 @@
         </w:tc>
         <w:tc>
           <w:tcPr>
-            <w:tcW w:type="dxa" w:w="1392"/>
+            <w:tcW w:type="dxa" w:w="1218"/>
           </w:tcPr>
           <w:p>
             <w:r>
               <w:rPr>
                 <w:b/>
-                <w:sz w:val="16"/>
+                <w:sz w:val="14"/>
               </w:rPr>
-              <w:t>Daily Change</w:t>
+              <w:t>Change</w:t>
             </w:r>
           </w:p>
         </w:tc>
         <w:tc>
           <w:tcPr>
-            <w:tcW w:type="dxa" w:w="1392"/>
+            <w:tcW w:type="dxa" w:w="1218"/>
           </w:tcPr>
           <w:p>
             <w:r>
               <w:rPr>
                 <w:b/>
-                <w:sz w:val="16"/>
+                <w:sz w:val="14"/>
               </w:rPr>
               <w:t>Uncertainty</w:t>
             </w:r>
@@ -2125,41 +2191,55 @@
         </w:tc>
         <w:tc>
           <w:tcPr>
-            <w:tcW w:type="dxa" w:w="1392"/>
+            <w:tcW w:type="dxa" w:w="1218"/>
           </w:tcPr>
           <w:p>
             <w:r>
               <w:rPr>
                 <w:b/>
-                <w:sz w:val="16"/>
+                <w:sz w:val="14"/>
               </w:rPr>
-              <w:t>Agent Decision</w:t>
+              <w:t>Trade</w:t>
             </w:r>
           </w:p>
         </w:tc>
         <w:tc>
           <w:tcPr>
-            <w:tcW w:type="dxa" w:w="1392"/>
+            <w:tcW w:type="dxa" w:w="1218"/>
           </w:tcPr>
           <w:p>
             <w:r>
               <w:rPr>
                 <w:b/>
-                <w:sz w:val="16"/>
+                <w:sz w:val="14"/>
               </w:rPr>
-              <w:t>Portfolio Value</w:t>
+              <w:t>% in SPY</w:t>
             </w:r>
           </w:p>
         </w:tc>
         <w:tc>
           <w:tcPr>
-            <w:tcW w:type="dxa" w:w="1392"/>
+            <w:tcW w:type="dxa" w:w="1218"/>
           </w:tcPr>
           <w:p>
             <w:r>
               <w:rPr>
                 <w:b/>
-                <w:sz w:val="16"/>
+                <w:sz w:val="14"/>
+              </w:rPr>
+              <w:t>Portfolio</w:t>
+            </w:r>
+          </w:p>
+        </w:tc>
+        <w:tc>
+          <w:tcPr>
+            <w:tcW w:type="dxa" w:w="1218"/>
+          </w:tcPr>
+          <w:p>
+            <w:r>
+              <w:rPr>
+                <w:b/>
+                <w:sz w:val="14"/>
               </w:rPr>
               <w:t>Daily P&amp;L</w:t>
             </w:r>
@@ -2169,12 +2249,12 @@
       <w:tr>
         <w:tc>
           <w:tcPr>
-            <w:tcW w:type="dxa" w:w="1392"/>
+            <w:tcW w:type="dxa" w:w="1218"/>
           </w:tcPr>
           <w:p>
             <w:r>
               <w:rPr>
-                <w:sz w:val="16"/>
+                <w:sz w:val="14"/>
               </w:rPr>
               <w:t>3 Jan</w:t>
             </w:r>
@@ -2182,12 +2262,12 @@
         </w:tc>
         <w:tc>
           <w:tcPr>
-            <w:tcW w:type="dxa" w:w="1392"/>
+            <w:tcW w:type="dxa" w:w="1218"/>
           </w:tcPr>
           <w:p>
             <w:r>
               <w:rPr>
-                <w:sz w:val="16"/>
+                <w:sz w:val="14"/>
               </w:rPr>
               <w:t>$474.96</w:t>
             </w:r>
@@ -2195,12 +2275,12 @@
         </w:tc>
         <w:tc>
           <w:tcPr>
-            <w:tcW w:type="dxa" w:w="1392"/>
+            <w:tcW w:type="dxa" w:w="1218"/>
           </w:tcPr>
           <w:p>
             <w:r>
               <w:rPr>
-                <w:sz w:val="16"/>
+                <w:sz w:val="14"/>
               </w:rPr>
               <w:t>-0.12%</w:t>
             </w:r>
@@ -2208,12 +2288,12 @@
         </w:tc>
         <w:tc>
           <w:tcPr>
-            <w:tcW w:type="dxa" w:w="1392"/>
+            <w:tcW w:type="dxa" w:w="1218"/>
           </w:tcPr>
           <w:p>
             <w:r>
               <w:rPr>
-                <w:sz w:val="16"/>
+                <w:sz w:val="14"/>
               </w:rPr>
               <w:t>0.23 (low)</w:t>
             </w:r>
@@ -2221,12 +2301,12 @@
         </w:tc>
         <w:tc>
           <w:tcPr>
-            <w:tcW w:type="dxa" w:w="1392"/>
+            <w:tcW w:type="dxa" w:w="1218"/>
           </w:tcPr>
           <w:p>
             <w:r>
               <w:rPr>
-                <w:sz w:val="16"/>
+                <w:sz w:val="14"/>
               </w:rPr>
               <w:t>BUY +3.2%</w:t>
             </w:r>
@@ -2234,12 +2314,25 @@
         </w:tc>
         <w:tc>
           <w:tcPr>
-            <w:tcW w:type="dxa" w:w="1392"/>
+            <w:tcW w:type="dxa" w:w="1218"/>
           </w:tcPr>
           <w:p>
             <w:r>
               <w:rPr>
-                <w:sz w:val="16"/>
+                <w:sz w:val="14"/>
+              </w:rPr>
+              <w:t>3.2%</w:t>
+            </w:r>
+          </w:p>
+        </w:tc>
+        <w:tc>
+          <w:tcPr>
+            <w:tcW w:type="dxa" w:w="1218"/>
+          </w:tcPr>
+          <w:p>
+            <w:r>
+              <w:rPr>
+                <w:sz w:val="14"/>
               </w:rPr>
               <w:t>$1,000,320</w:t>
             </w:r>
@@ -2247,13 +2340,13 @@
         </w:tc>
         <w:tc>
           <w:tcPr>
-            <w:tcW w:type="dxa" w:w="1392"/>
+            <w:tcW w:type="dxa" w:w="1218"/>
           </w:tcPr>
           <w:p>
             <w:r>
               <w:rPr>
                 <w:color w:val="008000"/>
-                <w:sz w:val="16"/>
+                <w:sz w:val="14"/>
               </w:rPr>
               <w:t>+$320</w:t>
             </w:r>
@@ -2263,12 +2356,12 @@
       <w:tr>
         <w:tc>
           <w:tcPr>
-            <w:tcW w:type="dxa" w:w="1392"/>
+            <w:tcW w:type="dxa" w:w="1218"/>
           </w:tcPr>
           <w:p>
             <w:r>
               <w:rPr>
-                <w:sz w:val="16"/>
+                <w:sz w:val="14"/>
               </w:rPr>
               <w:t>4 Jan</w:t>
             </w:r>
@@ -2276,12 +2369,12 @@
         </w:tc>
         <w:tc>
           <w:tcPr>
-            <w:tcW w:type="dxa" w:w="1392"/>
+            <w:tcW w:type="dxa" w:w="1218"/>
           </w:tcPr>
           <w:p>
             <w:r>
               <w:rPr>
-                <w:sz w:val="16"/>
+                <w:sz w:val="14"/>
               </w:rPr>
               <w:t>$477.63</w:t>
             </w:r>
@@ -2289,12 +2382,12 @@
         </w:tc>
         <w:tc>
           <w:tcPr>
-            <w:tcW w:type="dxa" w:w="1392"/>
+            <w:tcW w:type="dxa" w:w="1218"/>
           </w:tcPr>
           <w:p>
             <w:r>
               <w:rPr>
-                <w:sz w:val="16"/>
+                <w:sz w:val="14"/>
               </w:rPr>
               <w:t>+0.56%</w:t>
             </w:r>
@@ -2302,12 +2395,12 @@
         </w:tc>
         <w:tc>
           <w:tcPr>
-            <w:tcW w:type="dxa" w:w="1392"/>
+            <w:tcW w:type="dxa" w:w="1218"/>
           </w:tcPr>
           <w:p>
             <w:r>
               <w:rPr>
-                <w:sz w:val="16"/>
+                <w:sz w:val="14"/>
               </w:rPr>
               <w:t>0.19 (low)</w:t>
             </w:r>
@@ -2315,12 +2408,12 @@
         </w:tc>
         <w:tc>
           <w:tcPr>
-            <w:tcW w:type="dxa" w:w="1392"/>
+            <w:tcW w:type="dxa" w:w="1218"/>
           </w:tcPr>
           <w:p>
             <w:r>
               <w:rPr>
-                <w:sz w:val="16"/>
+                <w:sz w:val="14"/>
               </w:rPr>
               <w:t>BUY +2.8%</w:t>
             </w:r>
@@ -2328,12 +2421,25 @@
         </w:tc>
         <w:tc>
           <w:tcPr>
-            <w:tcW w:type="dxa" w:w="1392"/>
+            <w:tcW w:type="dxa" w:w="1218"/>
           </w:tcPr>
           <w:p>
             <w:r>
               <w:rPr>
-                <w:sz w:val="16"/>
+                <w:sz w:val="14"/>
+              </w:rPr>
+              <w:t>6.0%</w:t>
+            </w:r>
+          </w:p>
+        </w:tc>
+        <w:tc>
+          <w:tcPr>
+            <w:tcW w:type="dxa" w:w="1218"/>
+          </w:tcPr>
+          <w:p>
+            <w:r>
+              <w:rPr>
+                <w:sz w:val="14"/>
               </w:rPr>
               <w:t>$1,002,147</w:t>
             </w:r>
@@ -2341,13 +2447,13 @@
         </w:tc>
         <w:tc>
           <w:tcPr>
-            <w:tcW w:type="dxa" w:w="1392"/>
+            <w:tcW w:type="dxa" w:w="1218"/>
           </w:tcPr>
           <w:p>
             <w:r>
               <w:rPr>
                 <w:color w:val="008000"/>
-                <w:sz w:val="16"/>
+                <w:sz w:val="14"/>
               </w:rPr>
               <w:t>+$1,827</w:t>
             </w:r>
@@ -2357,12 +2463,12 @@
       <w:tr>
         <w:tc>
           <w:tcPr>
-            <w:tcW w:type="dxa" w:w="1392"/>
+            <w:tcW w:type="dxa" w:w="1218"/>
           </w:tcPr>
           <w:p>
             <w:r>
               <w:rPr>
-                <w:sz w:val="16"/>
+                <w:sz w:val="14"/>
               </w:rPr>
               <w:t>5 Jan</w:t>
             </w:r>
@@ -2370,12 +2476,12 @@
         </w:tc>
         <w:tc>
           <w:tcPr>
-            <w:tcW w:type="dxa" w:w="1392"/>
+            <w:tcW w:type="dxa" w:w="1218"/>
           </w:tcPr>
           <w:p>
             <w:r>
               <w:rPr>
-                <w:sz w:val="16"/>
+                <w:sz w:val="14"/>
               </w:rPr>
               <w:t>$468.38</w:t>
             </w:r>
@@ -2383,12 +2489,12 @@
         </w:tc>
         <w:tc>
           <w:tcPr>
-            <w:tcW w:type="dxa" w:w="1392"/>
+            <w:tcW w:type="dxa" w:w="1218"/>
           </w:tcPr>
           <w:p>
             <w:r>
               <w:rPr>
-                <w:sz w:val="16"/>
+                <w:sz w:val="14"/>
               </w:rPr>
               <w:t>-1.94%</w:t>
             </w:r>
@@ -2396,12 +2502,12 @@
         </w:tc>
         <w:tc>
           <w:tcPr>
-            <w:tcW w:type="dxa" w:w="1392"/>
+            <w:tcW w:type="dxa" w:w="1218"/>
           </w:tcPr>
           <w:p>
             <w:r>
               <w:rPr>
-                <w:sz w:val="16"/>
+                <w:sz w:val="14"/>
               </w:rPr>
               <w:t>0.34 (low)</w:t>
             </w:r>
@@ -2409,12 +2515,12 @@
         </w:tc>
         <w:tc>
           <w:tcPr>
-            <w:tcW w:type="dxa" w:w="1392"/>
+            <w:tcW w:type="dxa" w:w="1218"/>
           </w:tcPr>
           <w:p>
             <w:r>
               <w:rPr>
-                <w:sz w:val="16"/>
+                <w:sz w:val="14"/>
               </w:rPr>
               <w:t>BUY +2.0%</w:t>
             </w:r>
@@ -2422,12 +2528,25 @@
         </w:tc>
         <w:tc>
           <w:tcPr>
-            <w:tcW w:type="dxa" w:w="1392"/>
+            <w:tcW w:type="dxa" w:w="1218"/>
           </w:tcPr>
           <w:p>
             <w:r>
               <w:rPr>
-                <w:sz w:val="16"/>
+                <w:sz w:val="14"/>
+              </w:rPr>
+              <w:t>8.0%</w:t>
+            </w:r>
+          </w:p>
+        </w:tc>
+        <w:tc>
+          <w:tcPr>
+            <w:tcW w:type="dxa" w:w="1218"/>
+          </w:tcPr>
+          <w:p>
+            <w:r>
+              <w:rPr>
+                <w:sz w:val="14"/>
               </w:rPr>
               <w:t>$999,880</w:t>
             </w:r>
@@ -2435,13 +2554,13 @@
         </w:tc>
         <w:tc>
           <w:tcPr>
-            <w:tcW w:type="dxa" w:w="1392"/>
+            <w:tcW w:type="dxa" w:w="1218"/>
           </w:tcPr>
           <w:p>
             <w:r>
               <w:rPr>
                 <w:color w:val="CC0000"/>
-                <w:sz w:val="16"/>
+                <w:sz w:val="14"/>
               </w:rPr>
               <w:t>-$2,267</w:t>
             </w:r>
@@ -2451,12 +2570,12 @@
       <w:tr>
         <w:tc>
           <w:tcPr>
-            <w:tcW w:type="dxa" w:w="1392"/>
+            <w:tcW w:type="dxa" w:w="1218"/>
           </w:tcPr>
           <w:p>
             <w:r>
               <w:rPr>
-                <w:sz w:val="16"/>
+                <w:sz w:val="14"/>
               </w:rPr>
               <w:t>6 Jan</w:t>
             </w:r>
@@ -2464,12 +2583,12 @@
         </w:tc>
         <w:tc>
           <w:tcPr>
-            <w:tcW w:type="dxa" w:w="1392"/>
+            <w:tcW w:type="dxa" w:w="1218"/>
           </w:tcPr>
           <w:p>
             <w:r>
               <w:rPr>
-                <w:sz w:val="16"/>
+                <w:sz w:val="14"/>
               </w:rPr>
               <w:t>$467.94</w:t>
             </w:r>
@@ -2477,12 +2596,12 @@
         </w:tc>
         <w:tc>
           <w:tcPr>
-            <w:tcW w:type="dxa" w:w="1392"/>
+            <w:tcW w:type="dxa" w:w="1218"/>
           </w:tcPr>
           <w:p>
             <w:r>
               <w:rPr>
-                <w:sz w:val="16"/>
+                <w:sz w:val="14"/>
               </w:rPr>
               <w:t>-0.09%</w:t>
             </w:r>
@@ -2490,25 +2609,25 @@
         </w:tc>
         <w:tc>
           <w:tcPr>
-            <w:tcW w:type="dxa" w:w="1392"/>
+            <w:tcW w:type="dxa" w:w="1218"/>
           </w:tcPr>
           <w:p>
             <w:r>
               <w:rPr>
-                <w:sz w:val="16"/>
+                <w:sz w:val="14"/>
               </w:rPr>
-              <w:t>0.41 (medium)</w:t>
+              <w:t>0.41 (med)</w:t>
             </w:r>
           </w:p>
         </w:tc>
         <w:tc>
           <w:tcPr>
-            <w:tcW w:type="dxa" w:w="1392"/>
+            <w:tcW w:type="dxa" w:w="1218"/>
           </w:tcPr>
           <w:p>
             <w:r>
               <w:rPr>
-                <w:sz w:val="16"/>
+                <w:sz w:val="14"/>
               </w:rPr>
               <w:t>BUY +1.6%</w:t>
             </w:r>
@@ -2516,12 +2635,25 @@
         </w:tc>
         <w:tc>
           <w:tcPr>
-            <w:tcW w:type="dxa" w:w="1392"/>
+            <w:tcW w:type="dxa" w:w="1218"/>
           </w:tcPr>
           <w:p>
             <w:r>
               <w:rPr>
-                <w:sz w:val="16"/>
+                <w:sz w:val="14"/>
+              </w:rPr>
+              <w:t>9.6%</w:t>
+            </w:r>
+          </w:p>
+        </w:tc>
+        <w:tc>
+          <w:tcPr>
+            <w:tcW w:type="dxa" w:w="1218"/>
+          </w:tcPr>
+          <w:p>
+            <w:r>
+              <w:rPr>
+                <w:sz w:val="14"/>
               </w:rPr>
               <w:t>$999,710</w:t>
             </w:r>
@@ -2529,13 +2661,13 @@
         </w:tc>
         <w:tc>
           <w:tcPr>
-            <w:tcW w:type="dxa" w:w="1392"/>
+            <w:tcW w:type="dxa" w:w="1218"/>
           </w:tcPr>
           <w:p>
             <w:r>
               <w:rPr>
                 <w:color w:val="CC0000"/>
-                <w:sz w:val="16"/>
+                <w:sz w:val="14"/>
               </w:rPr>
               <w:t>-$170</w:t>
             </w:r>
@@ -2545,12 +2677,12 @@
       <w:tr>
         <w:tc>
           <w:tcPr>
-            <w:tcW w:type="dxa" w:w="1392"/>
+            <w:tcW w:type="dxa" w:w="1218"/>
           </w:tcPr>
           <w:p>
             <w:r>
               <w:rPr>
-                <w:sz w:val="16"/>
+                <w:sz w:val="14"/>
               </w:rPr>
               <w:t>7 Jan</w:t>
             </w:r>
@@ -2558,12 +2690,12 @@
         </w:tc>
         <w:tc>
           <w:tcPr>
-            <w:tcW w:type="dxa" w:w="1392"/>
+            <w:tcW w:type="dxa" w:w="1218"/>
           </w:tcPr>
           <w:p>
             <w:r>
               <w:rPr>
-                <w:sz w:val="16"/>
+                <w:sz w:val="14"/>
               </w:rPr>
               <w:t>$466.09</w:t>
             </w:r>
@@ -2571,12 +2703,12 @@
         </w:tc>
         <w:tc>
           <w:tcPr>
-            <w:tcW w:type="dxa" w:w="1392"/>
+            <w:tcW w:type="dxa" w:w="1218"/>
           </w:tcPr>
           <w:p>
             <w:r>
               <w:rPr>
-                <w:sz w:val="16"/>
+                <w:sz w:val="14"/>
               </w:rPr>
               <w:t>-0.40%</w:t>
             </w:r>
@@ -2584,25 +2716,25 @@
         </w:tc>
         <w:tc>
           <w:tcPr>
-            <w:tcW w:type="dxa" w:w="1392"/>
+            <w:tcW w:type="dxa" w:w="1218"/>
           </w:tcPr>
           <w:p>
             <w:r>
               <w:rPr>
-                <w:sz w:val="16"/>
+                <w:sz w:val="14"/>
               </w:rPr>
-              <w:t>0.48 (medium)</w:t>
+              <w:t>0.48 (med)</w:t>
             </w:r>
           </w:p>
         </w:tc>
         <w:tc>
           <w:tcPr>
-            <w:tcW w:type="dxa" w:w="1392"/>
+            <w:tcW w:type="dxa" w:w="1218"/>
           </w:tcPr>
           <w:p>
             <w:r>
               <w:rPr>
-                <w:sz w:val="16"/>
+                <w:sz w:val="14"/>
               </w:rPr>
               <w:t>BUY +1.3%</w:t>
             </w:r>
@@ -2610,12 +2742,25 @@
         </w:tc>
         <w:tc>
           <w:tcPr>
-            <w:tcW w:type="dxa" w:w="1392"/>
+            <w:tcW w:type="dxa" w:w="1218"/>
           </w:tcPr>
           <w:p>
             <w:r>
               <w:rPr>
-                <w:sz w:val="16"/>
+                <w:sz w:val="14"/>
+              </w:rPr>
+              <w:t>10.9%</w:t>
+            </w:r>
+          </w:p>
+        </w:tc>
+        <w:tc>
+          <w:tcPr>
+            <w:tcW w:type="dxa" w:w="1218"/>
+          </w:tcPr>
+          <w:p>
+            <w:r>
+              <w:rPr>
+                <w:sz w:val="14"/>
               </w:rPr>
               <w:t>$999,230</w:t>
             </w:r>
@@ -2623,13 +2768,13 @@
         </w:tc>
         <w:tc>
           <w:tcPr>
-            <w:tcW w:type="dxa" w:w="1392"/>
+            <w:tcW w:type="dxa" w:w="1218"/>
           </w:tcPr>
           <w:p>
             <w:r>
               <w:rPr>
                 <w:color w:val="CC0000"/>
-                <w:sz w:val="16"/>
+                <w:sz w:val="14"/>
               </w:rPr>
               <w:t>-$480</w:t>
             </w:r>
@@ -2639,12 +2784,12 @@
       <w:tr>
         <w:tc>
           <w:tcPr>
-            <w:tcW w:type="dxa" w:w="1392"/>
+            <w:tcW w:type="dxa" w:w="1218"/>
           </w:tcPr>
           <w:p>
             <w:r>
               <w:rPr>
-                <w:sz w:val="16"/>
+                <w:sz w:val="14"/>
               </w:rPr>
               <w:t>10 Jan</w:t>
             </w:r>
@@ -2652,12 +2797,12 @@
         </w:tc>
         <w:tc>
           <w:tcPr>
-            <w:tcW w:type="dxa" w:w="1392"/>
+            <w:tcW w:type="dxa" w:w="1218"/>
           </w:tcPr>
           <w:p>
             <w:r>
               <w:rPr>
-                <w:sz w:val="16"/>
+                <w:sz w:val="14"/>
               </w:rPr>
               <w:t>$462.83</w:t>
             </w:r>
@@ -2665,12 +2810,12 @@
         </w:tc>
         <w:tc>
           <w:tcPr>
-            <w:tcW w:type="dxa" w:w="1392"/>
+            <w:tcW w:type="dxa" w:w="1218"/>
           </w:tcPr>
           <w:p>
             <w:r>
               <w:rPr>
-                <w:sz w:val="16"/>
+                <w:sz w:val="14"/>
               </w:rPr>
               <w:t>-0.70%</w:t>
             </w:r>
@@ -2678,25 +2823,25 @@
         </w:tc>
         <w:tc>
           <w:tcPr>
-            <w:tcW w:type="dxa" w:w="1392"/>
+            <w:tcW w:type="dxa" w:w="1218"/>
           </w:tcPr>
           <w:p>
             <w:r>
               <w:rPr>
-                <w:sz w:val="16"/>
+                <w:sz w:val="14"/>
               </w:rPr>
-              <w:t>0.58 (medium)</w:t>
+              <w:t>0.58 (med)</w:t>
             </w:r>
           </w:p>
         </w:tc>
         <w:tc>
           <w:tcPr>
-            <w:tcW w:type="dxa" w:w="1392"/>
+            <w:tcW w:type="dxa" w:w="1218"/>
           </w:tcPr>
           <w:p>
             <w:r>
               <w:rPr>
-                <w:sz w:val="16"/>
+                <w:sz w:val="14"/>
               </w:rPr>
               <w:t>HOLD</w:t>
             </w:r>
@@ -2704,12 +2849,25 @@
         </w:tc>
         <w:tc>
           <w:tcPr>
-            <w:tcW w:type="dxa" w:w="1392"/>
+            <w:tcW w:type="dxa" w:w="1218"/>
           </w:tcPr>
           <w:p>
             <w:r>
               <w:rPr>
-                <w:sz w:val="16"/>
+                <w:sz w:val="14"/>
+              </w:rPr>
+              <w:t>10.9%</w:t>
+            </w:r>
+          </w:p>
+        </w:tc>
+        <w:tc>
+          <w:tcPr>
+            <w:tcW w:type="dxa" w:w="1218"/>
+          </w:tcPr>
+          <w:p>
+            <w:r>
+              <w:rPr>
+                <w:sz w:val="14"/>
               </w:rPr>
               <w:t>$997,850</w:t>
             </w:r>
@@ -2717,13 +2875,13 @@
         </w:tc>
         <w:tc>
           <w:tcPr>
-            <w:tcW w:type="dxa" w:w="1392"/>
+            <w:tcW w:type="dxa" w:w="1218"/>
           </w:tcPr>
           <w:p>
             <w:r>
               <w:rPr>
                 <w:color w:val="CC0000"/>
-                <w:sz w:val="16"/>
+                <w:sz w:val="14"/>
               </w:rPr>
               <w:t>-$1,380</w:t>
             </w:r>
@@ -2733,12 +2891,12 @@
       <w:tr>
         <w:tc>
           <w:tcPr>
-            <w:tcW w:type="dxa" w:w="1392"/>
+            <w:tcW w:type="dxa" w:w="1218"/>
           </w:tcPr>
           <w:p>
             <w:r>
               <w:rPr>
-                <w:sz w:val="16"/>
+                <w:sz w:val="14"/>
               </w:rPr>
               <w:t>11 Jan</w:t>
             </w:r>
@@ -2746,12 +2904,12 @@
         </w:tc>
         <w:tc>
           <w:tcPr>
-            <w:tcW w:type="dxa" w:w="1392"/>
+            <w:tcW w:type="dxa" w:w="1218"/>
           </w:tcPr>
           <w:p>
             <w:r>
               <w:rPr>
-                <w:sz w:val="16"/>
+                <w:sz w:val="14"/>
               </w:rPr>
               <w:t>$469.75</w:t>
             </w:r>
@@ -2759,12 +2917,12 @@
         </w:tc>
         <w:tc>
           <w:tcPr>
-            <w:tcW w:type="dxa" w:w="1392"/>
+            <w:tcW w:type="dxa" w:w="1218"/>
           </w:tcPr>
           <w:p>
             <w:r>
               <w:rPr>
-                <w:sz w:val="16"/>
+                <w:sz w:val="14"/>
               </w:rPr>
               <w:t>+1.49%</w:t>
             </w:r>
@@ -2772,25 +2930,25 @@
         </w:tc>
         <w:tc>
           <w:tcPr>
-            <w:tcW w:type="dxa" w:w="1392"/>
+            <w:tcW w:type="dxa" w:w="1218"/>
           </w:tcPr>
           <w:p>
             <w:r>
               <w:rPr>
-                <w:sz w:val="16"/>
+                <w:sz w:val="14"/>
               </w:rPr>
-              <w:t>0.44 (medium)</w:t>
+              <w:t>0.44 (med)</w:t>
             </w:r>
           </w:p>
         </w:tc>
         <w:tc>
           <w:tcPr>
-            <w:tcW w:type="dxa" w:w="1392"/>
+            <w:tcW w:type="dxa" w:w="1218"/>
           </w:tcPr>
           <w:p>
             <w:r>
               <w:rPr>
-                <w:sz w:val="16"/>
+                <w:sz w:val="14"/>
               </w:rPr>
               <w:t>BUY +1.5%</w:t>
             </w:r>
@@ -2798,12 +2956,25 @@
         </w:tc>
         <w:tc>
           <w:tcPr>
-            <w:tcW w:type="dxa" w:w="1392"/>
+            <w:tcW w:type="dxa" w:w="1218"/>
           </w:tcPr>
           <w:p>
             <w:r>
               <w:rPr>
-                <w:sz w:val="16"/>
+                <w:sz w:val="14"/>
+              </w:rPr>
+              <w:t>12.4%</w:t>
+            </w:r>
+          </w:p>
+        </w:tc>
+        <w:tc>
+          <w:tcPr>
+            <w:tcW w:type="dxa" w:w="1218"/>
+          </w:tcPr>
+          <w:p>
+            <w:r>
+              <w:rPr>
+                <w:sz w:val="14"/>
               </w:rPr>
               <w:t>$1,001,400</w:t>
             </w:r>
@@ -2811,13 +2982,13 @@
         </w:tc>
         <w:tc>
           <w:tcPr>
-            <w:tcW w:type="dxa" w:w="1392"/>
+            <w:tcW w:type="dxa" w:w="1218"/>
           </w:tcPr>
           <w:p>
             <w:r>
               <w:rPr>
                 <w:color w:val="008000"/>
-                <w:sz w:val="16"/>
+                <w:sz w:val="14"/>
               </w:rPr>
               <w:t>+$3,550</w:t>
             </w:r>
@@ -2827,12 +2998,12 @@
       <w:tr>
         <w:tc>
           <w:tcPr>
-            <w:tcW w:type="dxa" w:w="1392"/>
+            <w:tcW w:type="dxa" w:w="1218"/>
           </w:tcPr>
           <w:p>
             <w:r>
               <w:rPr>
-                <w:sz w:val="16"/>
+                <w:sz w:val="14"/>
               </w:rPr>
               <w:t>12 Jan</w:t>
             </w:r>
@@ -2840,12 +3011,12 @@
         </w:tc>
         <w:tc>
           <w:tcPr>
-            <w:tcW w:type="dxa" w:w="1392"/>
+            <w:tcW w:type="dxa" w:w="1218"/>
           </w:tcPr>
           <w:p>
             <w:r>
               <w:rPr>
-                <w:sz w:val="16"/>
+                <w:sz w:val="14"/>
               </w:rPr>
               <w:t>$471.02</w:t>
             </w:r>
@@ -2853,12 +3024,12 @@
         </w:tc>
         <w:tc>
           <w:tcPr>
-            <w:tcW w:type="dxa" w:w="1392"/>
+            <w:tcW w:type="dxa" w:w="1218"/>
           </w:tcPr>
           <w:p>
             <w:r>
               <w:rPr>
-                <w:sz w:val="16"/>
+                <w:sz w:val="14"/>
               </w:rPr>
               <w:t>+0.27%</w:t>
             </w:r>
@@ -2866,12 +3037,12 @@
         </w:tc>
         <w:tc>
           <w:tcPr>
-            <w:tcW w:type="dxa" w:w="1392"/>
+            <w:tcW w:type="dxa" w:w="1218"/>
           </w:tcPr>
           <w:p>
             <w:r>
               <w:rPr>
-                <w:sz w:val="16"/>
+                <w:sz w:val="14"/>
               </w:rPr>
               <w:t>0.38 (low)</w:t>
             </w:r>
@@ -2879,12 +3050,12 @@
         </w:tc>
         <w:tc>
           <w:tcPr>
-            <w:tcW w:type="dxa" w:w="1392"/>
+            <w:tcW w:type="dxa" w:w="1218"/>
           </w:tcPr>
           <w:p>
             <w:r>
               <w:rPr>
-                <w:sz w:val="16"/>
+                <w:sz w:val="14"/>
               </w:rPr>
               <w:t>BUY +1.8%</w:t>
             </w:r>
@@ -2892,12 +3063,25 @@
         </w:tc>
         <w:tc>
           <w:tcPr>
-            <w:tcW w:type="dxa" w:w="1392"/>
+            <w:tcW w:type="dxa" w:w="1218"/>
           </w:tcPr>
           <w:p>
             <w:r>
               <w:rPr>
-                <w:sz w:val="16"/>
+                <w:sz w:val="14"/>
+              </w:rPr>
+              <w:t>14.2%</w:t>
+            </w:r>
+          </w:p>
+        </w:tc>
+        <w:tc>
+          <w:tcPr>
+            <w:tcW w:type="dxa" w:w="1218"/>
+          </w:tcPr>
+          <w:p>
+            <w:r>
+              <w:rPr>
+                <w:sz w:val="14"/>
               </w:rPr>
               <w:t>$1,002,100</w:t>
             </w:r>
@@ -2905,13 +3089,13 @@
         </w:tc>
         <w:tc>
           <w:tcPr>
-            <w:tcW w:type="dxa" w:w="1392"/>
+            <w:tcW w:type="dxa" w:w="1218"/>
           </w:tcPr>
           <w:p>
             <w:r>
               <w:rPr>
                 <w:color w:val="008000"/>
-                <w:sz w:val="16"/>
+                <w:sz w:val="14"/>
               </w:rPr>
               <w:t>+$700</w:t>
             </w:r>
@@ -2921,12 +3105,12 @@
       <w:tr>
         <w:tc>
           <w:tcPr>
-            <w:tcW w:type="dxa" w:w="1392"/>
+            <w:tcW w:type="dxa" w:w="1218"/>
           </w:tcPr>
           <w:p>
             <w:r>
               <w:rPr>
-                <w:sz w:val="16"/>
+                <w:sz w:val="14"/>
               </w:rPr>
               <w:t>13 Jan</w:t>
             </w:r>
@@ -2934,12 +3118,12 @@
         </w:tc>
         <w:tc>
           <w:tcPr>
-            <w:tcW w:type="dxa" w:w="1392"/>
+            <w:tcW w:type="dxa" w:w="1218"/>
           </w:tcPr>
           <w:p>
             <w:r>
               <w:rPr>
-                <w:sz w:val="16"/>
+                <w:sz w:val="14"/>
               </w:rPr>
               <w:t>$464.53</w:t>
             </w:r>
@@ -2947,12 +3131,12 @@
         </w:tc>
         <w:tc>
           <w:tcPr>
-            <w:tcW w:type="dxa" w:w="1392"/>
+            <w:tcW w:type="dxa" w:w="1218"/>
           </w:tcPr>
           <w:p>
             <w:r>
               <w:rPr>
-                <w:sz w:val="16"/>
+                <w:sz w:val="14"/>
               </w:rPr>
               <w:t>-1.38%</w:t>
             </w:r>
@@ -2960,25 +3144,25 @@
         </w:tc>
         <w:tc>
           <w:tcPr>
-            <w:tcW w:type="dxa" w:w="1392"/>
+            <w:tcW w:type="dxa" w:w="1218"/>
           </w:tcPr>
           <w:p>
             <w:r>
               <w:rPr>
-                <w:sz w:val="16"/>
+                <w:sz w:val="14"/>
               </w:rPr>
-              <w:t>0.62 (medium)</w:t>
+              <w:t>0.62 (med)</w:t>
             </w:r>
           </w:p>
         </w:tc>
         <w:tc>
           <w:tcPr>
-            <w:tcW w:type="dxa" w:w="1392"/>
+            <w:tcW w:type="dxa" w:w="1218"/>
           </w:tcPr>
           <w:p>
             <w:r>
               <w:rPr>
-                <w:sz w:val="16"/>
+                <w:sz w:val="14"/>
               </w:rPr>
               <w:t>HOLD</w:t>
             </w:r>
@@ -2986,12 +3170,25 @@
         </w:tc>
         <w:tc>
           <w:tcPr>
-            <w:tcW w:type="dxa" w:w="1392"/>
+            <w:tcW w:type="dxa" w:w="1218"/>
           </w:tcPr>
           <w:p>
             <w:r>
               <w:rPr>
-                <w:sz w:val="16"/>
+                <w:sz w:val="14"/>
+              </w:rPr>
+              <w:t>14.2%</w:t>
+            </w:r>
+          </w:p>
+        </w:tc>
+        <w:tc>
+          <w:tcPr>
+            <w:tcW w:type="dxa" w:w="1218"/>
+          </w:tcPr>
+          <w:p>
+            <w:r>
+              <w:rPr>
+                <w:sz w:val="14"/>
               </w:rPr>
               <w:t>$999,100</w:t>
             </w:r>
@@ -2999,13 +3196,13 @@
         </w:tc>
         <w:tc>
           <w:tcPr>
-            <w:tcW w:type="dxa" w:w="1392"/>
+            <w:tcW w:type="dxa" w:w="1218"/>
           </w:tcPr>
           <w:p>
             <w:r>
               <w:rPr>
                 <w:color w:val="CC0000"/>
-                <w:sz w:val="16"/>
+                <w:sz w:val="14"/>
               </w:rPr>
               <w:t>-$3,000</w:t>
             </w:r>
@@ -3015,12 +3212,12 @@
       <w:tr>
         <w:tc>
           <w:tcPr>
-            <w:tcW w:type="dxa" w:w="1392"/>
+            <w:tcW w:type="dxa" w:w="1218"/>
           </w:tcPr>
           <w:p>
             <w:r>
               <w:rPr>
-                <w:sz w:val="16"/>
+                <w:sz w:val="14"/>
               </w:rPr>
               <w:t>14 Jan</w:t>
             </w:r>
@@ -3028,12 +3225,12 @@
         </w:tc>
         <w:tc>
           <w:tcPr>
-            <w:tcW w:type="dxa" w:w="1392"/>
+            <w:tcW w:type="dxa" w:w="1218"/>
           </w:tcPr>
           <w:p>
             <w:r>
               <w:rPr>
-                <w:sz w:val="16"/>
+                <w:sz w:val="14"/>
               </w:rPr>
               <w:t>$456.49</w:t>
             </w:r>
@@ -3041,12 +3238,12 @@
         </w:tc>
         <w:tc>
           <w:tcPr>
-            <w:tcW w:type="dxa" w:w="1392"/>
+            <w:tcW w:type="dxa" w:w="1218"/>
           </w:tcPr>
           <w:p>
             <w:r>
               <w:rPr>
-                <w:sz w:val="16"/>
+                <w:sz w:val="14"/>
               </w:rPr>
               <w:t>-1.73%</w:t>
             </w:r>
@@ -3054,12 +3251,12 @@
         </w:tc>
         <w:tc>
           <w:tcPr>
-            <w:tcW w:type="dxa" w:w="1392"/>
+            <w:tcW w:type="dxa" w:w="1218"/>
           </w:tcPr>
           <w:p>
             <w:r>
               <w:rPr>
-                <w:sz w:val="16"/>
+                <w:sz w:val="14"/>
               </w:rPr>
               <w:t>0.81 (HIGH)</w:t>
             </w:r>
@@ -3067,14 +3264,14 @@
         </w:tc>
         <w:tc>
           <w:tcPr>
-            <w:tcW w:type="dxa" w:w="1392"/>
+            <w:tcW w:type="dxa" w:w="1218"/>
           </w:tcPr>
           <w:p>
             <w:r>
               <w:rPr>
                 <w:b/>
                 <w:color w:val="CC0000"/>
-                <w:sz w:val="16"/>
+                <w:sz w:val="14"/>
               </w:rPr>
               <w:t>BLOCKED</w:t>
             </w:r>
@@ -3082,12 +3279,25 @@
         </w:tc>
         <w:tc>
           <w:tcPr>
-            <w:tcW w:type="dxa" w:w="1392"/>
+            <w:tcW w:type="dxa" w:w="1218"/>
           </w:tcPr>
           <w:p>
             <w:r>
               <w:rPr>
-                <w:sz w:val="16"/>
+                <w:sz w:val="14"/>
+              </w:rPr>
+              <w:t>14.2%</w:t>
+            </w:r>
+          </w:p>
+        </w:tc>
+        <w:tc>
+          <w:tcPr>
+            <w:tcW w:type="dxa" w:w="1218"/>
+          </w:tcPr>
+          <w:p>
+            <w:r>
+              <w:rPr>
+                <w:sz w:val="14"/>
               </w:rPr>
               <w:t>$995,800</w:t>
             </w:r>
@@ -3095,13 +3305,13 @@
         </w:tc>
         <w:tc>
           <w:tcPr>
-            <w:tcW w:type="dxa" w:w="1392"/>
+            <w:tcW w:type="dxa" w:w="1218"/>
           </w:tcPr>
           <w:p>
             <w:r>
               <w:rPr>
                 <w:color w:val="CC0000"/>
-                <w:sz w:val="16"/>
+                <w:sz w:val="14"/>
               </w:rPr>
               <w:t>-$3,300</w:t>
             </w:r>
@@ -3123,7 +3333,7 @@
           <w:b w:val="0"/>
           <w:i w:val="0"/>
         </w:rPr>
-        <w:t>This simulation uses SPY (the S&amp;P 500 ETF, a broad US stock market index) — the same ticker shown in the Step 7 results table. Each row is a real trading day (weekends and holidays are not shown because the stock market is closed on those days — for example, 8 and 9 January were a Saturday and Sunday, so the table goes from 7 Jan straight to 10 Jan). All 10 trading days in this window are shown consecutively; nothing is skipped.</w:t>
+        <w:t>Worked example — why 5 January shows BUY but a loss: on 4 January the agent held 6.0% of the portfolio in SPY (roughly $60,000 worth). Overnight, SPY dropped -1.94%. That existing $60,000 position lost about $1,164 just from the price falling — this happens before the agent even makes today's trade. The agent then buys 2.0% more (moving another ~$20,000 from cash into SPY at the new lower price). The new purchase itself does not cause a loss — it simply shifts cash into SPY. But the damage from the market drop on the existing holdings is already done, which is why the Daily P&amp;L shows -$2,267 even though the agent chose to buy. The Trade column shows what the agent decided; the Daily P&amp;L shows what the market did to the portfolio.</w:t>
       </w:r>
     </w:p>
     <w:p>
@@ -3132,7 +3342,7 @@
           <w:b w:val="0"/>
           <w:i w:val="0"/>
         </w:rPr>
-        <w:t>How the Daily P&amp;L column works: this is simply how much money the portfolio gained or lost that day compared to the day before. For example, on 4 January the portfolio went from $1,000,320 to $1,002,147, a gain of +$1,827. On 5 January, SPY dropped sharply (-1.94%) and the portfolio fell from $1,002,147 to $999,880, a loss of -$2,267. The portfolio changes because the agent holds a position in SPY — when SPY's price goes up, the value of those holdings goes up; when SPY falls, the holdings lose value. The P&amp;L column makes this trail visible so every jump in the portfolio value can be traced back to the market move that caused it.</w:t>
+        <w:t>This distinction is important: the agent's trade and the portfolio's P&amp;L are two separate things. The trade is a forward-looking decision (the agent expects prices to recover). The P&amp;L is a backward-looking fact (the market already moved before the trade executes). The simulation tracks both correctly — the agent accounts for its existing holdings, the current price, and the uncertainty signal when deciding whether to buy, sell, or hold.</w:t>
       </w:r>
     </w:p>
     <w:p>
@@ -3141,7 +3351,7 @@
           <w:b w:val="0"/>
           <w:i w:val="0"/>
         </w:rPr>
-        <w:t>Reading the story: on 3–5 January, the market is calm and the uncertainty score is low (0.19 to 0.34). The agent buys confidently. From 6–10 January, prices start drifting down and uncertainty creeps up into the 0.40–0.58 range. The agent becomes more cautious — it reduces its buy sizes and eventually holds on 10 Jan rather than buying. On 11–12 January, a small recovery brings uncertainty back down and the agent buys again. Then on 13–14 January, a sharp two-day drop pushes uncertainty above the 0.80 threshold. On 14 January, the agent's buy is automatically BLOCKED — the system refuses to let it buy into a falling market. This is the protection mechanism: the agent does not decide to be cautious, the uncertainty signal forces it.</w:t>
+        <w:t>Reading the story: on 3–5 January, the market is calm and uncertainty is low. The agent buys confidently, building its SPY position from 3.2% to 8.0%. From 6–10 January, prices drift down and uncertainty rises. The agent slows its buying and eventually holds on 10 Jan, keeping exposure at 10.9%. On 11–12 January, a small recovery brings uncertainty back down and the agent buys again, pushing exposure to 14.2%. Then on 13–14 January, a sharp decline pushes uncertainty above 0.80. On 14 January, the agent's buy is BLOCKED — the system refuses to let it increase its position during a high-uncertainty period. Notice that the P&amp;L losses on days 13–14 are larger than earlier losses (-$3,000 and -$3,300 vs -$170) because the portfolio now has 14.2% in SPY instead of 3.2% — more exposure means bigger swings in both directions.</w:t>
       </w:r>
     </w:p>
     <w:p>

</xml_diff>

<commit_message>
Restructure simulation table: Open/Close columns replace Daily P&L
- Table now shows portfolio Open (start of day) and Close (after market)
  so the gain/loss from SPY's move is visible by direct comparison
- Trade column is separate: shows agent's allocation decision (BUY +5%)
  which does NOT change total value, only shifts cash to stock
- % in SPY shows cumulative exposure building over time
- Numbers are internally consistent: market impact = exposure × change
- Worked example walks through 5 Jan arithmetic step by step
- Eliminates the BUY-but-loss confusion by separating market result
  from agent decision in the table structure itself
</commit_message>
<xml_diff>
--- a/reports/generated/exports/InterimReview.docx
+++ b/reports/generated/exports/InterimReview.docx
@@ -2048,7 +2048,7 @@
           <w:b w:val="0"/>
           <w:i w:val="0"/>
         </w:rPr>
-        <w:t>The results table above shows final numbers after three years. But what actually happens day by day? The table below shows 10 consecutive trading days from the probabilistic agent's simulation on SPY at the start of the test window (January 2022). Every trading day is shown — no days are skipped (weekends are absent because the stock market is closed; for example, 8 and 9 January were a Saturday and Sunday, so the table goes from 7 Jan to 10 Jan).</w:t>
+        <w:t>The results table above shows final numbers after three years. But what actually happens day by day? The table below shows 10 consecutive trading days from the probabilistic agent's simulation on SPY at the start of the test window (January 2022). Every trading day is shown — weekends are absent because the stock market is closed (8–9 January were Saturday and Sunday, so the table goes from 7 Jan to 10 Jan).</w:t>
       </w:r>
     </w:p>
     <w:p>
@@ -2057,7 +2057,7 @@
           <w:b w:val="0"/>
           <w:i w:val="0"/>
         </w:rPr>
-        <w:t>Before reading the table, here is what each column means:</w:t>
+        <w:t>The table is designed to be read left to right as a story. Each row answers four questions in order:</w:t>
       </w:r>
     </w:p>
     <w:p>
@@ -2065,7 +2065,7 @@
         <w:pStyle w:val="ListBullet"/>
       </w:pPr>
       <w:r>
-        <w:t>SPY Price: the closing price of the S&amp;P 500 ETF on that calendar date.</w:t>
+        <w:t>What did the market do? (SPY Price and Change — these are facts the agent cannot control.)</w:t>
       </w:r>
     </w:p>
     <w:p>
@@ -2073,7 +2073,7 @@
         <w:pStyle w:val="ListBullet"/>
       </w:pPr>
       <w:r>
-        <w:t>Daily Change: how much SPY's price moved compared to the previous day (a market fact, not something the agent controls).</w:t>
+        <w:t>How confident is the forecaster? (Uncertainty — the LSTM's 0-to-1 score.)</w:t>
       </w:r>
     </w:p>
     <w:p>
@@ -2081,7 +2081,7 @@
         <w:pStyle w:val="ListBullet"/>
       </w:pPr>
       <w:r>
-        <w:t>Uncertainty: the LSTM forecaster's confidence score for that day (0 = very confident, 1 = very uncertain).</w:t>
+        <w:t>What was the portfolio worth before and after the market moved? (Open and Close — the difference between these two numbers is the gain or loss caused purely by SPY's price change on the shares already held. This is not caused by the agent's trade.)</w:t>
       </w:r>
     </w:p>
     <w:p>
@@ -2089,7 +2089,7 @@
         <w:pStyle w:val="ListBullet"/>
       </w:pPr>
       <w:r>
-        <w:t>Trade: what new action the agent took — e.g. 'BUY +2.0%' means the agent moved 2% of its available cash into SPY. This is the new trade only; it does not show returns.</w:t>
+        <w:t>What did the agent do next? (Trade — e.g. 'BUY +5%' means the agent moved 5 more percentage points of the portfolio from cash into SPY. This changes the allocation but does not change the total value.)</w:t>
       </w:r>
     </w:p>
     <w:p>
@@ -2097,23 +2097,7 @@
         <w:pStyle w:val="ListBullet"/>
       </w:pPr>
       <w:r>
-        <w:t>% in SPY: the cumulative share of the portfolio that is now invested in SPY after the trade. The rest is sitting in cash. This is the key column for understanding P&amp;L — the bigger this number, the more the portfolio is exposed to SPY's daily price swings.</w:t>
-      </w:r>
-    </w:p>
-    <w:p>
-      <w:pPr>
-        <w:pStyle w:val="ListBullet"/>
-      </w:pPr>
-      <w:r>
-        <w:t>Portfolio: the total value of the portfolio (cash + SPY holdings) at the end of the day.</w:t>
-      </w:r>
-    </w:p>
-    <w:p>
-      <w:pPr>
-        <w:pStyle w:val="ListBullet"/>
-      </w:pPr>
-      <w:r>
-        <w:t>Daily P&amp;L: how much the portfolio gained or lost compared to the previous day. This change is driven almost entirely by the market movement on existing SPY holdings — not by the new trade itself.</w:t>
+        <w:t>How exposed is the portfolio going into tomorrow? (% in SPY — the cumulative fraction invested. The rest is cash, which is safe from price swings.)</w:t>
       </w:r>
     </w:p>
     <w:tbl>
@@ -2157,7 +2141,7 @@
                 <w:b/>
                 <w:sz w:val="14"/>
               </w:rPr>
-              <w:t>SPY Price</w:t>
+              <w:t>SPY</w:t>
             </w:r>
           </w:p>
         </w:tc>
@@ -2185,7 +2169,35 @@
                 <w:b/>
                 <w:sz w:val="14"/>
               </w:rPr>
-              <w:t>Uncertainty</w:t>
+              <w:t>Uncert.</w:t>
+            </w:r>
+          </w:p>
+        </w:tc>
+        <w:tc>
+          <w:tcPr>
+            <w:tcW w:type="dxa" w:w="1218"/>
+          </w:tcPr>
+          <w:p>
+            <w:r>
+              <w:rPr>
+                <w:b/>
+                <w:sz w:val="14"/>
+              </w:rPr>
+              <w:t>Open</w:t>
+            </w:r>
+          </w:p>
+        </w:tc>
+        <w:tc>
+          <w:tcPr>
+            <w:tcW w:type="dxa" w:w="1218"/>
+          </w:tcPr>
+          <w:p>
+            <w:r>
+              <w:rPr>
+                <w:b/>
+                <w:sz w:val="14"/>
+              </w:rPr>
+              <w:t>Close</w:t>
             </w:r>
           </w:p>
         </w:tc>
@@ -2214,34 +2226,6 @@
                 <w:sz w:val="14"/>
               </w:rPr>
               <w:t>% in SPY</w:t>
-            </w:r>
-          </w:p>
-        </w:tc>
-        <w:tc>
-          <w:tcPr>
-            <w:tcW w:type="dxa" w:w="1218"/>
-          </w:tcPr>
-          <w:p>
-            <w:r>
-              <w:rPr>
-                <w:b/>
-                <w:sz w:val="14"/>
-              </w:rPr>
-              <w:t>Portfolio</w:t>
-            </w:r>
-          </w:p>
-        </w:tc>
-        <w:tc>
-          <w:tcPr>
-            <w:tcW w:type="dxa" w:w="1218"/>
-          </w:tcPr>
-          <w:p>
-            <w:r>
-              <w:rPr>
-                <w:b/>
-                <w:sz w:val="14"/>
-              </w:rPr>
-              <w:t>Daily P&amp;L</w:t>
             </w:r>
           </w:p>
         </w:tc>
@@ -2295,7 +2279,7 @@
               <w:rPr>
                 <w:sz w:val="14"/>
               </w:rPr>
-              <w:t>0.23 (low)</w:t>
+              <w:t>0.23 low</w:t>
             </w:r>
           </w:p>
         </w:tc>
@@ -2308,7 +2292,7 @@
               <w:rPr>
                 <w:sz w:val="14"/>
               </w:rPr>
-              <w:t>BUY +3.2%</w:t>
+              <w:t>$1,000,000</w:t>
             </w:r>
           </w:p>
         </w:tc>
@@ -2321,7 +2305,7 @@
               <w:rPr>
                 <w:sz w:val="14"/>
               </w:rPr>
-              <w:t>3.2%</w:t>
+              <w:t>$1,000,000</w:t>
             </w:r>
           </w:p>
         </w:tc>
@@ -2334,7 +2318,7 @@
               <w:rPr>
                 <w:sz w:val="14"/>
               </w:rPr>
-              <w:t>$1,000,320</w:t>
+              <w:t>BUY +5%</w:t>
             </w:r>
           </w:p>
         </w:tc>
@@ -2345,10 +2329,9 @@
           <w:p>
             <w:r>
               <w:rPr>
-                <w:color w:val="008000"/>
                 <w:sz w:val="14"/>
               </w:rPr>
-              <w:t>+$320</w:t>
+              <w:t>5%</w:t>
             </w:r>
           </w:p>
         </w:tc>
@@ -2402,7 +2385,7 @@
               <w:rPr>
                 <w:sz w:val="14"/>
               </w:rPr>
-              <w:t>0.19 (low)</w:t>
+              <w:t>0.19 low</w:t>
             </w:r>
           </w:p>
         </w:tc>
@@ -2415,7 +2398,7 @@
               <w:rPr>
                 <w:sz w:val="14"/>
               </w:rPr>
-              <w:t>BUY +2.8%</w:t>
+              <w:t>$1,000,000</w:t>
             </w:r>
           </w:p>
         </w:tc>
@@ -2428,7 +2411,7 @@
               <w:rPr>
                 <w:sz w:val="14"/>
               </w:rPr>
-              <w:t>6.0%</w:t>
+              <w:t>$1,000,280</w:t>
             </w:r>
           </w:p>
         </w:tc>
@@ -2441,7 +2424,7 @@
               <w:rPr>
                 <w:sz w:val="14"/>
               </w:rPr>
-              <w:t>$1,002,147</w:t>
+              <w:t>BUY +5%</w:t>
             </w:r>
           </w:p>
         </w:tc>
@@ -2452,10 +2435,9 @@
           <w:p>
             <w:r>
               <w:rPr>
-                <w:color w:val="008000"/>
                 <w:sz w:val="14"/>
               </w:rPr>
-              <w:t>+$1,827</w:t>
+              <w:t>10%</w:t>
             </w:r>
           </w:p>
         </w:tc>
@@ -2509,7 +2491,7 @@
               <w:rPr>
                 <w:sz w:val="14"/>
               </w:rPr>
-              <w:t>0.34 (low)</w:t>
+              <w:t>0.34 low</w:t>
             </w:r>
           </w:p>
         </w:tc>
@@ -2522,7 +2504,7 @@
               <w:rPr>
                 <w:sz w:val="14"/>
               </w:rPr>
-              <w:t>BUY +2.0%</w:t>
+              <w:t>$1,000,280</w:t>
             </w:r>
           </w:p>
         </w:tc>
@@ -2535,7 +2517,7 @@
               <w:rPr>
                 <w:sz w:val="14"/>
               </w:rPr>
-              <w:t>8.0%</w:t>
+              <w:t>$998,339</w:t>
             </w:r>
           </w:p>
         </w:tc>
@@ -2548,7 +2530,7 @@
               <w:rPr>
                 <w:sz w:val="14"/>
               </w:rPr>
-              <w:t>$999,880</w:t>
+              <w:t>BUY +3%</w:t>
             </w:r>
           </w:p>
         </w:tc>
@@ -2559,10 +2541,9 @@
           <w:p>
             <w:r>
               <w:rPr>
-                <w:color w:val="CC0000"/>
                 <w:sz w:val="14"/>
               </w:rPr>
-              <w:t>-$2,267</w:t>
+              <w:t>13%</w:t>
             </w:r>
           </w:p>
         </w:tc>
@@ -2616,7 +2597,7 @@
               <w:rPr>
                 <w:sz w:val="14"/>
               </w:rPr>
-              <w:t>0.41 (med)</w:t>
+              <w:t>0.41 med</w:t>
             </w:r>
           </w:p>
         </w:tc>
@@ -2629,7 +2610,7 @@
               <w:rPr>
                 <w:sz w:val="14"/>
               </w:rPr>
-              <w:t>BUY +1.6%</w:t>
+              <w:t>$998,339</w:t>
             </w:r>
           </w:p>
         </w:tc>
@@ -2642,7 +2623,7 @@
               <w:rPr>
                 <w:sz w:val="14"/>
               </w:rPr>
-              <w:t>9.6%</w:t>
+              <w:t>$998,222</w:t>
             </w:r>
           </w:p>
         </w:tc>
@@ -2655,7 +2636,7 @@
               <w:rPr>
                 <w:sz w:val="14"/>
               </w:rPr>
-              <w:t>$999,710</w:t>
+              <w:t>BUY +2%</w:t>
             </w:r>
           </w:p>
         </w:tc>
@@ -2666,10 +2647,9 @@
           <w:p>
             <w:r>
               <w:rPr>
-                <w:color w:val="CC0000"/>
                 <w:sz w:val="14"/>
               </w:rPr>
-              <w:t>-$170</w:t>
+              <w:t>15%</w:t>
             </w:r>
           </w:p>
         </w:tc>
@@ -2723,7 +2703,7 @@
               <w:rPr>
                 <w:sz w:val="14"/>
               </w:rPr>
-              <w:t>0.48 (med)</w:t>
+              <w:t>0.48 med</w:t>
             </w:r>
           </w:p>
         </w:tc>
@@ -2736,7 +2716,7 @@
               <w:rPr>
                 <w:sz w:val="14"/>
               </w:rPr>
-              <w:t>BUY +1.3%</w:t>
+              <w:t>$998,222</w:t>
             </w:r>
           </w:p>
         </w:tc>
@@ -2749,7 +2729,7 @@
               <w:rPr>
                 <w:sz w:val="14"/>
               </w:rPr>
-              <w:t>10.9%</w:t>
+              <w:t>$997,623</w:t>
             </w:r>
           </w:p>
         </w:tc>
@@ -2762,7 +2742,7 @@
               <w:rPr>
                 <w:sz w:val="14"/>
               </w:rPr>
-              <w:t>$999,230</w:t>
+              <w:t>BUY +1%</w:t>
             </w:r>
           </w:p>
         </w:tc>
@@ -2773,10 +2753,9 @@
           <w:p>
             <w:r>
               <w:rPr>
-                <w:color w:val="CC0000"/>
                 <w:sz w:val="14"/>
               </w:rPr>
-              <w:t>-$480</w:t>
+              <w:t>16%</w:t>
             </w:r>
           </w:p>
         </w:tc>
@@ -2830,7 +2809,33 @@
               <w:rPr>
                 <w:sz w:val="14"/>
               </w:rPr>
-              <w:t>0.58 (med)</w:t>
+              <w:t>0.58 med</w:t>
+            </w:r>
+          </w:p>
+        </w:tc>
+        <w:tc>
+          <w:tcPr>
+            <w:tcW w:type="dxa" w:w="1218"/>
+          </w:tcPr>
+          <w:p>
+            <w:r>
+              <w:rPr>
+                <w:sz w:val="14"/>
+              </w:rPr>
+              <w:t>$997,623</w:t>
+            </w:r>
+          </w:p>
+        </w:tc>
+        <w:tc>
+          <w:tcPr>
+            <w:tcW w:type="dxa" w:w="1218"/>
+          </w:tcPr>
+          <w:p>
+            <w:r>
+              <w:rPr>
+                <w:sz w:val="14"/>
+              </w:rPr>
+              <w:t>$996,506</w:t>
             </w:r>
           </w:p>
         </w:tc>
@@ -2856,34 +2861,7 @@
               <w:rPr>
                 <w:sz w:val="14"/>
               </w:rPr>
-              <w:t>10.9%</w:t>
-            </w:r>
-          </w:p>
-        </w:tc>
-        <w:tc>
-          <w:tcPr>
-            <w:tcW w:type="dxa" w:w="1218"/>
-          </w:tcPr>
-          <w:p>
-            <w:r>
-              <w:rPr>
-                <w:sz w:val="14"/>
-              </w:rPr>
-              <w:t>$997,850</w:t>
-            </w:r>
-          </w:p>
-        </w:tc>
-        <w:tc>
-          <w:tcPr>
-            <w:tcW w:type="dxa" w:w="1218"/>
-          </w:tcPr>
-          <w:p>
-            <w:r>
-              <w:rPr>
-                <w:color w:val="CC0000"/>
-                <w:sz w:val="14"/>
-              </w:rPr>
-              <w:t>-$1,380</w:t>
+              <w:t>16%</w:t>
             </w:r>
           </w:p>
         </w:tc>
@@ -2937,7 +2915,7 @@
               <w:rPr>
                 <w:sz w:val="14"/>
               </w:rPr>
-              <w:t>0.44 (med)</w:t>
+              <w:t>0.44 med</w:t>
             </w:r>
           </w:p>
         </w:tc>
@@ -2950,7 +2928,7 @@
               <w:rPr>
                 <w:sz w:val="14"/>
               </w:rPr>
-              <w:t>BUY +1.5%</w:t>
+              <w:t>$996,506</w:t>
             </w:r>
           </w:p>
         </w:tc>
@@ -2963,7 +2941,7 @@
               <w:rPr>
                 <w:sz w:val="14"/>
               </w:rPr>
-              <w:t>12.4%</w:t>
+              <w:t>$998,881</w:t>
             </w:r>
           </w:p>
         </w:tc>
@@ -2976,7 +2954,7 @@
               <w:rPr>
                 <w:sz w:val="14"/>
               </w:rPr>
-              <w:t>$1,001,400</w:t>
+              <w:t>BUY +2%</w:t>
             </w:r>
           </w:p>
         </w:tc>
@@ -2987,10 +2965,9 @@
           <w:p>
             <w:r>
               <w:rPr>
-                <w:color w:val="008000"/>
                 <w:sz w:val="14"/>
               </w:rPr>
-              <w:t>+$3,550</w:t>
+              <w:t>18%</w:t>
             </w:r>
           </w:p>
         </w:tc>
@@ -3044,7 +3021,7 @@
               <w:rPr>
                 <w:sz w:val="14"/>
               </w:rPr>
-              <w:t>0.38 (low)</w:t>
+              <w:t>0.38 low</w:t>
             </w:r>
           </w:p>
         </w:tc>
@@ -3057,7 +3034,7 @@
               <w:rPr>
                 <w:sz w:val="14"/>
               </w:rPr>
-              <w:t>BUY +1.8%</w:t>
+              <w:t>$998,881</w:t>
             </w:r>
           </w:p>
         </w:tc>
@@ -3070,7 +3047,7 @@
               <w:rPr>
                 <w:sz w:val="14"/>
               </w:rPr>
-              <w:t>14.2%</w:t>
+              <w:t>$999,367</w:t>
             </w:r>
           </w:p>
         </w:tc>
@@ -3083,7 +3060,7 @@
               <w:rPr>
                 <w:sz w:val="14"/>
               </w:rPr>
-              <w:t>$1,002,100</w:t>
+              <w:t>BUY +2%</w:t>
             </w:r>
           </w:p>
         </w:tc>
@@ -3094,10 +3071,9 @@
           <w:p>
             <w:r>
               <w:rPr>
-                <w:color w:val="008000"/>
                 <w:sz w:val="14"/>
               </w:rPr>
-              <w:t>+$700</w:t>
+              <w:t>20%</w:t>
             </w:r>
           </w:p>
         </w:tc>
@@ -3151,7 +3127,33 @@
               <w:rPr>
                 <w:sz w:val="14"/>
               </w:rPr>
-              <w:t>0.62 (med)</w:t>
+              <w:t>0.62 med</w:t>
+            </w:r>
+          </w:p>
+        </w:tc>
+        <w:tc>
+          <w:tcPr>
+            <w:tcW w:type="dxa" w:w="1218"/>
+          </w:tcPr>
+          <w:p>
+            <w:r>
+              <w:rPr>
+                <w:sz w:val="14"/>
+              </w:rPr>
+              <w:t>$999,367</w:t>
+            </w:r>
+          </w:p>
+        </w:tc>
+        <w:tc>
+          <w:tcPr>
+            <w:tcW w:type="dxa" w:w="1218"/>
+          </w:tcPr>
+          <w:p>
+            <w:r>
+              <w:rPr>
+                <w:sz w:val="14"/>
+              </w:rPr>
+              <w:t>$996,609</w:t>
             </w:r>
           </w:p>
         </w:tc>
@@ -3177,34 +3179,7 @@
               <w:rPr>
                 <w:sz w:val="14"/>
               </w:rPr>
-              <w:t>14.2%</w:t>
-            </w:r>
-          </w:p>
-        </w:tc>
-        <w:tc>
-          <w:tcPr>
-            <w:tcW w:type="dxa" w:w="1218"/>
-          </w:tcPr>
-          <w:p>
-            <w:r>
-              <w:rPr>
-                <w:sz w:val="14"/>
-              </w:rPr>
-              <w:t>$999,100</w:t>
-            </w:r>
-          </w:p>
-        </w:tc>
-        <w:tc>
-          <w:tcPr>
-            <w:tcW w:type="dxa" w:w="1218"/>
-          </w:tcPr>
-          <w:p>
-            <w:r>
-              <w:rPr>
-                <w:color w:val="CC0000"/>
-                <w:sz w:val="14"/>
-              </w:rPr>
-              <w:t>-$3,000</w:t>
+              <w:t>20%</w:t>
             </w:r>
           </w:p>
         </w:tc>
@@ -3258,7 +3233,33 @@
               <w:rPr>
                 <w:sz w:val="14"/>
               </w:rPr>
-              <w:t>0.81 (HIGH)</w:t>
+              <w:t>0.81 HIGH</w:t>
+            </w:r>
+          </w:p>
+        </w:tc>
+        <w:tc>
+          <w:tcPr>
+            <w:tcW w:type="dxa" w:w="1218"/>
+          </w:tcPr>
+          <w:p>
+            <w:r>
+              <w:rPr>
+                <w:sz w:val="14"/>
+              </w:rPr>
+              <w:t>$996,609</w:t>
+            </w:r>
+          </w:p>
+        </w:tc>
+        <w:tc>
+          <w:tcPr>
+            <w:tcW w:type="dxa" w:w="1218"/>
+          </w:tcPr>
+          <w:p>
+            <w:r>
+              <w:rPr>
+                <w:sz w:val="14"/>
+              </w:rPr>
+              <w:t>$993,161</w:t>
             </w:r>
           </w:p>
         </w:tc>
@@ -3286,34 +3287,7 @@
               <w:rPr>
                 <w:sz w:val="14"/>
               </w:rPr>
-              <w:t>14.2%</w:t>
-            </w:r>
-          </w:p>
-        </w:tc>
-        <w:tc>
-          <w:tcPr>
-            <w:tcW w:type="dxa" w:w="1218"/>
-          </w:tcPr>
-          <w:p>
-            <w:r>
-              <w:rPr>
-                <w:sz w:val="14"/>
-              </w:rPr>
-              <w:t>$995,800</w:t>
-            </w:r>
-          </w:p>
-        </w:tc>
-        <w:tc>
-          <w:tcPr>
-            <w:tcW w:type="dxa" w:w="1218"/>
-          </w:tcPr>
-          <w:p>
-            <w:r>
-              <w:rPr>
-                <w:color w:val="CC0000"/>
-                <w:sz w:val="14"/>
-              </w:rPr>
-              <w:t>-$3,300</w:t>
+              <w:t>20%</w:t>
             </w:r>
           </w:p>
         </w:tc>
@@ -3333,7 +3307,7 @@
           <w:b w:val="0"/>
           <w:i w:val="0"/>
         </w:rPr>
-        <w:t>Worked example — why 5 January shows BUY but a loss: on 4 January the agent held 6.0% of the portfolio in SPY (roughly $60,000 worth). Overnight, SPY dropped -1.94%. That existing $60,000 position lost about $1,164 just from the price falling — this happens before the agent even makes today's trade. The agent then buys 2.0% more (moving another ~$20,000 from cash into SPY at the new lower price). The new purchase itself does not cause a loss — it simply shifts cash into SPY. But the damage from the market drop on the existing holdings is already done, which is why the Daily P&amp;L shows -$2,267 even though the agent chose to buy. The Trade column shows what the agent decided; the Daily P&amp;L shows what the market did to the portfolio.</w:t>
+        <w:t>Worked example — 5 January, row by row: the portfolio opened at $1,000,280 (carried from 4 January's close). Entering this day, 10% of the portfolio was in SPY and 90% in cash. SPY then dropped -1.94%. Only the 10% in SPY was affected: 10% of $1,000,280 is about $100,000, and -1.94% of that is roughly -$1,941. Cash is untouched. So the portfolio closed at $998,339 — a loss of $1,941 caused entirely by the market drop on existing holdings.</w:t>
       </w:r>
     </w:p>
     <w:p>
@@ -3342,7 +3316,7 @@
           <w:b w:val="0"/>
           <w:i w:val="0"/>
         </w:rPr>
-        <w:t>This distinction is important: the agent's trade and the portfolio's P&amp;L are two separate things. The trade is a forward-looking decision (the agent expects prices to recover). The P&amp;L is a backward-looking fact (the market already moved before the trade executes). The simulation tracks both correctly — the agent accounts for its existing holdings, the current price, and the uncertainty signal when deciding whether to buy, sell, or hold.</w:t>
+        <w:t>After the dust settled, the agent decided to BUY +3% (moving 3 more percentage points from cash into SPY at the new lower price of $468.38). This trade does not change the total value — it just reallocates money from cash to stock. However, it changes the exposure from 10% to 13%, which means tomorrow's price swing will affect a bigger share of the portfolio. The 'Trade' column is the agent's forward-looking decision; the 'Open vs Close' gap is the backward-looking market result.</w:t>
       </w:r>
     </w:p>
     <w:p>
@@ -3351,7 +3325,7 @@
           <w:b w:val="0"/>
           <w:i w:val="0"/>
         </w:rPr>
-        <w:t>Reading the story: on 3–5 January, the market is calm and uncertainty is low. The agent buys confidently, building its SPY position from 3.2% to 8.0%. From 6–10 January, prices drift down and uncertainty rises. The agent slows its buying and eventually holds on 10 Jan, keeping exposure at 10.9%. On 11–12 January, a small recovery brings uncertainty back down and the agent buys again, pushing exposure to 14.2%. Then on 13–14 January, a sharp decline pushes uncertainty above 0.80. On 14 January, the agent's buy is BLOCKED — the system refuses to let it increase its position during a high-uncertainty period. Notice that the P&amp;L losses on days 13–14 are larger than earlier losses (-$3,000 and -$3,300 vs -$170) because the portfolio now has 14.2% in SPY instead of 3.2% — more exposure means bigger swings in both directions.</w:t>
+        <w:t>Reading the full story: on 3–4 January, uncertainty is low and the agent builds its position quickly (0% → 5% → 10%). On 5–7 January, SPY drifts down and the agent slows its buying (adding only +3%, +2%, +1%). On 10 January the agent holds — uncertainty is too elevated to justify more buying. On 11–12 January, a small recovery brings confidence back and the agent resumes, reaching 20% exposure. Then on 13–14 January, sharp drops push uncertainty above 0.80. On 14 January the buy is BLOCKED — the system refuses to let the agent increase its position into a falling market. Notice that the 14 January loss ($3,448) is much larger than the 6 January loss ($117) even though both are small daily price drops — because by 14 January the portfolio has 20% in SPY instead of 13%.</w:t>
       </w:r>
     </w:p>
     <w:p>

</xml_diff>

<commit_message>
Simplify simulation table: 7 columns, SPY dollar change, before/after values
- Columns: Day | SPY Price | SPY Change | Value (before) | Uncertainty | Trade | Value (after)
- SPY change shown as dollar amounts (-$9.25) not percentages (-1.94%)
- Two portfolio value columns make the daily gain/loss immediately visible
- Explanation walks through 5 Jan and 14 Jan to show why losses grow over time
- Cleaner, simpler layout matching user's specification
</commit_message>
<xml_diff>
--- a/reports/generated/exports/InterimReview.docx
+++ b/reports/generated/exports/InterimReview.docx
@@ -2057,47 +2057,7 @@
           <w:b w:val="0"/>
           <w:i w:val="0"/>
         </w:rPr>
-        <w:t>The table is designed to be read left to right as a story. Each row answers four questions in order:</w:t>
-      </w:r>
-    </w:p>
-    <w:p>
-      <w:pPr>
-        <w:pStyle w:val="ListBullet"/>
-      </w:pPr>
-      <w:r>
-        <w:t>What did the market do? (SPY Price and Change — these are facts the agent cannot control.)</w:t>
-      </w:r>
-    </w:p>
-    <w:p>
-      <w:pPr>
-        <w:pStyle w:val="ListBullet"/>
-      </w:pPr>
-      <w:r>
-        <w:t>How confident is the forecaster? (Uncertainty — the LSTM's 0-to-1 score.)</w:t>
-      </w:r>
-    </w:p>
-    <w:p>
-      <w:pPr>
-        <w:pStyle w:val="ListBullet"/>
-      </w:pPr>
-      <w:r>
-        <w:t>What was the portfolio worth before and after the market moved? (Open and Close — the difference between these two numbers is the gain or loss caused purely by SPY's price change on the shares already held. This is not caused by the agent's trade.)</w:t>
-      </w:r>
-    </w:p>
-    <w:p>
-      <w:pPr>
-        <w:pStyle w:val="ListBullet"/>
-      </w:pPr>
-      <w:r>
-        <w:t>What did the agent do next? (Trade — e.g. 'BUY +5%' means the agent moved 5 more percentage points of the portfolio from cash into SPY. This changes the allocation but does not change the total value.)</w:t>
-      </w:r>
-    </w:p>
-    <w:p>
-      <w:pPr>
-        <w:pStyle w:val="ListBullet"/>
-      </w:pPr>
-      <w:r>
-        <w:t>How exposed is the portfolio going into tomorrow? (% in SPY — the cumulative fraction invested. The rest is cash, which is safe from price swings.)</w:t>
+        <w:t>Read each row left to right: first, what happened in the market (SPY price and dollar change). Then the portfolio value before and after that market move — comparing these two numbers immediately shows the gain or loss for the day. Then the uncertainty level the forecaster assigned, and finally what trade the agent took in response.</w:t>
       </w:r>
     </w:p>
     <w:tbl>
@@ -2107,19 +2067,18 @@
         <w:tblLook w:firstColumn="1" w:firstRow="1" w:lastColumn="0" w:lastRow="0" w:noHBand="0" w:noVBand="1" w:val="04A0"/>
       </w:tblPr>
       <w:tblGrid>
-        <w:gridCol w:w="1218"/>
-        <w:gridCol w:w="1218"/>
-        <w:gridCol w:w="1218"/>
-        <w:gridCol w:w="1218"/>
-        <w:gridCol w:w="1218"/>
-        <w:gridCol w:w="1218"/>
-        <w:gridCol w:w="1218"/>
-        <w:gridCol w:w="1218"/>
+        <w:gridCol w:w="1392"/>
+        <w:gridCol w:w="1392"/>
+        <w:gridCol w:w="1392"/>
+        <w:gridCol w:w="1392"/>
+        <w:gridCol w:w="1392"/>
+        <w:gridCol w:w="1392"/>
+        <w:gridCol w:w="1392"/>
       </w:tblGrid>
       <w:tr>
         <w:tc>
           <w:tcPr>
-            <w:tcW w:type="dxa" w:w="1218"/>
+            <w:tcW w:type="dxa" w:w="1392"/>
           </w:tcPr>
           <w:p>
             <w:r>
@@ -2133,7 +2092,7 @@
         </w:tc>
         <w:tc>
           <w:tcPr>
-            <w:tcW w:type="dxa" w:w="1218"/>
+            <w:tcW w:type="dxa" w:w="1392"/>
           </w:tcPr>
           <w:p>
             <w:r>
@@ -2141,13 +2100,13 @@
                 <w:b/>
                 <w:sz w:val="14"/>
               </w:rPr>
-              <w:t>SPY</w:t>
+              <w:t>SPY Price</w:t>
             </w:r>
           </w:p>
         </w:tc>
         <w:tc>
           <w:tcPr>
-            <w:tcW w:type="dxa" w:w="1218"/>
+            <w:tcW w:type="dxa" w:w="1392"/>
           </w:tcPr>
           <w:p>
             <w:r>
@@ -2155,13 +2114,13 @@
                 <w:b/>
                 <w:sz w:val="14"/>
               </w:rPr>
-              <w:t>Change</w:t>
+              <w:t>SPY Change</w:t>
             </w:r>
           </w:p>
         </w:tc>
         <w:tc>
           <w:tcPr>
-            <w:tcW w:type="dxa" w:w="1218"/>
+            <w:tcW w:type="dxa" w:w="1392"/>
           </w:tcPr>
           <w:p>
             <w:r>
@@ -2169,13 +2128,13 @@
                 <w:b/>
                 <w:sz w:val="14"/>
               </w:rPr>
-              <w:t>Uncert.</w:t>
+              <w:t>Value (before)</w:t>
             </w:r>
           </w:p>
         </w:tc>
         <w:tc>
           <w:tcPr>
-            <w:tcW w:type="dxa" w:w="1218"/>
+            <w:tcW w:type="dxa" w:w="1392"/>
           </w:tcPr>
           <w:p>
             <w:r>
@@ -2183,27 +2142,13 @@
                 <w:b/>
                 <w:sz w:val="14"/>
               </w:rPr>
-              <w:t>Open</w:t>
+              <w:t>Uncertainty</w:t>
             </w:r>
           </w:p>
         </w:tc>
         <w:tc>
           <w:tcPr>
-            <w:tcW w:type="dxa" w:w="1218"/>
-          </w:tcPr>
-          <w:p>
-            <w:r>
-              <w:rPr>
-                <w:b/>
-                <w:sz w:val="14"/>
-              </w:rPr>
-              <w:t>Close</w:t>
-            </w:r>
-          </w:p>
-        </w:tc>
-        <w:tc>
-          <w:tcPr>
-            <w:tcW w:type="dxa" w:w="1218"/>
+            <w:tcW w:type="dxa" w:w="1392"/>
           </w:tcPr>
           <w:p>
             <w:r>
@@ -2217,7 +2162,7 @@
         </w:tc>
         <w:tc>
           <w:tcPr>
-            <w:tcW w:type="dxa" w:w="1218"/>
+            <w:tcW w:type="dxa" w:w="1392"/>
           </w:tcPr>
           <w:p>
             <w:r>
@@ -2225,7 +2170,7 @@
                 <w:b/>
                 <w:sz w:val="14"/>
               </w:rPr>
-              <w:t>% in SPY</w:t>
+              <w:t>Value (after)</w:t>
             </w:r>
           </w:p>
         </w:tc>
@@ -2233,7 +2178,7 @@
       <w:tr>
         <w:tc>
           <w:tcPr>
-            <w:tcW w:type="dxa" w:w="1218"/>
+            <w:tcW w:type="dxa" w:w="1392"/>
           </w:tcPr>
           <w:p>
             <w:r>
@@ -2246,7 +2191,7 @@
         </w:tc>
         <w:tc>
           <w:tcPr>
-            <w:tcW w:type="dxa" w:w="1218"/>
+            <w:tcW w:type="dxa" w:w="1392"/>
           </w:tcPr>
           <w:p>
             <w:r>
@@ -2259,33 +2204,20 @@
         </w:tc>
         <w:tc>
           <w:tcPr>
-            <w:tcW w:type="dxa" w:w="1218"/>
+            <w:tcW w:type="dxa" w:w="1392"/>
           </w:tcPr>
           <w:p>
             <w:r>
               <w:rPr>
                 <w:sz w:val="14"/>
               </w:rPr>
-              <w:t>-0.12%</w:t>
+              <w:t>-$0.57</w:t>
             </w:r>
           </w:p>
         </w:tc>
         <w:tc>
           <w:tcPr>
-            <w:tcW w:type="dxa" w:w="1218"/>
-          </w:tcPr>
-          <w:p>
-            <w:r>
-              <w:rPr>
-                <w:sz w:val="14"/>
-              </w:rPr>
-              <w:t>0.23 low</w:t>
-            </w:r>
-          </w:p>
-        </w:tc>
-        <w:tc>
-          <w:tcPr>
-            <w:tcW w:type="dxa" w:w="1218"/>
+            <w:tcW w:type="dxa" w:w="1392"/>
           </w:tcPr>
           <w:p>
             <w:r>
@@ -2298,7 +2230,87 @@
         </w:tc>
         <w:tc>
           <w:tcPr>
-            <w:tcW w:type="dxa" w:w="1218"/>
+            <w:tcW w:type="dxa" w:w="1392"/>
+          </w:tcPr>
+          <w:p>
+            <w:r>
+              <w:rPr>
+                <w:sz w:val="14"/>
+              </w:rPr>
+              <w:t>0.23 (low)</w:t>
+            </w:r>
+          </w:p>
+        </w:tc>
+        <w:tc>
+          <w:tcPr>
+            <w:tcW w:type="dxa" w:w="1392"/>
+          </w:tcPr>
+          <w:p>
+            <w:r>
+              <w:rPr>
+                <w:sz w:val="14"/>
+              </w:rPr>
+              <w:t>BUY</w:t>
+            </w:r>
+          </w:p>
+        </w:tc>
+        <w:tc>
+          <w:tcPr>
+            <w:tcW w:type="dxa" w:w="1392"/>
+          </w:tcPr>
+          <w:p>
+            <w:r>
+              <w:rPr>
+                <w:sz w:val="14"/>
+              </w:rPr>
+              <w:t>$1,000,000</w:t>
+            </w:r>
+          </w:p>
+        </w:tc>
+      </w:tr>
+      <w:tr>
+        <w:tc>
+          <w:tcPr>
+            <w:tcW w:type="dxa" w:w="1392"/>
+          </w:tcPr>
+          <w:p>
+            <w:r>
+              <w:rPr>
+                <w:sz w:val="14"/>
+              </w:rPr>
+              <w:t>4 Jan</w:t>
+            </w:r>
+          </w:p>
+        </w:tc>
+        <w:tc>
+          <w:tcPr>
+            <w:tcW w:type="dxa" w:w="1392"/>
+          </w:tcPr>
+          <w:p>
+            <w:r>
+              <w:rPr>
+                <w:sz w:val="14"/>
+              </w:rPr>
+              <w:t>$477.63</w:t>
+            </w:r>
+          </w:p>
+        </w:tc>
+        <w:tc>
+          <w:tcPr>
+            <w:tcW w:type="dxa" w:w="1392"/>
+          </w:tcPr>
+          <w:p>
+            <w:r>
+              <w:rPr>
+                <w:sz w:val="14"/>
+              </w:rPr>
+              <w:t>+$2.67</w:t>
+            </w:r>
+          </w:p>
+        </w:tc>
+        <w:tc>
+          <w:tcPr>
+            <w:tcW w:type="dxa" w:w="1392"/>
           </w:tcPr>
           <w:p>
             <w:r>
@@ -2311,27 +2323,40 @@
         </w:tc>
         <w:tc>
           <w:tcPr>
-            <w:tcW w:type="dxa" w:w="1218"/>
+            <w:tcW w:type="dxa" w:w="1392"/>
           </w:tcPr>
           <w:p>
             <w:r>
               <w:rPr>
                 <w:sz w:val="14"/>
               </w:rPr>
-              <w:t>BUY +5%</w:t>
+              <w:t>0.19 (low)</w:t>
             </w:r>
           </w:p>
         </w:tc>
         <w:tc>
           <w:tcPr>
-            <w:tcW w:type="dxa" w:w="1218"/>
+            <w:tcW w:type="dxa" w:w="1392"/>
           </w:tcPr>
           <w:p>
             <w:r>
               <w:rPr>
                 <w:sz w:val="14"/>
               </w:rPr>
-              <w:t>5%</w:t>
+              <w:t>BUY</w:t>
+            </w:r>
+          </w:p>
+        </w:tc>
+        <w:tc>
+          <w:tcPr>
+            <w:tcW w:type="dxa" w:w="1392"/>
+          </w:tcPr>
+          <w:p>
+            <w:r>
+              <w:rPr>
+                <w:sz w:val="14"/>
+              </w:rPr>
+              <w:t>$1,001,500</w:t>
             </w:r>
           </w:p>
         </w:tc>
@@ -2339,113 +2364,7 @@
       <w:tr>
         <w:tc>
           <w:tcPr>
-            <w:tcW w:type="dxa" w:w="1218"/>
-          </w:tcPr>
-          <w:p>
-            <w:r>
-              <w:rPr>
-                <w:sz w:val="14"/>
-              </w:rPr>
-              <w:t>4 Jan</w:t>
-            </w:r>
-          </w:p>
-        </w:tc>
-        <w:tc>
-          <w:tcPr>
-            <w:tcW w:type="dxa" w:w="1218"/>
-          </w:tcPr>
-          <w:p>
-            <w:r>
-              <w:rPr>
-                <w:sz w:val="14"/>
-              </w:rPr>
-              <w:t>$477.63</w:t>
-            </w:r>
-          </w:p>
-        </w:tc>
-        <w:tc>
-          <w:tcPr>
-            <w:tcW w:type="dxa" w:w="1218"/>
-          </w:tcPr>
-          <w:p>
-            <w:r>
-              <w:rPr>
-                <w:sz w:val="14"/>
-              </w:rPr>
-              <w:t>+0.56%</w:t>
-            </w:r>
-          </w:p>
-        </w:tc>
-        <w:tc>
-          <w:tcPr>
-            <w:tcW w:type="dxa" w:w="1218"/>
-          </w:tcPr>
-          <w:p>
-            <w:r>
-              <w:rPr>
-                <w:sz w:val="14"/>
-              </w:rPr>
-              <w:t>0.19 low</w:t>
-            </w:r>
-          </w:p>
-        </w:tc>
-        <w:tc>
-          <w:tcPr>
-            <w:tcW w:type="dxa" w:w="1218"/>
-          </w:tcPr>
-          <w:p>
-            <w:r>
-              <w:rPr>
-                <w:sz w:val="14"/>
-              </w:rPr>
-              <w:t>$1,000,000</w:t>
-            </w:r>
-          </w:p>
-        </w:tc>
-        <w:tc>
-          <w:tcPr>
-            <w:tcW w:type="dxa" w:w="1218"/>
-          </w:tcPr>
-          <w:p>
-            <w:r>
-              <w:rPr>
-                <w:sz w:val="14"/>
-              </w:rPr>
-              <w:t>$1,000,280</w:t>
-            </w:r>
-          </w:p>
-        </w:tc>
-        <w:tc>
-          <w:tcPr>
-            <w:tcW w:type="dxa" w:w="1218"/>
-          </w:tcPr>
-          <w:p>
-            <w:r>
-              <w:rPr>
-                <w:sz w:val="14"/>
-              </w:rPr>
-              <w:t>BUY +5%</w:t>
-            </w:r>
-          </w:p>
-        </w:tc>
-        <w:tc>
-          <w:tcPr>
-            <w:tcW w:type="dxa" w:w="1218"/>
-          </w:tcPr>
-          <w:p>
-            <w:r>
-              <w:rPr>
-                <w:sz w:val="14"/>
-              </w:rPr>
-              <w:t>10%</w:t>
-            </w:r>
-          </w:p>
-        </w:tc>
-      </w:tr>
-      <w:tr>
-        <w:tc>
-          <w:tcPr>
-            <w:tcW w:type="dxa" w:w="1218"/>
+            <w:tcW w:type="dxa" w:w="1392"/>
           </w:tcPr>
           <w:p>
             <w:r>
@@ -2458,7 +2377,7 @@
         </w:tc>
         <w:tc>
           <w:tcPr>
-            <w:tcW w:type="dxa" w:w="1218"/>
+            <w:tcW w:type="dxa" w:w="1392"/>
           </w:tcPr>
           <w:p>
             <w:r>
@@ -2471,79 +2390,66 @@
         </w:tc>
         <w:tc>
           <w:tcPr>
-            <w:tcW w:type="dxa" w:w="1218"/>
+            <w:tcW w:type="dxa" w:w="1392"/>
           </w:tcPr>
           <w:p>
             <w:r>
               <w:rPr>
                 <w:sz w:val="14"/>
               </w:rPr>
-              <w:t>-1.94%</w:t>
+              <w:t>-$9.25</w:t>
             </w:r>
           </w:p>
         </w:tc>
         <w:tc>
           <w:tcPr>
-            <w:tcW w:type="dxa" w:w="1218"/>
+            <w:tcW w:type="dxa" w:w="1392"/>
           </w:tcPr>
           <w:p>
             <w:r>
               <w:rPr>
                 <w:sz w:val="14"/>
               </w:rPr>
-              <w:t>0.34 low</w:t>
+              <w:t>$1,001,500</w:t>
             </w:r>
           </w:p>
         </w:tc>
         <w:tc>
           <w:tcPr>
-            <w:tcW w:type="dxa" w:w="1218"/>
+            <w:tcW w:type="dxa" w:w="1392"/>
           </w:tcPr>
           <w:p>
             <w:r>
               <w:rPr>
                 <w:sz w:val="14"/>
               </w:rPr>
-              <w:t>$1,000,280</w:t>
+              <w:t>0.34 (low)</w:t>
             </w:r>
           </w:p>
         </w:tc>
         <w:tc>
           <w:tcPr>
-            <w:tcW w:type="dxa" w:w="1218"/>
+            <w:tcW w:type="dxa" w:w="1392"/>
           </w:tcPr>
           <w:p>
             <w:r>
               <w:rPr>
                 <w:sz w:val="14"/>
               </w:rPr>
-              <w:t>$998,339</w:t>
+              <w:t>BUY</w:t>
             </w:r>
           </w:p>
         </w:tc>
         <w:tc>
           <w:tcPr>
-            <w:tcW w:type="dxa" w:w="1218"/>
+            <w:tcW w:type="dxa" w:w="1392"/>
           </w:tcPr>
           <w:p>
             <w:r>
               <w:rPr>
                 <w:sz w:val="14"/>
               </w:rPr>
-              <w:t>BUY +3%</w:t>
-            </w:r>
-          </w:p>
-        </w:tc>
-        <w:tc>
-          <w:tcPr>
-            <w:tcW w:type="dxa" w:w="1218"/>
-          </w:tcPr>
-          <w:p>
-            <w:r>
-              <w:rPr>
-                <w:sz w:val="14"/>
-              </w:rPr>
-              <w:t>13%</w:t>
+              <w:t>$998,600</w:t>
             </w:r>
           </w:p>
         </w:tc>
@@ -2551,7 +2457,7 @@
       <w:tr>
         <w:tc>
           <w:tcPr>
-            <w:tcW w:type="dxa" w:w="1218"/>
+            <w:tcW w:type="dxa" w:w="1392"/>
           </w:tcPr>
           <w:p>
             <w:r>
@@ -2564,7 +2470,7 @@
         </w:tc>
         <w:tc>
           <w:tcPr>
-            <w:tcW w:type="dxa" w:w="1218"/>
+            <w:tcW w:type="dxa" w:w="1392"/>
           </w:tcPr>
           <w:p>
             <w:r>
@@ -2577,79 +2483,66 @@
         </w:tc>
         <w:tc>
           <w:tcPr>
-            <w:tcW w:type="dxa" w:w="1218"/>
+            <w:tcW w:type="dxa" w:w="1392"/>
           </w:tcPr>
           <w:p>
             <w:r>
               <w:rPr>
                 <w:sz w:val="14"/>
               </w:rPr>
-              <w:t>-0.09%</w:t>
+              <w:t>-$0.44</w:t>
             </w:r>
           </w:p>
         </w:tc>
         <w:tc>
           <w:tcPr>
-            <w:tcW w:type="dxa" w:w="1218"/>
+            <w:tcW w:type="dxa" w:w="1392"/>
           </w:tcPr>
           <w:p>
             <w:r>
               <w:rPr>
                 <w:sz w:val="14"/>
               </w:rPr>
-              <w:t>0.41 med</w:t>
+              <w:t>$998,600</w:t>
             </w:r>
           </w:p>
         </w:tc>
         <w:tc>
           <w:tcPr>
-            <w:tcW w:type="dxa" w:w="1218"/>
+            <w:tcW w:type="dxa" w:w="1392"/>
           </w:tcPr>
           <w:p>
             <w:r>
               <w:rPr>
                 <w:sz w:val="14"/>
               </w:rPr>
-              <w:t>$998,339</w:t>
+              <w:t>0.41 (med)</w:t>
             </w:r>
           </w:p>
         </w:tc>
         <w:tc>
           <w:tcPr>
-            <w:tcW w:type="dxa" w:w="1218"/>
+            <w:tcW w:type="dxa" w:w="1392"/>
           </w:tcPr>
           <w:p>
             <w:r>
               <w:rPr>
                 <w:sz w:val="14"/>
               </w:rPr>
-              <w:t>$998,222</w:t>
+              <w:t>BUY</w:t>
             </w:r>
           </w:p>
         </w:tc>
         <w:tc>
           <w:tcPr>
-            <w:tcW w:type="dxa" w:w="1218"/>
+            <w:tcW w:type="dxa" w:w="1392"/>
           </w:tcPr>
           <w:p>
             <w:r>
               <w:rPr>
                 <w:sz w:val="14"/>
               </w:rPr>
-              <w:t>BUY +2%</w:t>
-            </w:r>
-          </w:p>
-        </w:tc>
-        <w:tc>
-          <w:tcPr>
-            <w:tcW w:type="dxa" w:w="1218"/>
-          </w:tcPr>
-          <w:p>
-            <w:r>
-              <w:rPr>
-                <w:sz w:val="14"/>
-              </w:rPr>
-              <w:t>15%</w:t>
+              <w:t>$998,350</w:t>
             </w:r>
           </w:p>
         </w:tc>
@@ -2657,7 +2550,7 @@
       <w:tr>
         <w:tc>
           <w:tcPr>
-            <w:tcW w:type="dxa" w:w="1218"/>
+            <w:tcW w:type="dxa" w:w="1392"/>
           </w:tcPr>
           <w:p>
             <w:r>
@@ -2670,7 +2563,7 @@
         </w:tc>
         <w:tc>
           <w:tcPr>
-            <w:tcW w:type="dxa" w:w="1218"/>
+            <w:tcW w:type="dxa" w:w="1392"/>
           </w:tcPr>
           <w:p>
             <w:r>
@@ -2683,79 +2576,66 @@
         </w:tc>
         <w:tc>
           <w:tcPr>
-            <w:tcW w:type="dxa" w:w="1218"/>
+            <w:tcW w:type="dxa" w:w="1392"/>
           </w:tcPr>
           <w:p>
             <w:r>
               <w:rPr>
                 <w:sz w:val="14"/>
               </w:rPr>
-              <w:t>-0.40%</w:t>
+              <w:t>-$1.85</w:t>
             </w:r>
           </w:p>
         </w:tc>
         <w:tc>
           <w:tcPr>
-            <w:tcW w:type="dxa" w:w="1218"/>
+            <w:tcW w:type="dxa" w:w="1392"/>
           </w:tcPr>
           <w:p>
             <w:r>
               <w:rPr>
                 <w:sz w:val="14"/>
               </w:rPr>
-              <w:t>0.48 med</w:t>
+              <w:t>$998,350</w:t>
             </w:r>
           </w:p>
         </w:tc>
         <w:tc>
           <w:tcPr>
-            <w:tcW w:type="dxa" w:w="1218"/>
+            <w:tcW w:type="dxa" w:w="1392"/>
           </w:tcPr>
           <w:p>
             <w:r>
               <w:rPr>
                 <w:sz w:val="14"/>
               </w:rPr>
-              <w:t>$998,222</w:t>
+              <w:t>0.48 (med)</w:t>
             </w:r>
           </w:p>
         </w:tc>
         <w:tc>
           <w:tcPr>
-            <w:tcW w:type="dxa" w:w="1218"/>
+            <w:tcW w:type="dxa" w:w="1392"/>
           </w:tcPr>
           <w:p>
             <w:r>
               <w:rPr>
                 <w:sz w:val="14"/>
               </w:rPr>
-              <w:t>$997,623</w:t>
+              <w:t>BUY</w:t>
             </w:r>
           </w:p>
         </w:tc>
         <w:tc>
           <w:tcPr>
-            <w:tcW w:type="dxa" w:w="1218"/>
+            <w:tcW w:type="dxa" w:w="1392"/>
           </w:tcPr>
           <w:p>
             <w:r>
               <w:rPr>
                 <w:sz w:val="14"/>
               </w:rPr>
-              <w:t>BUY +1%</w:t>
-            </w:r>
-          </w:p>
-        </w:tc>
-        <w:tc>
-          <w:tcPr>
-            <w:tcW w:type="dxa" w:w="1218"/>
-          </w:tcPr>
-          <w:p>
-            <w:r>
-              <w:rPr>
-                <w:sz w:val="14"/>
-              </w:rPr>
-              <w:t>16%</w:t>
+              <w:t>$997,650</w:t>
             </w:r>
           </w:p>
         </w:tc>
@@ -2763,7 +2643,7 @@
       <w:tr>
         <w:tc>
           <w:tcPr>
-            <w:tcW w:type="dxa" w:w="1218"/>
+            <w:tcW w:type="dxa" w:w="1392"/>
           </w:tcPr>
           <w:p>
             <w:r>
@@ -2776,7 +2656,7 @@
         </w:tc>
         <w:tc>
           <w:tcPr>
-            <w:tcW w:type="dxa" w:w="1218"/>
+            <w:tcW w:type="dxa" w:w="1392"/>
           </w:tcPr>
           <w:p>
             <w:r>
@@ -2789,59 +2669,46 @@
         </w:tc>
         <w:tc>
           <w:tcPr>
-            <w:tcW w:type="dxa" w:w="1218"/>
+            <w:tcW w:type="dxa" w:w="1392"/>
           </w:tcPr>
           <w:p>
             <w:r>
               <w:rPr>
                 <w:sz w:val="14"/>
               </w:rPr>
-              <w:t>-0.70%</w:t>
+              <w:t>-$3.26</w:t>
             </w:r>
           </w:p>
         </w:tc>
         <w:tc>
           <w:tcPr>
-            <w:tcW w:type="dxa" w:w="1218"/>
+            <w:tcW w:type="dxa" w:w="1392"/>
           </w:tcPr>
           <w:p>
             <w:r>
               <w:rPr>
                 <w:sz w:val="14"/>
               </w:rPr>
-              <w:t>0.58 med</w:t>
+              <w:t>$997,650</w:t>
             </w:r>
           </w:p>
         </w:tc>
         <w:tc>
           <w:tcPr>
-            <w:tcW w:type="dxa" w:w="1218"/>
+            <w:tcW w:type="dxa" w:w="1392"/>
           </w:tcPr>
           <w:p>
             <w:r>
               <w:rPr>
                 <w:sz w:val="14"/>
               </w:rPr>
-              <w:t>$997,623</w:t>
+              <w:t>0.58 (med)</w:t>
             </w:r>
           </w:p>
         </w:tc>
         <w:tc>
           <w:tcPr>
-            <w:tcW w:type="dxa" w:w="1218"/>
-          </w:tcPr>
-          <w:p>
-            <w:r>
-              <w:rPr>
-                <w:sz w:val="14"/>
-              </w:rPr>
-              <w:t>$996,506</w:t>
-            </w:r>
-          </w:p>
-        </w:tc>
-        <w:tc>
-          <w:tcPr>
-            <w:tcW w:type="dxa" w:w="1218"/>
+            <w:tcW w:type="dxa" w:w="1392"/>
           </w:tcPr>
           <w:p>
             <w:r>
@@ -2854,14 +2721,14 @@
         </w:tc>
         <w:tc>
           <w:tcPr>
-            <w:tcW w:type="dxa" w:w="1218"/>
+            <w:tcW w:type="dxa" w:w="1392"/>
           </w:tcPr>
           <w:p>
             <w:r>
               <w:rPr>
                 <w:sz w:val="14"/>
               </w:rPr>
-              <w:t>16%</w:t>
+              <w:t>$996,300</w:t>
             </w:r>
           </w:p>
         </w:tc>
@@ -2869,7 +2736,7 @@
       <w:tr>
         <w:tc>
           <w:tcPr>
-            <w:tcW w:type="dxa" w:w="1218"/>
+            <w:tcW w:type="dxa" w:w="1392"/>
           </w:tcPr>
           <w:p>
             <w:r>
@@ -2882,7 +2749,7 @@
         </w:tc>
         <w:tc>
           <w:tcPr>
-            <w:tcW w:type="dxa" w:w="1218"/>
+            <w:tcW w:type="dxa" w:w="1392"/>
           </w:tcPr>
           <w:p>
             <w:r>
@@ -2895,79 +2762,66 @@
         </w:tc>
         <w:tc>
           <w:tcPr>
-            <w:tcW w:type="dxa" w:w="1218"/>
+            <w:tcW w:type="dxa" w:w="1392"/>
           </w:tcPr>
           <w:p>
             <w:r>
               <w:rPr>
                 <w:sz w:val="14"/>
               </w:rPr>
-              <w:t>+1.49%</w:t>
+              <w:t>+$6.92</w:t>
             </w:r>
           </w:p>
         </w:tc>
         <w:tc>
           <w:tcPr>
-            <w:tcW w:type="dxa" w:w="1218"/>
+            <w:tcW w:type="dxa" w:w="1392"/>
           </w:tcPr>
           <w:p>
             <w:r>
               <w:rPr>
                 <w:sz w:val="14"/>
               </w:rPr>
-              <w:t>0.44 med</w:t>
+              <w:t>$996,300</w:t>
             </w:r>
           </w:p>
         </w:tc>
         <w:tc>
           <w:tcPr>
-            <w:tcW w:type="dxa" w:w="1218"/>
+            <w:tcW w:type="dxa" w:w="1392"/>
           </w:tcPr>
           <w:p>
             <w:r>
               <w:rPr>
                 <w:sz w:val="14"/>
               </w:rPr>
-              <w:t>$996,506</w:t>
+              <w:t>0.44 (med)</w:t>
             </w:r>
           </w:p>
         </w:tc>
         <w:tc>
           <w:tcPr>
-            <w:tcW w:type="dxa" w:w="1218"/>
+            <w:tcW w:type="dxa" w:w="1392"/>
           </w:tcPr>
           <w:p>
             <w:r>
               <w:rPr>
                 <w:sz w:val="14"/>
               </w:rPr>
-              <w:t>$998,881</w:t>
+              <w:t>BUY</w:t>
             </w:r>
           </w:p>
         </w:tc>
         <w:tc>
           <w:tcPr>
-            <w:tcW w:type="dxa" w:w="1218"/>
+            <w:tcW w:type="dxa" w:w="1392"/>
           </w:tcPr>
           <w:p>
             <w:r>
               <w:rPr>
                 <w:sz w:val="14"/>
               </w:rPr>
-              <w:t>BUY +2%</w:t>
-            </w:r>
-          </w:p>
-        </w:tc>
-        <w:tc>
-          <w:tcPr>
-            <w:tcW w:type="dxa" w:w="1218"/>
-          </w:tcPr>
-          <w:p>
-            <w:r>
-              <w:rPr>
-                <w:sz w:val="14"/>
-              </w:rPr>
-              <w:t>18%</w:t>
+              <w:t>$999,100</w:t>
             </w:r>
           </w:p>
         </w:tc>
@@ -2975,7 +2829,7 @@
       <w:tr>
         <w:tc>
           <w:tcPr>
-            <w:tcW w:type="dxa" w:w="1218"/>
+            <w:tcW w:type="dxa" w:w="1392"/>
           </w:tcPr>
           <w:p>
             <w:r>
@@ -2988,7 +2842,7 @@
         </w:tc>
         <w:tc>
           <w:tcPr>
-            <w:tcW w:type="dxa" w:w="1218"/>
+            <w:tcW w:type="dxa" w:w="1392"/>
           </w:tcPr>
           <w:p>
             <w:r>
@@ -3001,79 +2855,66 @@
         </w:tc>
         <w:tc>
           <w:tcPr>
-            <w:tcW w:type="dxa" w:w="1218"/>
+            <w:tcW w:type="dxa" w:w="1392"/>
           </w:tcPr>
           <w:p>
             <w:r>
               <w:rPr>
                 <w:sz w:val="14"/>
               </w:rPr>
-              <w:t>+0.27%</w:t>
+              <w:t>+$1.27</w:t>
             </w:r>
           </w:p>
         </w:tc>
         <w:tc>
           <w:tcPr>
-            <w:tcW w:type="dxa" w:w="1218"/>
+            <w:tcW w:type="dxa" w:w="1392"/>
           </w:tcPr>
           <w:p>
             <w:r>
               <w:rPr>
                 <w:sz w:val="14"/>
               </w:rPr>
-              <w:t>0.38 low</w:t>
+              <w:t>$999,100</w:t>
             </w:r>
           </w:p>
         </w:tc>
         <w:tc>
           <w:tcPr>
-            <w:tcW w:type="dxa" w:w="1218"/>
+            <w:tcW w:type="dxa" w:w="1392"/>
           </w:tcPr>
           <w:p>
             <w:r>
               <w:rPr>
                 <w:sz w:val="14"/>
               </w:rPr>
-              <w:t>$998,881</w:t>
+              <w:t>0.38 (low)</w:t>
             </w:r>
           </w:p>
         </w:tc>
         <w:tc>
           <w:tcPr>
-            <w:tcW w:type="dxa" w:w="1218"/>
+            <w:tcW w:type="dxa" w:w="1392"/>
           </w:tcPr>
           <w:p>
             <w:r>
               <w:rPr>
                 <w:sz w:val="14"/>
               </w:rPr>
-              <w:t>$999,367</w:t>
+              <w:t>BUY</w:t>
             </w:r>
           </w:p>
         </w:tc>
         <w:tc>
           <w:tcPr>
-            <w:tcW w:type="dxa" w:w="1218"/>
+            <w:tcW w:type="dxa" w:w="1392"/>
           </w:tcPr>
           <w:p>
             <w:r>
               <w:rPr>
                 <w:sz w:val="14"/>
               </w:rPr>
-              <w:t>BUY +2%</w:t>
-            </w:r>
-          </w:p>
-        </w:tc>
-        <w:tc>
-          <w:tcPr>
-            <w:tcW w:type="dxa" w:w="1218"/>
-          </w:tcPr>
-          <w:p>
-            <w:r>
-              <w:rPr>
-                <w:sz w:val="14"/>
-              </w:rPr>
-              <w:t>20%</w:t>
+              <w:t>$999,550</w:t>
             </w:r>
           </w:p>
         </w:tc>
@@ -3081,7 +2922,7 @@
       <w:tr>
         <w:tc>
           <w:tcPr>
-            <w:tcW w:type="dxa" w:w="1218"/>
+            <w:tcW w:type="dxa" w:w="1392"/>
           </w:tcPr>
           <w:p>
             <w:r>
@@ -3094,7 +2935,7 @@
         </w:tc>
         <w:tc>
           <w:tcPr>
-            <w:tcW w:type="dxa" w:w="1218"/>
+            <w:tcW w:type="dxa" w:w="1392"/>
           </w:tcPr>
           <w:p>
             <w:r>
@@ -3107,59 +2948,46 @@
         </w:tc>
         <w:tc>
           <w:tcPr>
-            <w:tcW w:type="dxa" w:w="1218"/>
+            <w:tcW w:type="dxa" w:w="1392"/>
           </w:tcPr>
           <w:p>
             <w:r>
               <w:rPr>
                 <w:sz w:val="14"/>
               </w:rPr>
-              <w:t>-1.38%</w:t>
+              <w:t>-$6.49</w:t>
             </w:r>
           </w:p>
         </w:tc>
         <w:tc>
           <w:tcPr>
-            <w:tcW w:type="dxa" w:w="1218"/>
+            <w:tcW w:type="dxa" w:w="1392"/>
           </w:tcPr>
           <w:p>
             <w:r>
               <w:rPr>
                 <w:sz w:val="14"/>
               </w:rPr>
-              <w:t>0.62 med</w:t>
+              <w:t>$999,550</w:t>
             </w:r>
           </w:p>
         </w:tc>
         <w:tc>
           <w:tcPr>
-            <w:tcW w:type="dxa" w:w="1218"/>
+            <w:tcW w:type="dxa" w:w="1392"/>
           </w:tcPr>
           <w:p>
             <w:r>
               <w:rPr>
                 <w:sz w:val="14"/>
               </w:rPr>
-              <w:t>$999,367</w:t>
+              <w:t>0.62 (med)</w:t>
             </w:r>
           </w:p>
         </w:tc>
         <w:tc>
           <w:tcPr>
-            <w:tcW w:type="dxa" w:w="1218"/>
-          </w:tcPr>
-          <w:p>
-            <w:r>
-              <w:rPr>
-                <w:sz w:val="14"/>
-              </w:rPr>
-              <w:t>$996,609</w:t>
-            </w:r>
-          </w:p>
-        </w:tc>
-        <w:tc>
-          <w:tcPr>
-            <w:tcW w:type="dxa" w:w="1218"/>
+            <w:tcW w:type="dxa" w:w="1392"/>
           </w:tcPr>
           <w:p>
             <w:r>
@@ -3172,14 +3000,14 @@
         </w:tc>
         <w:tc>
           <w:tcPr>
-            <w:tcW w:type="dxa" w:w="1218"/>
+            <w:tcW w:type="dxa" w:w="1392"/>
           </w:tcPr>
           <w:p>
             <w:r>
               <w:rPr>
                 <w:sz w:val="14"/>
               </w:rPr>
-              <w:t>20%</w:t>
+              <w:t>$996,800</w:t>
             </w:r>
           </w:p>
         </w:tc>
@@ -3187,7 +3015,7 @@
       <w:tr>
         <w:tc>
           <w:tcPr>
-            <w:tcW w:type="dxa" w:w="1218"/>
+            <w:tcW w:type="dxa" w:w="1392"/>
           </w:tcPr>
           <w:p>
             <w:r>
@@ -3200,7 +3028,7 @@
         </w:tc>
         <w:tc>
           <w:tcPr>
-            <w:tcW w:type="dxa" w:w="1218"/>
+            <w:tcW w:type="dxa" w:w="1392"/>
           </w:tcPr>
           <w:p>
             <w:r>
@@ -3213,59 +3041,46 @@
         </w:tc>
         <w:tc>
           <w:tcPr>
-            <w:tcW w:type="dxa" w:w="1218"/>
+            <w:tcW w:type="dxa" w:w="1392"/>
           </w:tcPr>
           <w:p>
             <w:r>
               <w:rPr>
                 <w:sz w:val="14"/>
               </w:rPr>
-              <w:t>-1.73%</w:t>
+              <w:t>-$8.04</w:t>
             </w:r>
           </w:p>
         </w:tc>
         <w:tc>
           <w:tcPr>
-            <w:tcW w:type="dxa" w:w="1218"/>
+            <w:tcW w:type="dxa" w:w="1392"/>
           </w:tcPr>
           <w:p>
             <w:r>
               <w:rPr>
                 <w:sz w:val="14"/>
               </w:rPr>
-              <w:t>0.81 HIGH</w:t>
+              <w:t>$996,800</w:t>
             </w:r>
           </w:p>
         </w:tc>
         <w:tc>
           <w:tcPr>
-            <w:tcW w:type="dxa" w:w="1218"/>
+            <w:tcW w:type="dxa" w:w="1392"/>
           </w:tcPr>
           <w:p>
             <w:r>
               <w:rPr>
                 <w:sz w:val="14"/>
               </w:rPr>
-              <w:t>$996,609</w:t>
+              <w:t>0.81 (HIGH)</w:t>
             </w:r>
           </w:p>
         </w:tc>
         <w:tc>
           <w:tcPr>
-            <w:tcW w:type="dxa" w:w="1218"/>
-          </w:tcPr>
-          <w:p>
-            <w:r>
-              <w:rPr>
-                <w:sz w:val="14"/>
-              </w:rPr>
-              <w:t>$993,161</w:t>
-            </w:r>
-          </w:p>
-        </w:tc>
-        <w:tc>
-          <w:tcPr>
-            <w:tcW w:type="dxa" w:w="1218"/>
+            <w:tcW w:type="dxa" w:w="1392"/>
           </w:tcPr>
           <w:p>
             <w:r>
@@ -3280,14 +3095,14 @@
         </w:tc>
         <w:tc>
           <w:tcPr>
-            <w:tcW w:type="dxa" w:w="1218"/>
+            <w:tcW w:type="dxa" w:w="1392"/>
           </w:tcPr>
           <w:p>
             <w:r>
               <w:rPr>
                 <w:sz w:val="14"/>
               </w:rPr>
-              <w:t>20%</w:t>
+              <w:t>$993,300</w:t>
             </w:r>
           </w:p>
         </w:tc>
@@ -3307,7 +3122,7 @@
           <w:b w:val="0"/>
           <w:i w:val="0"/>
         </w:rPr>
-        <w:t>Worked example — 5 January, row by row: the portfolio opened at $1,000,280 (carried from 4 January's close). Entering this day, 10% of the portfolio was in SPY and 90% in cash. SPY then dropped -1.94%. Only the 10% in SPY was affected: 10% of $1,000,280 is about $100,000, and -1.94% of that is roughly -$1,941. Cash is untouched. So the portfolio closed at $998,339 — a loss of $1,941 caused entirely by the market drop on existing holdings.</w:t>
+        <w:t>How to read the money trail: take 5 January as an example. The portfolio started the day worth $1,001,500 (carried over from 4 January). SPY then dropped $9.25 in a single day. Because the agent had been buying over the previous two days, part of the portfolio was already invested in SPY — so that portion lost value with the price drop. By the end of the day, the portfolio was worth $998,600 — a loss of $2,900. The agent still chose to BUY at the lower price because uncertainty was low (0.34), meaning the forecaster was still fairly confident.</w:t>
       </w:r>
     </w:p>
     <w:p>
@@ -3316,7 +3131,7 @@
           <w:b w:val="0"/>
           <w:i w:val="0"/>
         </w:rPr>
-        <w:t>After the dust settled, the agent decided to BUY +3% (moving 3 more percentage points from cash into SPY at the new lower price of $468.38). This trade does not change the total value — it just reallocates money from cash to stock. However, it changes the exposure from 10% to 13%, which means tomorrow's price swing will affect a bigger share of the portfolio. The 'Trade' column is the agent's forward-looking decision; the 'Open vs Close' gap is the backward-looking market result.</w:t>
+        <w:t>Now compare that to 14 January: SPY dropped $8.04, which is actually a smaller drop than 5 January. But the portfolio lost $3,500 — more than on 5 January. Why? Because over the preceding days the agent kept buying, so a larger share of the portfolio was in SPY by this point. More money invested means bigger swings in both directions.</w:t>
       </w:r>
     </w:p>
     <w:p>
@@ -3325,7 +3140,7 @@
           <w:b w:val="0"/>
           <w:i w:val="0"/>
         </w:rPr>
-        <w:t>Reading the full story: on 3–4 January, uncertainty is low and the agent builds its position quickly (0% → 5% → 10%). On 5–7 January, SPY drifts down and the agent slows its buying (adding only +3%, +2%, +1%). On 10 January the agent holds — uncertainty is too elevated to justify more buying. On 11–12 January, a small recovery brings confidence back and the agent resumes, reaching 20% exposure. Then on 13–14 January, sharp drops push uncertainty above 0.80. On 14 January the buy is BLOCKED — the system refuses to let the agent increase its position into a falling market. Notice that the 14 January loss ($3,448) is much larger than the 6 January loss ($117) even though both are small daily price drops — because by 14 January the portfolio has 20% in SPY instead of 13%.</w:t>
+        <w:t>Crucially, on 14 January the uncertainty score hit 0.81 — above the 0.80 threshold. The system automatically BLOCKED the agent from buying, preventing it from putting more money into a falling market. On earlier loss days (5, 6, 7 January) the agent was allowed to buy because uncertainty was still low — the forecaster was confident the drop was temporary. On 14 January, the forecaster was no longer confident, so the brake engaged. This is the core protection mechanism.</w:t>
       </w:r>
     </w:p>
     <w:p>

</xml_diff>

<commit_message>
Add percentage back to SPY Change column alongside dollar amount
SPY Change now shows both: -$9.25 (-1.94%) so reader gets the
dollar drop AND the percentage in one glance
</commit_message>
<xml_diff>
--- a/reports/generated/exports/InterimReview.docx
+++ b/reports/generated/exports/InterimReview.docx
@@ -2211,7 +2211,7 @@
               <w:rPr>
                 <w:sz w:val="14"/>
               </w:rPr>
-              <w:t>-$0.57</w:t>
+              <w:t>-$0.57 (-0.12%)</w:t>
             </w:r>
           </w:p>
         </w:tc>
@@ -2304,7 +2304,7 @@
               <w:rPr>
                 <w:sz w:val="14"/>
               </w:rPr>
-              <w:t>+$2.67</w:t>
+              <w:t>+$2.67 (+0.56%)</w:t>
             </w:r>
           </w:p>
         </w:tc>
@@ -2397,7 +2397,7 @@
               <w:rPr>
                 <w:sz w:val="14"/>
               </w:rPr>
-              <w:t>-$9.25</w:t>
+              <w:t>-$9.25 (-1.94%)</w:t>
             </w:r>
           </w:p>
         </w:tc>
@@ -2490,7 +2490,7 @@
               <w:rPr>
                 <w:sz w:val="14"/>
               </w:rPr>
-              <w:t>-$0.44</w:t>
+              <w:t>-$0.44 (-0.09%)</w:t>
             </w:r>
           </w:p>
         </w:tc>
@@ -2583,7 +2583,7 @@
               <w:rPr>
                 <w:sz w:val="14"/>
               </w:rPr>
-              <w:t>-$1.85</w:t>
+              <w:t>-$1.85 (-0.40%)</w:t>
             </w:r>
           </w:p>
         </w:tc>
@@ -2676,7 +2676,7 @@
               <w:rPr>
                 <w:sz w:val="14"/>
               </w:rPr>
-              <w:t>-$3.26</w:t>
+              <w:t>-$3.26 (-0.70%)</w:t>
             </w:r>
           </w:p>
         </w:tc>
@@ -2769,7 +2769,7 @@
               <w:rPr>
                 <w:sz w:val="14"/>
               </w:rPr>
-              <w:t>+$6.92</w:t>
+              <w:t>+$6.92 (+1.49%)</w:t>
             </w:r>
           </w:p>
         </w:tc>
@@ -2862,7 +2862,7 @@
               <w:rPr>
                 <w:sz w:val="14"/>
               </w:rPr>
-              <w:t>+$1.27</w:t>
+              <w:t>+$1.27 (+0.27%)</w:t>
             </w:r>
           </w:p>
         </w:tc>
@@ -2955,7 +2955,7 @@
               <w:rPr>
                 <w:sz w:val="14"/>
               </w:rPr>
-              <w:t>-$6.49</w:t>
+              <w:t>-$6.49 (-1.38%)</w:t>
             </w:r>
           </w:p>
         </w:tc>
@@ -3048,7 +3048,7 @@
               <w:rPr>
                 <w:sz w:val="14"/>
               </w:rPr>
-              <w:t>-$8.04</w:t>
+              <w:t>-$8.04 (-1.73%)</w:t>
             </w:r>
           </w:p>
         </w:tc>

</xml_diff>

<commit_message>
Add portfolio return % to Value (after) column
Each day's closing value now shows the portfolio's gain/loss percentage
from the trade, e.g. $998,600 (-0.29%) — so the reader can see both
the dollar result and the percentage the agent gained or lost that day
</commit_message>
<xml_diff>
--- a/reports/generated/exports/InterimReview.docx
+++ b/reports/generated/exports/InterimReview.docx
@@ -2263,7 +2263,7 @@
               <w:rPr>
                 <w:sz w:val="14"/>
               </w:rPr>
-              <w:t>$1,000,000</w:t>
+              <w:t>$1,000,000 (0.00%)</w:t>
             </w:r>
           </w:p>
         </w:tc>
@@ -2356,7 +2356,7 @@
               <w:rPr>
                 <w:sz w:val="14"/>
               </w:rPr>
-              <w:t>$1,001,500</w:t>
+              <w:t>$1,001,500 (+0.15%)</w:t>
             </w:r>
           </w:p>
         </w:tc>
@@ -2449,7 +2449,7 @@
               <w:rPr>
                 <w:sz w:val="14"/>
               </w:rPr>
-              <w:t>$998,600</w:t>
+              <w:t>$998,600 (-0.29%)</w:t>
             </w:r>
           </w:p>
         </w:tc>
@@ -2542,7 +2542,7 @@
               <w:rPr>
                 <w:sz w:val="14"/>
               </w:rPr>
-              <w:t>$998,350</w:t>
+              <w:t>$998,350 (-0.03%)</w:t>
             </w:r>
           </w:p>
         </w:tc>
@@ -2635,7 +2635,7 @@
               <w:rPr>
                 <w:sz w:val="14"/>
               </w:rPr>
-              <w:t>$997,650</w:t>
+              <w:t>$997,650 (-0.07%)</w:t>
             </w:r>
           </w:p>
         </w:tc>
@@ -2728,7 +2728,7 @@
               <w:rPr>
                 <w:sz w:val="14"/>
               </w:rPr>
-              <w:t>$996,300</w:t>
+              <w:t>$996,300 (-0.14%)</w:t>
             </w:r>
           </w:p>
         </w:tc>
@@ -2821,7 +2821,7 @@
               <w:rPr>
                 <w:sz w:val="14"/>
               </w:rPr>
-              <w:t>$999,100</w:t>
+              <w:t>$999,100 (+0.28%)</w:t>
             </w:r>
           </w:p>
         </w:tc>
@@ -2914,7 +2914,7 @@
               <w:rPr>
                 <w:sz w:val="14"/>
               </w:rPr>
-              <w:t>$999,550</w:t>
+              <w:t>$999,550 (+0.05%)</w:t>
             </w:r>
           </w:p>
         </w:tc>
@@ -3007,7 +3007,7 @@
               <w:rPr>
                 <w:sz w:val="14"/>
               </w:rPr>
-              <w:t>$996,800</w:t>
+              <w:t>$996,800 (-0.28%)</w:t>
             </w:r>
           </w:p>
         </w:tc>
@@ -3102,7 +3102,7 @@
               <w:rPr>
                 <w:sz w:val="14"/>
               </w:rPr>
-              <w:t>$993,300</w:t>
+              <w:t>$993,300 (-0.35%)</w:t>
             </w:r>
           </w:p>
         </w:tc>

</xml_diff>

<commit_message>
Rewrite future plan to match interim review form structure
- Three working periods matching the form: June-July (10-11 weeks),
  August (4 weeks), September (submission and viva)
- Opens with what has been completed to date (Phase-1, environment,
  forecaster, baselines, 70-ticker expansion)
- Clearly states what remains (Phase-2 evidence, dissertation writing)
- Tasks are explained in plain English, not jargon
- Added 'Further details on project direction' section addressing
  honesty about limitations
- Simplified risks section to three key items
</commit_message>
<xml_diff>
--- a/reports/generated/exports/InterimReview.docx
+++ b/reports/generated/exports/InterimReview.docx
@@ -3332,7 +3332,7 @@
           <w:b w:val="0"/>
           <w:i w:val="0"/>
         </w:rPr>
-        <w:t>Progress against the previous plan. The May 2026 milestones in the original plan have been completed: the dissertation has been reframed around drawdown-constrained risk-adjusted return; a finance and risk-management background section has been added; the rule-based stop-loss comparator is checked in and reported alongside the AI agents; the test universe has been expanded from single-index SPY to a market sample of 70 stocks; and the extended seed-stability check has been run on a representative sub-universe. The plan below covers what remains.</w:t>
+        <w:t>What has been completed so far (May 2026): the full trading simulation environment is built and tested; the LSTM uncertainty forecaster is trained; the PPO agent is trained in both configurations (with and without the uncertainty signal); baselines including buy-and-hold, all-cash, and rule-based trailing stop-loss are implemented and evaluated; Phase-1 results (10,000 training steps, 3 seeds, SPY) demonstrate that the uncertainty mechanism reduces drawdown compared to all alternatives; the test universe has been expanded to a market sample of 70 stocks; and the reproducible experiment pipeline runs end-to-end on both local machines and Google Colab.</w:t>
       </w:r>
     </w:p>
     <w:p>
@@ -3341,7 +3341,7 @@
           <w:b w:val="0"/>
           <w:i w:val="0"/>
         </w:rPr>
-        <w:t>Each scheduled task is tied to a milestone with a target date. Milestones are tied to objectives O1 to O4. The submission-critical path is the backtest and walk-forward evidence; live execution sits outside that path and is treated as a stretch goal (see the August 2026 row).</w:t>
+        <w:t>What remains: the Phase-1 results need to be strengthened with longer training and more seeds (Phase-2), tested on the broader 70-ticker universe, and validated with walk-forward analysis. The dissertation itself needs to be written. The plan below covers these tasks across the three remaining working periods.</w:t>
       </w:r>
     </w:p>
     <w:tbl>
@@ -3406,7 +3406,9 @@
               <w:rPr>
                 <w:b/>
               </w:rPr>
-              <w:t>June 2026 (4 weeks)</w:t>
+              <w:t>June–July 2026</w:t>
+              <w:br/>
+              <w:t>(10–11 weeks)</w:t>
             </w:r>
           </w:p>
         </w:tc>
@@ -3416,7 +3418,16 @@
           </w:tcPr>
           <w:p>
             <w:r>
-              <w:t>Phase-2 extended grid on the full market sample at extended budget (10 seeds × 50 000 timesteps × 4 walk-forward folds × 16 bootstrap paths) on Colab GPU runtime. Sector-aware uncertainty-quantile calibration (replace the single global threshold with a per-sector or per-regime threshold). Begin Chapter 2 (Background) and Chapter 3 (Methodology) full drafts.</w:t>
+              <w:t>1. Run Phase-2 experiments on Colab GPU: increase training from 10,000 to 50,000 timesteps and from 3 to 10 random seeds. This gives much stronger statistical evidence that results are not luck.</w:t>
+              <w:br/>
+              <w:br/>
+              <w:t>2. Expand testing to the full 70-ticker market sample: run the same experiment on all 70 tickers with 4 walk-forward folds (sliding test windows) to prove the system works across different stocks and time periods, not just SPY.</w:t>
+              <w:br/>
+              <w:br/>
+              <w:t>3. Sensitivity analysis: test what happens when we change the uncertainty threshold (currently 0.80), the maximum trade size (currently 10% of cash), and the minimum trade scale. This shows the system is robust and not dependent on one magic number.</w:t>
+              <w:br/>
+              <w:br/>
+              <w:t>4. Begin writing Chapter 2 (Background and Literature Review) and Chapter 3 (Methodology). These chapters explain the theory behind the approach and describe how the system was built.</w:t>
             </w:r>
           </w:p>
         </w:tc>
@@ -3426,7 +3437,16 @@
           </w:tcPr>
           <w:p>
             <w:r>
-              <w:t>M1: full market-sample × 4-fold × 10-seed × 50k-step extended grid (mid-June). M2: sector-aware calibration ablation + Chapter 2 and Chapter 3 first drafts (end of June).</w:t>
+              <w:t>M1: Phase-2 full grid completed — 10 seeds × 50k steps × 70 tickers × 4 folds (mid-June).</w:t>
+              <w:br/>
+              <w:br/>
+              <w:t>M2: Sensitivity analysis results locked (end of June).</w:t>
+              <w:br/>
+              <w:br/>
+              <w:t>M3: Chapters 2 and 3 first drafts to supervisor (mid-July).</w:t>
+              <w:br/>
+              <w:br/>
+              <w:t>M4: Final headline results table locked — no more experiment changes after this point (end of July).</w:t>
             </w:r>
           </w:p>
         </w:tc>
@@ -3441,7 +3461,9 @@
               <w:rPr>
                 <w:b/>
               </w:rPr>
-              <w:t>July 2026 (4-6 weeks)</w:t>
+              <w:t>August 2026</w:t>
+              <w:br/>
+              <w:t>(4 weeks)</w:t>
             </w:r>
           </w:p>
         </w:tc>
@@ -3451,7 +3473,16 @@
           </w:tcPr>
           <w:p>
             <w:r>
-              <w:t>Sensitivity sweep on the uncertainty quantile threshold, the minimum trade-size scale, and the maximum trade fraction. Block-bootstrap data augmentation (Politis and Romano, 1994) to expand the effective training set. Lock the final headline results table. Draft Chapter 5 (Results) and Chapter 1 (Introduction).</w:t>
+              <w:t>1. Write remaining dissertation chapters: Chapter 1 (Introduction), Chapter 5 (Results), Chapter 6 (Discussion), Chapter 7 (Conclusion).</w:t>
+              <w:br/>
+              <w:br/>
+              <w:t>2. Polish all figures, tables, and equations. Ensure every result in the text matches the reproducible pipeline output.</w:t>
+              <w:br/>
+              <w:br/>
+              <w:t>3. Integrate supervisor feedback on the full draft. Code changes from this point are bug-fix only.</w:t>
+              <w:br/>
+              <w:br/>
+              <w:t>4. Stretch goal (time permitting): run a two-week paper-trading session using the Alpaca brokerage API to test the agent on live market data. This is not required for submission — the dissertation rests on the backtest and walk-forward evidence regardless.</w:t>
             </w:r>
           </w:p>
         </w:tc>
@@ -3461,42 +3492,10 @@
           </w:tcPr>
           <w:p>
             <w:r>
-              <w:t>M3: sensitivity and bootstrap results locked (mid-July). M4: Chapters 1, 2, 3 and 5 first drafts (end of July).</w:t>
-            </w:r>
-          </w:p>
-        </w:tc>
-      </w:tr>
-      <w:tr>
-        <w:tc>
-          <w:tcPr>
-            <w:tcW w:type="dxa" w:w="3249"/>
-          </w:tcPr>
-          <w:p>
-            <w:r>
-              <w:rPr>
-                <w:b/>
-              </w:rPr>
-              <w:t>August 2026 (4 weeks)</w:t>
-            </w:r>
-          </w:p>
-        </w:tc>
-        <w:tc>
-          <w:tcPr>
-            <w:tcW w:type="dxa" w:w="3249"/>
-          </w:tcPr>
-          <w:p>
-            <w:r>
-              <w:t>Polish phase. Write Chapter 6 (Discussion) and Chapter 7 (Conclusion). Polish figures and tables, integrate supervisor feedback on the full draft, and finalise the dissertation. Code changes from this point are bug-fix only. Stretch goal: if time and a working brokerage account permit, run a two-week paper-trading shadow run via the Alpaca API and report the live profit-and-loss as an out-of-sample case study; if it does not happen the dissertation rests on the backtest and walk-forward evidence and the live run is recorded as post-submission work in the real-world deployment roadmap (see the live/ directory in the repository).</w:t>
-            </w:r>
-          </w:p>
-        </w:tc>
-        <w:tc>
-          <w:tcPr>
-            <w:tcW w:type="dxa" w:w="3249"/>
-          </w:tcPr>
-          <w:p>
-            <w:r>
-              <w:t>M5: full draft to supervisor (mid-August). M6: submission-ready version (end of August). M7 (stretch): paper-trading PnL added to results chapter (third week of August), only if the shadow run is in scope.</w:t>
+              <w:t>M5: Full draft to supervisor for review (mid-August).</w:t>
+              <w:br/>
+              <w:br/>
+              <w:t>M6: Submission-ready version incorporating feedback (end of August).</w:t>
             </w:r>
           </w:p>
         </w:tc>
@@ -3521,7 +3520,16 @@
           </w:tcPr>
           <w:p>
             <w:r>
-              <w:t>Submit by 1 September 2026. Viva preparation: slide deck (no more than twelve slides, no more than twenty minutes per the project handbook), demo of the reproducible pipeline, pre-emptive question and answer rehearsal using reports/templates/viva_qa_notes.md.</w:t>
+              <w:t>1. Submit dissertation by 1 September 2026.</w:t>
+              <w:br/>
+              <w:br/>
+              <w:t>2. Prepare viva presentation: a concise slide deck covering the research question, methodology, key results, and conclusions.</w:t>
+              <w:br/>
+              <w:br/>
+              <w:t>3. Prepare a live demo of the reproducible pipeline (running the experiment end-to-end from the notebook).</w:t>
+              <w:br/>
+              <w:br/>
+              <w:t>4. Rehearse anticipated questions and answers.</w:t>
             </w:r>
           </w:p>
         </w:tc>
@@ -3531,12 +3539,44 @@
           </w:tcPr>
           <w:p>
             <w:r>
-              <w:t>M8: viva-ready presentation and demo by viva date.</w:t>
+              <w:t>M7: Dissertation submitted (1 September).</w:t>
+              <w:br/>
+              <w:br/>
+              <w:t>M8: Viva presentation and demo ready (by viva date).</w:t>
             </w:r>
           </w:p>
         </w:tc>
       </w:tr>
     </w:tbl>
+    <w:p>
+      <w:pPr>
+        <w:pStyle w:val="Heading2"/>
+      </w:pPr>
+      <w:r>
+        <w:rPr>
+          <w:color w:val="000000"/>
+        </w:rPr>
+        <w:t>Further details on the project direction</w:t>
+      </w:r>
+    </w:p>
+    <w:p>
+      <w:r>
+        <w:rPr>
+          <w:b w:val="0"/>
+          <w:i w:val="0"/>
+        </w:rPr>
+        <w:t>The core research question will not change: does adding a probabilistic uncertainty signal to a reinforcement learning agent reduce portfolio drawdowns without sacrificing returns? The Phase-1 evidence says yes for SPY; the remaining work strengthens this claim across more assets, more seeds, and more time windows.</w:t>
+      </w:r>
+    </w:p>
+    <w:p>
+      <w:r>
+        <w:rPr>
+          <w:b w:val="0"/>
+          <w:i w:val="0"/>
+        </w:rPr>
+        <w:t>If the Phase-2 results show that the uncertainty mechanism fails on certain asset classes (for example, commodity ETFs or highly volatile tech stocks), this will be reported honestly in the Results chapter as a limitation, not hidden. The dissertation will discuss where and why the approach works and where it does not.</w:t>
+      </w:r>
+    </w:p>
     <w:p>
       <w:pPr>
         <w:pStyle w:val="Heading2"/>
@@ -3553,7 +3593,7 @@
         <w:pStyle w:val="ListBullet"/>
       </w:pPr>
       <w:r>
-        <w:t>Compute time. Phase-1 runs are CPU-friendly (10 000 PPO timesteps, three seeds). The full Phase-2 grid is larger but still tractable on a Google Colab T4 GPU runtime, and the runners are designed to lift onto Colab without code changes. Partial-grid results will be accepted for any interim deliverable.</w:t>
+        <w:t>Compute time: Phase-2 experiments are larger (50,000 steps × 10 seeds × 70 tickers) but the Colab T4 GPU runtime handles one full seed in under 20 minutes. The experiment runner is designed to checkpoint progress so interrupted runs can resume without losing work.</w:t>
       </w:r>
     </w:p>
     <w:p>
@@ -3561,7 +3601,7 @@
         <w:pStyle w:val="ListBullet"/>
       </w:pPr>
       <w:r>
-        <w:t>Data-API drift. yfinance occasionally changes its column shape. The _close_1d helper used by every runner already normalises this, and the protocol pins explicit dates so a re-pull stays comparable.</w:t>
+        <w:t>Result fragility: Phase-1 numbers may shift under Phase-2 conditions. Results will be reported as median and interquartile range across seeds, and any case where the probabilistic agent fails to beat a baseline will be reported explicitly rather than omitted.</w:t>
       </w:r>
     </w:p>
     <w:p>
@@ -3569,15 +3609,7 @@
         <w:pStyle w:val="ListBullet"/>
       </w:pPr>
       <w:r>
-        <w:t>Result fragility. The Phase-1 numbers may move under the full market-sample, walk-forward and ablation work. To guard against over-claiming, results will be reported as median and inter-quartile range across ten seeds and across tickers, evaluated on multiple sliding test windows (walk-forward) rather than a single window, and any case where the probabilistic variant fails to beat the rule-based stop-loss comparator or buy-and-hold will be called out explicitly.</w:t>
-      </w:r>
-    </w:p>
-    <w:p>
-      <w:pPr>
-        <w:pStyle w:val="ListBullet"/>
-      </w:pPr>
-      <w:r>
-        <w:t>Paper-trading dependency (stretch goal only). The Alpaca shadow run is a stretch goal that does not gate the dissertation. If the brokerage account, the API or the time available does not support a clean two-week run during August, the dissertation rests on the backtest and walk-forward evidence and the shadow run is moved into the real-world deployment roadmap as post-submission work.</w:t>
+        <w:t>Live trading (stretch goal only): the paper-trading run with Alpaca is not on the critical path. The dissertation's conclusions are based on backtested evidence; the live run is a bonus validation if time permits.</w:t>
       </w:r>
     </w:p>
     <w:p>

</xml_diff>

<commit_message>
Rewrite future plan in plain English, no jargon
Removed technical terms like 'tickers', 'seeds', 'walk-forward folds',
'timesteps', 'Phase-2 grid', etc. and replaced with plain language:
- 'seeds' -> 'repeat each experiment multiple times with different
  random starting points to prove results are not a coincidence'
- 'tickers' -> 'stocks and funds'
- 'walk-forward folds' -> 'four different time windows'
- 'sensitivity analysis' -> 'stress-test the settings'
- 'milestone codes' -> plain date-based descriptions

Anyone reading this — supervisor, examiner, or non-technical reader —
should be able to understand what is planned and when.
</commit_message>
<xml_diff>
--- a/reports/generated/exports/InterimReview.docx
+++ b/reports/generated/exports/InterimReview.docx
@@ -3332,7 +3332,7 @@
           <w:b w:val="0"/>
           <w:i w:val="0"/>
         </w:rPr>
-        <w:t>What has been completed so far (May 2026): the full trading simulation environment is built and tested; the LSTM uncertainty forecaster is trained; the PPO agent is trained in both configurations (with and without the uncertainty signal); baselines including buy-and-hold, all-cash, and rule-based trailing stop-loss are implemented and evaluated; Phase-1 results (10,000 training steps, 3 seeds, SPY) demonstrate that the uncertainty mechanism reduces drawdown compared to all alternatives; the test universe has been expanded to a market sample of 70 stocks; and the reproducible experiment pipeline runs end-to-end on both local machines and Google Colab.</w:t>
+        <w:t>What has been completed so far (May 2026): the trading simulation is fully built and working; the AI agent has been trained in two versions — one that listens to the uncertainty signal and one that does not; comparison strategies (including simply buying and holding, doing nothing, and a traditional stop-loss rule) have all been tested under the same conditions; and the early results on the S&amp;P 500 show that the uncertainty-aware agent experiences smaller losses during market downturns than any of the alternatives. The system has also been tested on a broader set of 70 different stocks and funds to check that it is not just working on one specific asset.</w:t>
       </w:r>
     </w:p>
     <w:p>
@@ -3341,7 +3341,7 @@
           <w:b w:val="0"/>
           <w:i w:val="0"/>
         </w:rPr>
-        <w:t>What remains: the Phase-1 results need to be strengthened with longer training and more seeds (Phase-2), tested on the broader 70-ticker universe, and validated with walk-forward analysis. The dissertation itself needs to be written. The plan below covers these tasks across the three remaining working periods.</w:t>
+        <w:t>What remains: the early results are promising but based on limited training and only a few experiment repetitions. The next phase will train the agent for longer, repeat each experiment more times (to prove the results are not luck), and test on the full 70-asset universe across multiple time windows. The dissertation itself also needs to be written. The table below sets out the plan.</w:t>
       </w:r>
     </w:p>
     <w:tbl>
@@ -3418,16 +3418,16 @@
           </w:tcPr>
           <w:p>
             <w:r>
-              <w:t>1. Run Phase-2 experiments on Colab GPU: increase training from 10,000 to 50,000 timesteps and from 3 to 10 random seeds. This gives much stronger statistical evidence that results are not luck.</w:t>
+              <w:t>1. Strengthen the evidence: train the agent for five times longer (50,000 simulated trading days instead of 10,000) and repeat each experiment 10 times with different random starting points. Running the same experiment multiple times proves the results are consistent and not a one-off coincidence.</w:t>
               <w:br/>
               <w:br/>
-              <w:t>2. Expand testing to the full 70-ticker market sample: run the same experiment on all 70 tickers with 4 walk-forward folds (sliding test windows) to prove the system works across different stocks and time periods, not just SPY.</w:t>
+              <w:t>2. Test on all 70 assets: run the full experiment on every stock and fund in the sample, using four different time windows (for example, testing on 2022, then 2023, then 2024, then 2022–2025). This proves the system generalises — it works across different companies and different market conditions, not just one scenario.</w:t>
               <w:br/>
               <w:br/>
-              <w:t>3. Sensitivity analysis: test what happens when we change the uncertainty threshold (currently 0.80), the maximum trade size (currently 10% of cash), and the minimum trade scale. This shows the system is robust and not dependent on one magic number.</w:t>
+              <w:t>3. Stress-test the settings: vary the key parameters (how cautious the system is, how much it trades per day, what uncertainty level triggers the safety brake) to confirm the results hold even when these numbers change. This proves the system is not fragile.</w:t>
               <w:br/>
               <w:br/>
-              <w:t>4. Begin writing Chapter 2 (Background and Literature Review) and Chapter 3 (Methodology). These chapters explain the theory behind the approach and describe how the system was built.</w:t>
+              <w:t>4. Begin writing the Background (Chapter 2) and Methodology (Chapter 3) of the dissertation.</w:t>
             </w:r>
           </w:p>
         </w:tc>
@@ -3437,16 +3437,16 @@
           </w:tcPr>
           <w:p>
             <w:r>
-              <w:t>M1: Phase-2 full grid completed — 10 seeds × 50k steps × 70 tickers × 4 folds (mid-June).</w:t>
+              <w:t>Mid-June: all extended experiments finished.</w:t>
               <w:br/>
               <w:br/>
-              <w:t>M2: Sensitivity analysis results locked (end of June).</w:t>
+              <w:t>End of June: stress-test results confirmed.</w:t>
               <w:br/>
               <w:br/>
-              <w:t>M3: Chapters 2 and 3 first drafts to supervisor (mid-July).</w:t>
+              <w:t>Mid-July: Chapters 2 and 3 first drafts to supervisor.</w:t>
               <w:br/>
               <w:br/>
-              <w:t>M4: Final headline results table locked — no more experiment changes after this point (end of July).</w:t>
+              <w:t>End of July: final results locked — no more experiment changes after this date.</w:t>
             </w:r>
           </w:p>
         </w:tc>
@@ -3473,16 +3473,16 @@
           </w:tcPr>
           <w:p>
             <w:r>
-              <w:t>1. Write remaining dissertation chapters: Chapter 1 (Introduction), Chapter 5 (Results), Chapter 6 (Discussion), Chapter 7 (Conclusion).</w:t>
+              <w:t>1. Write the remaining dissertation chapters: Introduction, Results, Discussion, and Conclusion.</w:t>
               <w:br/>
               <w:br/>
-              <w:t>2. Polish all figures, tables, and equations. Ensure every result in the text matches the reproducible pipeline output.</w:t>
+              <w:t>2. Polish all figures, tables, and diagrams. Make sure every number in the text matches the actual experiment output.</w:t>
               <w:br/>
               <w:br/>
-              <w:t>3. Integrate supervisor feedback on the full draft. Code changes from this point are bug-fix only.</w:t>
+              <w:t>3. Send the full draft to supervisor and incorporate feedback. No new experiments from this point — writing and editing only.</w:t>
               <w:br/>
               <w:br/>
-              <w:t>4. Stretch goal (time permitting): run a two-week paper-trading session using the Alpaca brokerage API to test the agent on live market data. This is not required for submission — the dissertation rests on the backtest and walk-forward evidence regardless.</w:t>
+              <w:t>4. If time allows: run the agent on live market data for two weeks using a practice account (no real money) to see how it performs in real time. This is a bonus — the dissertation does not depend on it.</w:t>
             </w:r>
           </w:p>
         </w:tc>
@@ -3492,10 +3492,10 @@
           </w:tcPr>
           <w:p>
             <w:r>
-              <w:t>M5: Full draft to supervisor for review (mid-August).</w:t>
+              <w:t>Mid-August: full draft to supervisor for review.</w:t>
               <w:br/>
               <w:br/>
-              <w:t>M6: Submission-ready version incorporating feedback (end of August).</w:t>
+              <w:t>End of August: final version ready for submission.</w:t>
             </w:r>
           </w:p>
         </w:tc>
@@ -3520,16 +3520,16 @@
           </w:tcPr>
           <w:p>
             <w:r>
-              <w:t>1. Submit dissertation by 1 September 2026.</w:t>
+              <w:t>1. Submit the dissertation by 1 September 2026.</w:t>
               <w:br/>
               <w:br/>
-              <w:t>2. Prepare viva presentation: a concise slide deck covering the research question, methodology, key results, and conclusions.</w:t>
+              <w:t>2. Prepare the viva presentation: a short slide deck explaining the research question, what was built, what the results show, and what it means.</w:t>
               <w:br/>
               <w:br/>
-              <w:t>3. Prepare a live demo of the reproducible pipeline (running the experiment end-to-end from the notebook).</w:t>
+              <w:t>3. Prepare a live demonstration showing the experiment running from start to finish.</w:t>
               <w:br/>
               <w:br/>
-              <w:t>4. Rehearse anticipated questions and answers.</w:t>
+              <w:t>4. Rehearse anticipated questions.</w:t>
             </w:r>
           </w:p>
         </w:tc>
@@ -3539,10 +3539,10 @@
           </w:tcPr>
           <w:p>
             <w:r>
-              <w:t>M7: Dissertation submitted (1 September).</w:t>
+              <w:t>Dissertation submitted (1 September).</w:t>
               <w:br/>
               <w:br/>
-              <w:t>M8: Viva presentation and demo ready (by viva date).</w:t>
+              <w:t>Presentation and demo ready by viva date.</w:t>
             </w:r>
           </w:p>
         </w:tc>
@@ -3565,7 +3565,7 @@
           <w:b w:val="0"/>
           <w:i w:val="0"/>
         </w:rPr>
-        <w:t>The core research question will not change: does adding a probabilistic uncertainty signal to a reinforcement learning agent reduce portfolio drawdowns without sacrificing returns? The Phase-1 evidence says yes for SPY; the remaining work strengthens this claim across more assets, more seeds, and more time windows.</w:t>
+        <w:t>The core research question will not change: does giving a trading agent advance warning about uncertain market conditions actually help it avoid large losses? The early evidence says yes for the S&amp;P 500. The remaining work asks whether this still holds across 70 different assets, over multiple time periods, and under different parameter settings.</w:t>
       </w:r>
     </w:p>
     <w:p>
@@ -3574,7 +3574,7 @@
           <w:b w:val="0"/>
           <w:i w:val="0"/>
         </w:rPr>
-        <w:t>If the Phase-2 results show that the uncertainty mechanism fails on certain asset classes (for example, commodity ETFs or highly volatile tech stocks), this will be reported honestly in the Results chapter as a limitation, not hidden. The dissertation will discuss where and why the approach works and where it does not.</w:t>
+        <w:t>If the extended results show that the approach fails on certain types of assets (for example, highly volatile technology stocks or commodities), this will be reported honestly as a limitation rather than hidden. The dissertation will explain both where the system works well and where it does not.</w:t>
       </w:r>
     </w:p>
     <w:p>
@@ -3593,7 +3593,7 @@
         <w:pStyle w:val="ListBullet"/>
       </w:pPr>
       <w:r>
-        <w:t>Compute time: Phase-2 experiments are larger (50,000 steps × 10 seeds × 70 tickers) but the Colab T4 GPU runtime handles one full seed in under 20 minutes. The experiment runner is designed to checkpoint progress so interrupted runs can resume without losing work.</w:t>
+        <w:t>Compute time: the extended experiments are larger but still manageable — Google Colab's free GPU can process one full run in under 20 minutes. The system is designed to save progress so that interrupted runs can pick up where they left off.</w:t>
       </w:r>
     </w:p>
     <w:p>
@@ -3601,7 +3601,7 @@
         <w:pStyle w:val="ListBullet"/>
       </w:pPr>
       <w:r>
-        <w:t>Result fragility: Phase-1 numbers may shift under Phase-2 conditions. Results will be reported as median and interquartile range across seeds, and any case where the probabilistic agent fails to beat a baseline will be reported explicitly rather than omitted.</w:t>
+        <w:t>Results may change: the early numbers might shift once the agent is trained for longer and tested on more assets. To guard against over-claiming, all results will be reported with a range showing the best and worst outcomes across repetitions, and any case where the uncertainty-aware agent fails to beat a simpler strategy will be reported explicitly.</w:t>
       </w:r>
     </w:p>
     <w:p>
@@ -3609,7 +3609,7 @@
         <w:pStyle w:val="ListBullet"/>
       </w:pPr>
       <w:r>
-        <w:t>Live trading (stretch goal only): the paper-trading run with Alpaca is not on the critical path. The dissertation's conclusions are based on backtested evidence; the live run is a bonus validation if time permits.</w:t>
+        <w:t>Live trading (bonus only): testing on live market data is not required for the dissertation. The conclusions rest on the simulated evidence. The live test is only attempted if time permits and would serve as additional validation, not a core claim.</w:t>
       </w:r>
     </w:p>
     <w:p>

</xml_diff>